<commit_message>
Spesifikasi material instalasi rev 1.1: dukungan penuh RU IV, Gateway indoor dengan mast antena & kabel koaksial
Co-Authored-By: Claude Opus 5.5 <noreply@anthropic.com>
Claude-Session: https://claude.ai/code/session_01QPUbK2zC1BgtHo8HLyyaSC
</commit_message>
<xml_diff>
--- a/Deliverables/Spesifikasi_Material_Instalasi_GLD_RU-IV_Cilacap.docx
+++ b/Deliverables/Spesifikasi_Material_Instalasi_GLD_RU-IV_Cilacap.docx
@@ -74,7 +74,7 @@
           <w:color w:val="5B5B5B"/>
           <w:sz w:val="21"/>
         </w:rPr>
-        <w:t>Tiang besi, kabel catu daya 24 VDC, jaringan Gateway–server, fastener, grounding, dan daftar kebutuhan (BoQ) untuk pemasangan sistem Gas Leak Detection di area aman perimeter Sulfur Recovery Unit (SRU). Disusun agar tim PT Pertamina Patra Niaga dan vendor instalasi dapat mulai menyiapkan material.</w:t>
+        <w:t>Tiang besi, kabel catu daya 24 VDC, jaringan Gateway–server, fastener, grounding, dan daftar kebutuhan (BoQ) untuk pemasangan sistem Gas Leak Detection di area aman perimeter Sulfur Recovery Unit (SRU). RU IV menyatakan bersedia mendukung penuh pelaksanaan instalasi; dokumen ini disusun agar tim RU IV dapat mulai menyiapkan material dan pekerjaan sipil/elektrikal.</w:t>
       </w:r>
     </w:p>
     <w:p>
@@ -167,7 +167,7 @@
               <w:rPr>
                 <w:sz w:val="19"/>
               </w:rPr>
-              <w:t>1.0</w:t>
+              <w:t>1.1</w:t>
             </w:r>
           </w:p>
         </w:tc>
@@ -315,7 +315,7 @@
               <w:rPr>
                 <w:sz w:val="19"/>
               </w:rPr>
-              <w:t>PT Pertamina Patra Niaga — RU IV Cilacap &amp; vendor instalasi yang ditunjuk</w:t>
+              <w:t>PT Pertamina Patra Niaga — RU IV Cilacap (pelaksana instalasi, termasuk kontraktor yang ditunjuk RU IV)</w:t>
             </w:r>
           </w:p>
         </w:tc>
@@ -790,7 +790,7 @@
                 <w:i w:val="0"/>
                 <w:sz w:val="18"/>
               </w:rPr>
-              <w:t>Pondasi cor</w:t>
+              <w:t>Mast antena Gateway</w:t>
             </w:r>
           </w:p>
         </w:tc>
@@ -808,7 +808,7 @@
                 <w:i w:val="0"/>
                 <w:sz w:val="18"/>
               </w:rPr>
-              <w:t>GLD 40×40×80 cm · CH 50×50×100 cm, beton fc' ≥ 20 MPa</w:t>
+              <w:t>Pipa baja galvanis 2" Sch40, panjang 6 m (± 4,8 m di atas tanah), ditanam &amp; dicor di dekat ruang Gateway</w:t>
             </w:r>
           </w:p>
         </w:tc>
@@ -826,7 +826,7 @@
                 <w:i w:val="0"/>
                 <w:sz w:val="18"/>
               </w:rPr>
-              <w:t>9 titik*</w:t>
+              <w:t>1 batang</w:t>
             </w:r>
           </w:p>
         </w:tc>
@@ -866,7 +866,7 @@
                 <w:i w:val="0"/>
                 <w:sz w:val="18"/>
               </w:rPr>
-              <w:t>Catu daya GLD</w:t>
+              <w:t>Pondasi cor</w:t>
             </w:r>
           </w:p>
         </w:tc>
@@ -885,7 +885,7 @@
                 <w:i w:val="0"/>
                 <w:sz w:val="18"/>
               </w:rPr>
-              <w:t>24 VDC, kapasitas ≥ 1 A per unit (konsumsi aktual ≈ 0,33 A)</w:t>
+              <w:t>GLD 40×40×80 cm · CH 50×50×100 cm · mast GW 50×50×120 cm, beton fc' ≥ 20 MPa</w:t>
             </w:r>
           </w:p>
         </w:tc>
@@ -893,6 +893,81 @@
           <w:tcPr>
             <w:tcW w:type="dxa" w:w="1800"/>
             <w:shd w:val="clear" w:color="auto" w:fill="FAFAF8"/>
+          </w:tcPr>
+          <w:p>
+            <w:pPr>
+              <w:spacing w:after="20"/>
+            </w:pPr>
+            <w:r>
+              <w:rPr>
+                <w:b w:val="0"/>
+                <w:i w:val="0"/>
+                <w:sz w:val="18"/>
+              </w:rPr>
+              <w:t>10 titik*</w:t>
+            </w:r>
+          </w:p>
+        </w:tc>
+        <w:tc>
+          <w:tcPr>
+            <w:tcW w:type="dxa" w:w="1368"/>
+            <w:shd w:val="clear" w:color="auto" w:fill="FFF3DC"/>
+          </w:tcPr>
+          <w:p>
+            <w:pPr>
+              <w:spacing w:after="20"/>
+            </w:pPr>
+            <w:r>
+              <w:rPr>
+                <w:b/>
+                <w:color w:val="8A6D1E"/>
+                <w:sz w:val="17"/>
+              </w:rPr>
+              <w:t>USULAN</w:t>
+            </w:r>
+          </w:p>
+        </w:tc>
+      </w:tr>
+      <w:tr>
+        <w:tc>
+          <w:tcPr>
+            <w:tcW w:type="dxa" w:w="1944"/>
+          </w:tcPr>
+          <w:p>
+            <w:pPr>
+              <w:spacing w:after="20"/>
+            </w:pPr>
+            <w:r>
+              <w:rPr>
+                <w:b w:val="0"/>
+                <w:i w:val="0"/>
+                <w:sz w:val="18"/>
+              </w:rPr>
+              <w:t>Catu daya GLD</w:t>
+            </w:r>
+          </w:p>
+        </w:tc>
+        <w:tc>
+          <w:tcPr>
+            <w:tcW w:type="dxa" w:w="4824"/>
+          </w:tcPr>
+          <w:p>
+            <w:pPr>
+              <w:spacing w:after="20"/>
+            </w:pPr>
+            <w:r>
+              <w:rPr>
+                <w:b w:val="0"/>
+                <w:i w:val="0"/>
+                <w:sz w:val="18"/>
+              </w:rPr>
+              <w:t>24 VDC, kapasitas ≥ 1 A per unit (konsumsi aktual ≈ 0,33 A)</w:t>
+            </w:r>
+          </w:p>
+        </w:tc>
+        <w:tc>
+          <w:tcPr>
+            <w:tcW w:type="dxa" w:w="1800"/>
           </w:tcPr>
           <w:p>
             <w:pPr>
@@ -932,6 +1007,7 @@
         <w:tc>
           <w:tcPr>
             <w:tcW w:type="dxa" w:w="1944"/>
+            <w:shd w:val="clear" w:color="auto" w:fill="FAFAF8"/>
           </w:tcPr>
           <w:p>
             <w:pPr>
@@ -950,6 +1026,7 @@
         <w:tc>
           <w:tcPr>
             <w:tcW w:type="dxa" w:w="4824"/>
+            <w:shd w:val="clear" w:color="auto" w:fill="FAFAF8"/>
           </w:tcPr>
           <w:p>
             <w:pPr>
@@ -968,6 +1045,7 @@
         <w:tc>
           <w:tcPr>
             <w:tcW w:type="dxa" w:w="1800"/>
+            <w:shd w:val="clear" w:color="auto" w:fill="FAFAF8"/>
           </w:tcPr>
           <w:p>
             <w:pPr>
@@ -1007,57 +1085,54 @@
         <w:tc>
           <w:tcPr>
             <w:tcW w:type="dxa" w:w="1944"/>
-            <w:shd w:val="clear" w:color="auto" w:fill="FAFAF8"/>
-          </w:tcPr>
-          <w:p>
-            <w:pPr>
-              <w:spacing w:after="20"/>
-            </w:pPr>
-            <w:r>
-              <w:rPr>
-                <w:b w:val="0"/>
-                <w:i w:val="0"/>
-                <w:sz w:val="18"/>
-              </w:rPr>
-              <w:t>Kabel jaringan</w:t>
+          </w:tcPr>
+          <w:p>
+            <w:pPr>
+              <w:spacing w:after="20"/>
+            </w:pPr>
+            <w:r>
+              <w:rPr>
+                <w:b w:val="0"/>
+                <w:i w:val="0"/>
+                <w:sz w:val="18"/>
+              </w:rPr>
+              <w:t>Kabel antena Gateway</w:t>
             </w:r>
           </w:p>
         </w:tc>
         <w:tc>
           <w:tcPr>
             <w:tcW w:type="dxa" w:w="4824"/>
-            <w:shd w:val="clear" w:color="auto" w:fill="FAFAF8"/>
-          </w:tcPr>
-          <w:p>
-            <w:pPr>
-              <w:spacing w:after="20"/>
-            </w:pPr>
-            <w:r>
-              <w:rPr>
-                <w:b w:val="0"/>
-                <w:i w:val="0"/>
-                <w:sz w:val="18"/>
-              </w:rPr>
-              <w:t>Cat6 (PC ↔ router LGU, PC ↔ intranet kantor)</w:t>
+          </w:tcPr>
+          <w:p>
+            <w:pPr>
+              <w:spacing w:after="20"/>
+            </w:pPr>
+            <w:r>
+              <w:rPr>
+                <w:b w:val="0"/>
+                <w:i w:val="0"/>
+                <w:sz w:val="18"/>
+              </w:rPr>
+              <w:t>Koaksial 50 Ω low-loss (LMR-400 atau setara), ≤ 15 m, + penangkal petir koaksial</w:t>
             </w:r>
           </w:p>
         </w:tc>
         <w:tc>
           <w:tcPr>
             <w:tcW w:type="dxa" w:w="1800"/>
-            <w:shd w:val="clear" w:color="auto" w:fill="FAFAF8"/>
-          </w:tcPr>
-          <w:p>
-            <w:pPr>
-              <w:spacing w:after="20"/>
-            </w:pPr>
-            <w:r>
-              <w:rPr>
-                <w:b w:val="0"/>
-                <w:i w:val="0"/>
-                <w:sz w:val="18"/>
-              </w:rPr>
-              <w:t>2 jalur</w:t>
+          </w:tcPr>
+          <w:p>
+            <w:pPr>
+              <w:spacing w:after="20"/>
+            </w:pPr>
+            <w:r>
+              <w:rPr>
+                <w:b w:val="0"/>
+                <w:i w:val="0"/>
+                <w:sz w:val="18"/>
+              </w:rPr>
+              <w:t>1 jalur</w:t>
             </w:r>
           </w:p>
         </w:tc>
@@ -1085,6 +1160,84 @@
         <w:tc>
           <w:tcPr>
             <w:tcW w:type="dxa" w:w="1944"/>
+            <w:shd w:val="clear" w:color="auto" w:fill="FAFAF8"/>
+          </w:tcPr>
+          <w:p>
+            <w:pPr>
+              <w:spacing w:after="20"/>
+            </w:pPr>
+            <w:r>
+              <w:rPr>
+                <w:b w:val="0"/>
+                <w:i w:val="0"/>
+                <w:sz w:val="18"/>
+              </w:rPr>
+              <w:t>Kabel jaringan</w:t>
+            </w:r>
+          </w:p>
+        </w:tc>
+        <w:tc>
+          <w:tcPr>
+            <w:tcW w:type="dxa" w:w="4824"/>
+            <w:shd w:val="clear" w:color="auto" w:fill="FAFAF8"/>
+          </w:tcPr>
+          <w:p>
+            <w:pPr>
+              <w:spacing w:after="20"/>
+            </w:pPr>
+            <w:r>
+              <w:rPr>
+                <w:b w:val="0"/>
+                <w:i w:val="0"/>
+                <w:sz w:val="18"/>
+              </w:rPr>
+              <w:t>Cat6 (router ↔ PC server, PC ↔ intranet kantor)</w:t>
+            </w:r>
+          </w:p>
+        </w:tc>
+        <w:tc>
+          <w:tcPr>
+            <w:tcW w:type="dxa" w:w="1800"/>
+            <w:shd w:val="clear" w:color="auto" w:fill="FAFAF8"/>
+          </w:tcPr>
+          <w:p>
+            <w:pPr>
+              <w:spacing w:after="20"/>
+            </w:pPr>
+            <w:r>
+              <w:rPr>
+                <w:b w:val="0"/>
+                <w:i w:val="0"/>
+                <w:sz w:val="18"/>
+              </w:rPr>
+              <w:t>2 jalur</w:t>
+            </w:r>
+          </w:p>
+        </w:tc>
+        <w:tc>
+          <w:tcPr>
+            <w:tcW w:type="dxa" w:w="1368"/>
+            <w:shd w:val="clear" w:color="auto" w:fill="FFF3DC"/>
+          </w:tcPr>
+          <w:p>
+            <w:pPr>
+              <w:spacing w:after="20"/>
+            </w:pPr>
+            <w:r>
+              <w:rPr>
+                <w:b/>
+                <w:color w:val="8A6D1E"/>
+                <w:sz w:val="17"/>
+              </w:rPr>
+              <w:t>USULAN</w:t>
+            </w:r>
+          </w:p>
+        </w:tc>
+      </w:tr>
+      <w:tr>
+        <w:tc>
+          <w:tcPr>
+            <w:tcW w:type="dxa" w:w="1944"/>
           </w:tcPr>
           <w:p>
             <w:pPr>
@@ -1114,7 +1267,7 @@
                 <w:i w:val="0"/>
                 <w:sz w:val="18"/>
               </w:rPr>
-              <w:t>PC fisik dekat Gateway, 2 port LAN (dual-network)</w:t>
+              <w:t>PC fisik di ruang server lokal (bersebelahan dengan ruang Gateway), 2 port LAN</w:t>
             </w:r>
           </w:p>
         </w:tc>
@@ -1191,7 +1344,7 @@
                 <w:i w:val="0"/>
                 <w:sz w:val="18"/>
               </w:rPr>
-              <w:t>U-bolt 2"/DN50 thread M10, pelat 250×250 mm (desain LGU)</w:t>
+              <w:t>U-bolt 2"/DN50 thread M10, pelat 250×250 mm (desain LGU), untuk GLD &amp; CH</w:t>
             </w:r>
           </w:p>
         </w:tc>
@@ -1670,7 +1823,7 @@
                 <w:i w:val="0"/>
                 <w:sz w:val="18"/>
               </w:rPr>
-              <w:t>Menunggu konfirmasi tim LGU (lihat §5)</w:t>
+              <w:t>220 VAC via adaptor (rating dari tim LGU, lihat §5)</w:t>
             </w:r>
           </w:p>
         </w:tc>
@@ -1688,7 +1841,7 @@
                 <w:i w:val="0"/>
                 <w:sz w:val="18"/>
               </w:rPr>
-              <w:t>Safe area, dekat PC server</w:t>
+              <w:t>Di dalam ruangan, dekat ruang server lokal; antena di luar pada mast tinggi</w:t>
             </w:r>
           </w:p>
         </w:tc>
@@ -1766,7 +1919,7 @@
                 <w:i w:val="0"/>
                 <w:sz w:val="18"/>
               </w:rPr>
-              <w:t>Dekat Gateway; disediakan Pertamina, dikonfigurasi LGU</w:t>
+              <w:t>Ruang server lokal; disediakan Pertamina, dikonfigurasi LGU</w:t>
             </w:r>
           </w:p>
         </w:tc>
@@ -1840,7 +1993,7 @@
                 <w:i w:val="0"/>
                 <w:sz w:val="18"/>
               </w:rPr>
-              <w:t>Dekat PC server; disediakan LGU</w:t>
+              <w:t>Satu ruangan dengan Gateway; disediakan LGU</w:t>
             </w:r>
           </w:p>
         </w:tc>
@@ -1861,7 +2014,7 @@
           <w:i w:val="0"/>
           <w:sz w:val="19"/>
         </w:rPr>
-        <w:t>Alur data: GLD → (LoRa) → CH → (LoRa mesh) → Gateway → (Wi-Fi) → router LGU → PC server (MQTT broker + dashboard). PC server juga tersambung ke intranet kantor kilang lewat port LAN kedua agar dashboard dapat diakses dari kantor.</w:t>
+        <w:t>Alur data: GLD → (LoRa) → CH → (LoRa mesh) → antena Gateway di mast → (kabel koaksial) → Gateway di dalam ruangan → (Wi-Fi) → router LGU → (kabel Cat6) → PC server (MQTT broker + dashboard). PC server juga tersambung ke intranet kantor kilang lewat port LAN kedua agar dashboard dapat diakses dari kantor.</w:t>
       </w:r>
     </w:p>
     <w:p>
@@ -2410,7 +2563,7 @@
                 <w:i w:val="0"/>
                 <w:sz w:val="18"/>
               </w:rPr>
-              <w:t>Unit GLD dipasang setelah beton cukup kuat (umumnya ≥ 3 hari; ikuti praktik vendor)</w:t>
+              <w:t>Unit GLD dipasang setelah beton cukup kuat (umumnya ≥ 3 hari; ikuti praktik pelaksana RU IV)</w:t>
             </w:r>
           </w:p>
         </w:tc>
@@ -2554,7 +2707,7 @@
         <w:rPr>
           <w:color w:val="1B2A4A"/>
         </w:rPr>
-        <w:t>3.2 Tiang Cluster Head (dan Gateway bila di luar ruangan)</w:t>
+        <w:t>3.2 Tiang Cluster Head</w:t>
       </w:r>
     </w:p>
     <w:tbl>
@@ -3047,7 +3200,529 @@
         <w:rPr>
           <w:color w:val="1B2A4A"/>
         </w:rPr>
-        <w:t>3.3 Grounding &amp; penandaan</w:t>
+        <w:t>3.3 Mast antena Gateway</w:t>
+      </w:r>
+    </w:p>
+    <w:p>
+      <w:pPr>
+        <w:spacing w:after="120"/>
+      </w:pPr>
+      <w:r>
+        <w:rPr>
+          <w:b w:val="0"/>
+          <w:i w:val="0"/>
+          <w:sz w:val="19"/>
+        </w:rPr>
+        <w:t xml:space="preserve">Gateway ditempatkan </w:t>
+      </w:r>
+      <w:r>
+        <w:rPr>
+          <w:b/>
+          <w:i w:val="0"/>
+          <w:sz w:val="19"/>
+        </w:rPr>
+        <w:t>di dalam ruangan</w:t>
+      </w:r>
+      <w:r>
+        <w:rPr>
+          <w:b w:val="0"/>
+          <w:i w:val="0"/>
+          <w:sz w:val="19"/>
+        </w:rPr>
+        <w:t xml:space="preserve"> di dekat ruang server lokal, tetapi antenanya harus tinggi karena Gateway adalah titik pusat jaringan mesh: semua CH mengirim data ke antena ini. Antena dipasang di luar gedung pada mast, lalu disambung ke Gateway dengan kabel koaksial.</w:t>
+      </w:r>
+    </w:p>
+    <w:tbl>
+      <w:tblPr>
+        <w:tblStyle w:val="TableGrid"/>
+        <w:tblW w:type="auto" w:w="0"/>
+        <w:tblLook w:firstColumn="1" w:firstRow="1" w:lastColumn="0" w:lastRow="0" w:noHBand="0" w:noVBand="1" w:val="04A0"/>
+        <w:tblLayout w:type="fixed"/>
+      </w:tblPr>
+      <w:tblGrid>
+        <w:gridCol w:w="2520"/>
+        <w:gridCol w:w="5976"/>
+        <w:gridCol w:w="1440"/>
+      </w:tblGrid>
+      <w:tr>
+        <w:tc>
+          <w:tcPr>
+            <w:tcW w:type="dxa" w:w="2520"/>
+            <w:shd w:val="clear" w:color="auto" w:fill="1B2A4A"/>
+          </w:tcPr>
+          <w:p>
+            <w:pPr>
+              <w:spacing w:after="20"/>
+            </w:pPr>
+            <w:r>
+              <w:rPr>
+                <w:b/>
+                <w:color w:val="FFFFFF"/>
+                <w:sz w:val="18"/>
+              </w:rPr>
+              <w:t>Parameter</w:t>
+            </w:r>
+          </w:p>
+        </w:tc>
+        <w:tc>
+          <w:tcPr>
+            <w:tcW w:type="dxa" w:w="5976"/>
+            <w:shd w:val="clear" w:color="auto" w:fill="1B2A4A"/>
+          </w:tcPr>
+          <w:p>
+            <w:pPr>
+              <w:spacing w:after="20"/>
+            </w:pPr>
+            <w:r>
+              <w:rPr>
+                <w:b/>
+                <w:color w:val="FFFFFF"/>
+                <w:sz w:val="18"/>
+              </w:rPr>
+              <w:t>Spesifikasi</w:t>
+            </w:r>
+          </w:p>
+        </w:tc>
+        <w:tc>
+          <w:tcPr>
+            <w:tcW w:type="dxa" w:w="1440"/>
+            <w:shd w:val="clear" w:color="auto" w:fill="1B2A4A"/>
+          </w:tcPr>
+          <w:p>
+            <w:pPr>
+              <w:spacing w:after="20"/>
+            </w:pPr>
+            <w:r>
+              <w:rPr>
+                <w:b/>
+                <w:color w:val="FFFFFF"/>
+                <w:sz w:val="18"/>
+              </w:rPr>
+              <w:t>Status</w:t>
+            </w:r>
+          </w:p>
+        </w:tc>
+      </w:tr>
+      <w:tr>
+        <w:tc>
+          <w:tcPr>
+            <w:tcW w:type="dxa" w:w="2520"/>
+          </w:tcPr>
+          <w:p>
+            <w:pPr>
+              <w:spacing w:after="20"/>
+            </w:pPr>
+            <w:r>
+              <w:rPr>
+                <w:b w:val="0"/>
+                <w:i w:val="0"/>
+                <w:sz w:val="18"/>
+              </w:rPr>
+              <w:t>Antena</w:t>
+            </w:r>
+          </w:p>
+        </w:tc>
+        <w:tc>
+          <w:tcPr>
+            <w:tcW w:type="dxa" w:w="5976"/>
+          </w:tcPr>
+          <w:p>
+            <w:pPr>
+              <w:spacing w:after="20"/>
+            </w:pPr>
+            <w:r>
+              <w:rPr>
+                <w:b w:val="0"/>
+                <w:i w:val="0"/>
+                <w:sz w:val="18"/>
+              </w:rPr>
+              <w:t>Antena fiber omni 8 dBi, 920–923 MHz (bawaan perangkat Gateway, disediakan LGU)</w:t>
+            </w:r>
+          </w:p>
+        </w:tc>
+        <w:tc>
+          <w:tcPr>
+            <w:tcW w:type="dxa" w:w="1440"/>
+            <w:shd w:val="clear" w:color="auto" w:fill="EAF4EC"/>
+          </w:tcPr>
+          <w:p>
+            <w:pPr>
+              <w:spacing w:after="20"/>
+            </w:pPr>
+            <w:r>
+              <w:rPr>
+                <w:b/>
+                <w:color w:val="2C6B33"/>
+                <w:sz w:val="17"/>
+              </w:rPr>
+              <w:t>FINAL</w:t>
+            </w:r>
+          </w:p>
+        </w:tc>
+      </w:tr>
+      <w:tr>
+        <w:tc>
+          <w:tcPr>
+            <w:tcW w:type="dxa" w:w="2520"/>
+            <w:shd w:val="clear" w:color="auto" w:fill="FAFAF8"/>
+          </w:tcPr>
+          <w:p>
+            <w:pPr>
+              <w:spacing w:after="20"/>
+            </w:pPr>
+            <w:r>
+              <w:rPr>
+                <w:b w:val="0"/>
+                <w:i w:val="0"/>
+                <w:sz w:val="18"/>
+              </w:rPr>
+              <w:t>Tinggi antena</w:t>
+            </w:r>
+          </w:p>
+        </w:tc>
+        <w:tc>
+          <w:tcPr>
+            <w:tcW w:type="dxa" w:w="5976"/>
+            <w:shd w:val="clear" w:color="auto" w:fill="FAFAF8"/>
+          </w:tcPr>
+          <w:p>
+            <w:pPr>
+              <w:spacing w:after="20"/>
+            </w:pPr>
+            <w:r>
+              <w:rPr>
+                <w:b w:val="0"/>
+                <w:i w:val="0"/>
+                <w:sz w:val="18"/>
+              </w:rPr>
+              <w:t>Puncak antena ≥ 2 m di atas atap gedung terdekat dan lebih tinggi dari antena CH (3 m). Target perencanaan ± 5–6 m dari tanah</w:t>
+            </w:r>
+          </w:p>
+        </w:tc>
+        <w:tc>
+          <w:tcPr>
+            <w:tcW w:type="dxa" w:w="1440"/>
+            <w:shd w:val="clear" w:color="auto" w:fill="FFF3DC"/>
+          </w:tcPr>
+          <w:p>
+            <w:pPr>
+              <w:spacing w:after="20"/>
+            </w:pPr>
+            <w:r>
+              <w:rPr>
+                <w:b/>
+                <w:color w:val="8A6D1E"/>
+                <w:sz w:val="17"/>
+              </w:rPr>
+              <w:t>USULAN</w:t>
+            </w:r>
+          </w:p>
+        </w:tc>
+      </w:tr>
+      <w:tr>
+        <w:tc>
+          <w:tcPr>
+            <w:tcW w:type="dxa" w:w="2520"/>
+          </w:tcPr>
+          <w:p>
+            <w:pPr>
+              <w:spacing w:after="20"/>
+            </w:pPr>
+            <w:r>
+              <w:rPr>
+                <w:b w:val="0"/>
+                <w:i w:val="0"/>
+                <w:sz w:val="18"/>
+              </w:rPr>
+              <w:t>Opsi 1 (disarankan): mast berdiri sendiri</w:t>
+            </w:r>
+          </w:p>
+        </w:tc>
+        <w:tc>
+          <w:tcPr>
+            <w:tcW w:type="dxa" w:w="5976"/>
+          </w:tcPr>
+          <w:p>
+            <w:pPr>
+              <w:spacing w:after="20"/>
+            </w:pPr>
+            <w:r>
+              <w:rPr>
+                <w:b w:val="0"/>
+                <w:i w:val="0"/>
+                <w:sz w:val="18"/>
+              </w:rPr>
+              <w:t>Pipa baja galvanis 2" Sch40 panjang 6 m (1 batang standar): ± 4,8 m di atas tanah + 1,2 m tertanam; pondasi 50 × 50 × 120 cm; ditempatkan sedekat mungkin dengan dinding ruang Gateway</w:t>
+            </w:r>
+          </w:p>
+        </w:tc>
+        <w:tc>
+          <w:tcPr>
+            <w:tcW w:type="dxa" w:w="1440"/>
+            <w:shd w:val="clear" w:color="auto" w:fill="FFF3DC"/>
+          </w:tcPr>
+          <w:p>
+            <w:pPr>
+              <w:spacing w:after="20"/>
+            </w:pPr>
+            <w:r>
+              <w:rPr>
+                <w:b/>
+                <w:color w:val="8A6D1E"/>
+                <w:sz w:val="17"/>
+              </w:rPr>
+              <w:t>USULAN</w:t>
+            </w:r>
+          </w:p>
+        </w:tc>
+      </w:tr>
+      <w:tr>
+        <w:tc>
+          <w:tcPr>
+            <w:tcW w:type="dxa" w:w="2520"/>
+            <w:shd w:val="clear" w:color="auto" w:fill="FAFAF8"/>
+          </w:tcPr>
+          <w:p>
+            <w:pPr>
+              <w:spacing w:after="20"/>
+            </w:pPr>
+            <w:r>
+              <w:rPr>
+                <w:b w:val="0"/>
+                <w:i w:val="0"/>
+                <w:sz w:val="18"/>
+              </w:rPr>
+              <w:t>Opsi 2: mast di dinding/atap gedung</w:t>
+            </w:r>
+          </w:p>
+        </w:tc>
+        <w:tc>
+          <w:tcPr>
+            <w:tcW w:type="dxa" w:w="5976"/>
+            <w:shd w:val="clear" w:color="auto" w:fill="FAFAF8"/>
+          </w:tcPr>
+          <w:p>
+            <w:pPr>
+              <w:spacing w:after="20"/>
+            </w:pPr>
+            <w:r>
+              <w:rPr>
+                <w:b w:val="0"/>
+                <w:i w:val="0"/>
+                <w:sz w:val="18"/>
+              </w:rPr>
+              <w:t>Pipa 2" dengan wall bracket/klem ke dinding atau parapet; perlu izin RU IV karena melubangi/menjepit struktur gedung</w:t>
+            </w:r>
+          </w:p>
+        </w:tc>
+        <w:tc>
+          <w:tcPr>
+            <w:tcW w:type="dxa" w:w="1440"/>
+            <w:shd w:val="clear" w:color="auto" w:fill="FBE6E4"/>
+          </w:tcPr>
+          <w:p>
+            <w:pPr>
+              <w:spacing w:after="20"/>
+            </w:pPr>
+            <w:r>
+              <w:rPr>
+                <w:b/>
+                <w:color w:val="B23A3A"/>
+                <w:sz w:val="17"/>
+              </w:rPr>
+              <w:t>KONFIRMASI</w:t>
+            </w:r>
+          </w:p>
+        </w:tc>
+      </w:tr>
+      <w:tr>
+        <w:tc>
+          <w:tcPr>
+            <w:tcW w:type="dxa" w:w="2520"/>
+          </w:tcPr>
+          <w:p>
+            <w:pPr>
+              <w:spacing w:after="20"/>
+            </w:pPr>
+            <w:r>
+              <w:rPr>
+                <w:b w:val="0"/>
+                <w:i w:val="0"/>
+                <w:sz w:val="18"/>
+              </w:rPr>
+              <w:t>Penguat mast</w:t>
+            </w:r>
+          </w:p>
+        </w:tc>
+        <w:tc>
+          <w:tcPr>
+            <w:tcW w:type="dxa" w:w="5976"/>
+          </w:tcPr>
+          <w:p>
+            <w:pPr>
+              <w:spacing w:after="20"/>
+            </w:pPr>
+            <w:r>
+              <w:rPr>
+                <w:b w:val="0"/>
+                <w:i w:val="0"/>
+                <w:sz w:val="18"/>
+              </w:rPr>
+              <w:t>Bila tinggi &gt; 5 m atau angin kencang: tambah guy wire 3 arah atau klem ke dinding gedung</w:t>
+            </w:r>
+          </w:p>
+        </w:tc>
+        <w:tc>
+          <w:tcPr>
+            <w:tcW w:type="dxa" w:w="1440"/>
+            <w:shd w:val="clear" w:color="auto" w:fill="FFF3DC"/>
+          </w:tcPr>
+          <w:p>
+            <w:pPr>
+              <w:spacing w:after="20"/>
+            </w:pPr>
+            <w:r>
+              <w:rPr>
+                <w:b/>
+                <w:color w:val="8A6D1E"/>
+                <w:sz w:val="17"/>
+              </w:rPr>
+              <w:t>USULAN</w:t>
+            </w:r>
+          </w:p>
+        </w:tc>
+      </w:tr>
+      <w:tr>
+        <w:tc>
+          <w:tcPr>
+            <w:tcW w:type="dxa" w:w="2520"/>
+            <w:shd w:val="clear" w:color="auto" w:fill="FAFAF8"/>
+          </w:tcPr>
+          <w:p>
+            <w:pPr>
+              <w:spacing w:after="20"/>
+            </w:pPr>
+            <w:r>
+              <w:rPr>
+                <w:b w:val="0"/>
+                <w:i w:val="0"/>
+                <w:sz w:val="18"/>
+              </w:rPr>
+              <w:t>Klem antena</w:t>
+            </w:r>
+          </w:p>
+        </w:tc>
+        <w:tc>
+          <w:tcPr>
+            <w:tcW w:type="dxa" w:w="5976"/>
+            <w:shd w:val="clear" w:color="auto" w:fill="FAFAF8"/>
+          </w:tcPr>
+          <w:p>
+            <w:pPr>
+              <w:spacing w:after="20"/>
+            </w:pPr>
+            <w:r>
+              <w:rPr>
+                <w:b w:val="0"/>
+                <w:i w:val="0"/>
+                <w:sz w:val="18"/>
+              </w:rPr>
+              <w:t>Mengikuti klem bawaan antena (umumnya untuk pipa Ø 30–60 mm)</w:t>
+            </w:r>
+          </w:p>
+        </w:tc>
+        <w:tc>
+          <w:tcPr>
+            <w:tcW w:type="dxa" w:w="1440"/>
+            <w:shd w:val="clear" w:color="auto" w:fill="FFF3DC"/>
+          </w:tcPr>
+          <w:p>
+            <w:pPr>
+              <w:spacing w:after="20"/>
+            </w:pPr>
+            <w:r>
+              <w:rPr>
+                <w:b/>
+                <w:color w:val="8A6D1E"/>
+                <w:sz w:val="17"/>
+              </w:rPr>
+              <w:t>USULAN</w:t>
+            </w:r>
+          </w:p>
+        </w:tc>
+      </w:tr>
+      <w:tr>
+        <w:tc>
+          <w:tcPr>
+            <w:tcW w:type="dxa" w:w="2520"/>
+          </w:tcPr>
+          <w:p>
+            <w:pPr>
+              <w:spacing w:after="20"/>
+            </w:pPr>
+            <w:r>
+              <w:rPr>
+                <w:b w:val="0"/>
+                <w:i w:val="0"/>
+                <w:sz w:val="18"/>
+              </w:rPr>
+              <w:t>Grounding &amp; petir</w:t>
+            </w:r>
+          </w:p>
+        </w:tc>
+        <w:tc>
+          <w:tcPr>
+            <w:tcW w:type="dxa" w:w="5976"/>
+          </w:tcPr>
+          <w:p>
+            <w:pPr>
+              <w:spacing w:after="20"/>
+            </w:pPr>
+            <w:r>
+              <w:rPr>
+                <w:b w:val="0"/>
+                <w:i w:val="0"/>
+                <w:sz w:val="18"/>
+              </w:rPr>
+              <w:t>Mast di-bonding ke grounding RU IV; penangkal petir koaksial dipasang di titik kabel masuk gedung</w:t>
+            </w:r>
+          </w:p>
+        </w:tc>
+        <w:tc>
+          <w:tcPr>
+            <w:tcW w:type="dxa" w:w="1440"/>
+            <w:shd w:val="clear" w:color="auto" w:fill="FBE6E4"/>
+          </w:tcPr>
+          <w:p>
+            <w:pPr>
+              <w:spacing w:after="20"/>
+            </w:pPr>
+            <w:r>
+              <w:rPr>
+                <w:b/>
+                <w:color w:val="B23A3A"/>
+                <w:sz w:val="17"/>
+              </w:rPr>
+              <w:t>KONFIRMASI</w:t>
+            </w:r>
+          </w:p>
+        </w:tc>
+      </w:tr>
+    </w:tbl>
+    <w:p>
+      <w:pPr>
+        <w:spacing w:after="40"/>
+      </w:pPr>
+    </w:p>
+    <w:p>
+      <w:pPr>
+        <w:pStyle w:val="Heading2"/>
+      </w:pPr>
+      <w:r>
+        <w:rPr>
+          <w:color w:val="1B2A4A"/>
+        </w:rPr>
+        <w:t>3.4 Grounding &amp; penandaan</w:t>
       </w:r>
     </w:p>
     <w:p>
@@ -3083,7 +3758,7 @@
           <w:i w:val="0"/>
           <w:sz w:val="20"/>
         </w:rPr>
-        <w:t>Tiang CH yang lebih tinggi dari struktur sekitarnya: perlu tidaknya proteksi petir ditentukan HSE/elektrikal RU IV.</w:t>
+        <w:t>Tiang CH dan mast Gateway lebih tinggi dari struktur sekitarnya: perlu tidaknya proteksi petir tambahan ditentukan HSE/elektrikal RU IV.</w:t>
       </w:r>
     </w:p>
     <w:p>
@@ -4440,7 +5115,7 @@
                 <w:i w:val="0"/>
                 <w:sz w:val="18"/>
               </w:rPr>
-              <w:t>Penarikan kabel &amp; PSU oleh vendor/RU IV; terminasi akhir, energize &amp; commissioning oleh LGU</w:t>
+              <w:t>Penarikan kabel &amp; PSU oleh RU IV; terminasi akhir, energize &amp; commissioning oleh LGU</w:t>
             </w:r>
           </w:p>
         </w:tc>
@@ -4854,6 +5529,30 @@
         <w:t>5. Gateway, PC server &amp; jaringan</w:t>
       </w:r>
     </w:p>
+    <w:p>
+      <w:pPr>
+        <w:spacing w:after="120"/>
+      </w:pPr>
+      <w:r>
+        <w:rPr>
+          <w:b w:val="0"/>
+          <w:i w:val="0"/>
+          <w:sz w:val="19"/>
+        </w:rPr>
+        <w:t>Tata letak: ruang Gateway (Gateway + router LGU) bersebelahan/dekat dengan ruang server lokal (PC server). Gateway tersambung ke router lewat Wi-Fi, sehingga keduanya sebaiknya satu ruangan; router ke PC server memakai kabel Cat6.</w:t>
+      </w:r>
+    </w:p>
+    <w:p>
+      <w:pPr>
+        <w:pStyle w:val="Heading2"/>
+      </w:pPr>
+      <w:r>
+        <w:rPr>
+          <w:color w:val="1B2A4A"/>
+        </w:rPr>
+        <w:t>5.1 Ruang Gateway &amp; ruang server</w:t>
+      </w:r>
+    </w:p>
     <w:tbl>
       <w:tblPr>
         <w:tblStyle w:val="TableGrid"/>
@@ -4978,7 +5677,7 @@
                 <w:i w:val="0"/>
                 <w:sz w:val="18"/>
               </w:rPr>
-              <w:t>PC fisik, 2 port LAN (NIC kedua bisa USB-LAN), dekat Gateway, di safe area. Usulan minimum: 4 core / 8 GB RAM / SSD 256 GB</w:t>
+              <w:t>PC fisik, 2 port LAN (NIC kedua bisa USB-LAN), di ruang server lokal. Usulan minimum: 4 core / 8 GB RAM / SSD 256 GB</w:t>
             </w:r>
           </w:p>
         </w:tc>
@@ -5113,7 +5812,7 @@
                 <w:i w:val="0"/>
                 <w:sz w:val="18"/>
               </w:rPr>
-              <w:t>Kabel PC ↔ router</w:t>
+              <w:t>Gateway ↔ router</w:t>
             </w:r>
           </w:p>
         </w:tc>
@@ -5131,7 +5830,7 @@
                 <w:i w:val="0"/>
                 <w:sz w:val="18"/>
               </w:rPr>
-              <w:t>Cat6 patch cord 2–5 m</w:t>
+              <w:t>Satu ruangan, jarak ± 1–5 m, tanpa sekat logam (Gateway memakai Wi-Fi)</w:t>
             </w:r>
           </w:p>
         </w:tc>
@@ -5149,7 +5848,7 @@
                 <w:i w:val="0"/>
                 <w:sz w:val="18"/>
               </w:rPr>
-              <w:t>LGU</w:t>
+              <w:t>—</w:t>
             </w:r>
           </w:p>
         </w:tc>
@@ -5189,7 +5888,7 @@
                 <w:i w:val="0"/>
                 <w:sz w:val="18"/>
               </w:rPr>
-              <w:t>Kabel PC ↔ intranet kantor</w:t>
+              <w:t>Kabel router ↔ PC server</w:t>
             </w:r>
           </w:p>
         </w:tc>
@@ -5208,7 +5907,7 @@
                 <w:i w:val="0"/>
                 <w:sz w:val="18"/>
               </w:rPr>
-              <w:t>Cat6 ke titik jaringan kantor terdekat; panjang mengikuti lokasi (&gt; 90 m → switch/fiber). Akses hanya untuk API/dashboard</w:t>
+              <w:t>Cat6 sesuai jarak antar-ruang (maks. 90 m per segmen), lewat jalur kabel/conduit gedung</w:t>
             </w:r>
           </w:p>
         </w:tc>
@@ -5227,7 +5926,7 @@
                 <w:i w:val="0"/>
                 <w:sz w:val="18"/>
               </w:rPr>
-              <w:t>Pertamina (IT RU IV)</w:t>
+              <w:t>RU IV</w:t>
             </w:r>
           </w:p>
         </w:tc>
@@ -5266,7 +5965,7 @@
                 <w:i w:val="0"/>
                 <w:sz w:val="18"/>
               </w:rPr>
-              <w:t>Jarak Gateway ↔ router</w:t>
+              <w:t>Kabel PC ↔ intranet kantor</w:t>
             </w:r>
           </w:p>
         </w:tc>
@@ -5284,7 +5983,7 @@
                 <w:i w:val="0"/>
                 <w:sz w:val="18"/>
               </w:rPr>
-              <w:t>Sebaiknya dalam satu ruangan/area tanpa sekat logam (Gateway memakai Wi-Fi)</w:t>
+              <w:t>Cat6 ke titik jaringan kantor terdekat; panjang mengikuti lokasi (&gt; 90 m → switch/fiber). Akses hanya untuk API/dashboard</w:t>
             </w:r>
           </w:p>
         </w:tc>
@@ -5302,7 +6001,160 @@
                 <w:i w:val="0"/>
                 <w:sz w:val="18"/>
               </w:rPr>
-              <w:t>—</w:t>
+              <w:t>Pertamina (IT RU IV)</w:t>
+            </w:r>
+          </w:p>
+        </w:tc>
+        <w:tc>
+          <w:tcPr>
+            <w:tcW w:type="dxa" w:w="1440"/>
+            <w:shd w:val="clear" w:color="auto" w:fill="FBE6E4"/>
+          </w:tcPr>
+          <w:p>
+            <w:pPr>
+              <w:spacing w:after="20"/>
+            </w:pPr>
+            <w:r>
+              <w:rPr>
+                <w:b/>
+                <w:color w:val="B23A3A"/>
+                <w:sz w:val="17"/>
+              </w:rPr>
+              <w:t>KONFIRMASI</w:t>
+            </w:r>
+          </w:p>
+        </w:tc>
+      </w:tr>
+      <w:tr>
+        <w:tc>
+          <w:tcPr>
+            <w:tcW w:type="dxa" w:w="2088"/>
+            <w:shd w:val="clear" w:color="auto" w:fill="FAFAF8"/>
+          </w:tcPr>
+          <w:p>
+            <w:pPr>
+              <w:spacing w:after="20"/>
+            </w:pPr>
+            <w:r>
+              <w:rPr>
+                <w:b w:val="0"/>
+                <w:i w:val="0"/>
+                <w:sz w:val="18"/>
+              </w:rPr>
+              <w:t>Daya Gateway</w:t>
+            </w:r>
+          </w:p>
+        </w:tc>
+        <w:tc>
+          <w:tcPr>
+            <w:tcW w:type="dxa" w:w="4608"/>
+            <w:shd w:val="clear" w:color="auto" w:fill="FAFAF8"/>
+          </w:tcPr>
+          <w:p>
+            <w:pPr>
+              <w:spacing w:after="20"/>
+            </w:pPr>
+            <w:r>
+              <w:rPr>
+                <w:b w:val="0"/>
+                <w:i w:val="0"/>
+                <w:sz w:val="18"/>
+              </w:rPr>
+              <w:t>Adaptor 220 VAC dari stop kontak ruang Gateway; tegangan &amp; rating adaptor dikonfirmasi tim LGU</w:t>
+            </w:r>
+          </w:p>
+        </w:tc>
+        <w:tc>
+          <w:tcPr>
+            <w:tcW w:type="dxa" w:w="1800"/>
+            <w:shd w:val="clear" w:color="auto" w:fill="FAFAF8"/>
+          </w:tcPr>
+          <w:p>
+            <w:pPr>
+              <w:spacing w:after="20"/>
+            </w:pPr>
+            <w:r>
+              <w:rPr>
+                <w:b w:val="0"/>
+                <w:i w:val="0"/>
+                <w:sz w:val="18"/>
+              </w:rPr>
+              <w:t>LGU</w:t>
+            </w:r>
+          </w:p>
+        </w:tc>
+        <w:tc>
+          <w:tcPr>
+            <w:tcW w:type="dxa" w:w="1440"/>
+            <w:shd w:val="clear" w:color="auto" w:fill="FBE6E4"/>
+          </w:tcPr>
+          <w:p>
+            <w:pPr>
+              <w:spacing w:after="20"/>
+            </w:pPr>
+            <w:r>
+              <w:rPr>
+                <w:b/>
+                <w:color w:val="B23A3A"/>
+                <w:sz w:val="17"/>
+              </w:rPr>
+              <w:t>KONFIRMASI</w:t>
+            </w:r>
+          </w:p>
+        </w:tc>
+      </w:tr>
+      <w:tr>
+        <w:tc>
+          <w:tcPr>
+            <w:tcW w:type="dxa" w:w="2088"/>
+          </w:tcPr>
+          <w:p>
+            <w:pPr>
+              <w:spacing w:after="20"/>
+            </w:pPr>
+            <w:r>
+              <w:rPr>
+                <w:b w:val="0"/>
+                <w:i w:val="0"/>
+                <w:sz w:val="18"/>
+              </w:rPr>
+              <w:t>Stop kontak 220 VAC</w:t>
+            </w:r>
+          </w:p>
+        </w:tc>
+        <w:tc>
+          <w:tcPr>
+            <w:tcW w:type="dxa" w:w="4608"/>
+          </w:tcPr>
+          <w:p>
+            <w:pPr>
+              <w:spacing w:after="20"/>
+            </w:pPr>
+            <w:r>
+              <w:rPr>
+                <w:b w:val="0"/>
+                <w:i w:val="0"/>
+                <w:sz w:val="18"/>
+              </w:rPr>
+              <w:t>Ruang Gateway: min. 2 (Gateway, router). Ruang server: min. 3 (PC, monitor, cadangan)</w:t>
+            </w:r>
+          </w:p>
+        </w:tc>
+        <w:tc>
+          <w:tcPr>
+            <w:tcW w:type="dxa" w:w="1800"/>
+          </w:tcPr>
+          <w:p>
+            <w:pPr>
+              <w:spacing w:after="20"/>
+            </w:pPr>
+            <w:r>
+              <w:rPr>
+                <w:b w:val="0"/>
+                <w:i w:val="0"/>
+                <w:sz w:val="18"/>
+              </w:rPr>
+              <w:t>RU IV</w:t>
             </w:r>
           </w:p>
         </w:tc>
@@ -5342,7 +6194,7 @@
                 <w:i w:val="0"/>
                 <w:sz w:val="18"/>
               </w:rPr>
-              <w:t>Daya Gateway</w:t>
+              <w:t>UPS</w:t>
             </w:r>
           </w:p>
         </w:tc>
@@ -5361,160 +6213,7 @@
                 <w:i w:val="0"/>
                 <w:sz w:val="18"/>
               </w:rPr>
-              <w:t>Menunggu konfirmasi tim LGU (adaptor 220 VAC atau panel surya + baterai seperti CH)</w:t>
-            </w:r>
-          </w:p>
-        </w:tc>
-        <w:tc>
-          <w:tcPr>
-            <w:tcW w:type="dxa" w:w="1800"/>
-            <w:shd w:val="clear" w:color="auto" w:fill="FAFAF8"/>
-          </w:tcPr>
-          <w:p>
-            <w:pPr>
-              <w:spacing w:after="20"/>
-            </w:pPr>
-            <w:r>
-              <w:rPr>
-                <w:b w:val="0"/>
-                <w:i w:val="0"/>
-                <w:sz w:val="18"/>
-              </w:rPr>
-              <w:t>LGU</w:t>
-            </w:r>
-          </w:p>
-        </w:tc>
-        <w:tc>
-          <w:tcPr>
-            <w:tcW w:type="dxa" w:w="1440"/>
-            <w:shd w:val="clear" w:color="auto" w:fill="FBE6E4"/>
-          </w:tcPr>
-          <w:p>
-            <w:pPr>
-              <w:spacing w:after="20"/>
-            </w:pPr>
-            <w:r>
-              <w:rPr>
-                <w:b/>
-                <w:color w:val="B23A3A"/>
-                <w:sz w:val="17"/>
-              </w:rPr>
-              <w:t>KONFIRMASI</w:t>
-            </w:r>
-          </w:p>
-        </w:tc>
-      </w:tr>
-      <w:tr>
-        <w:tc>
-          <w:tcPr>
-            <w:tcW w:type="dxa" w:w="2088"/>
-          </w:tcPr>
-          <w:p>
-            <w:pPr>
-              <w:spacing w:after="20"/>
-            </w:pPr>
-            <w:r>
-              <w:rPr>
-                <w:b w:val="0"/>
-                <w:i w:val="0"/>
-                <w:sz w:val="18"/>
-              </w:rPr>
-              <w:t>Stop kontak 220 VAC</w:t>
-            </w:r>
-          </w:p>
-        </w:tc>
-        <w:tc>
-          <w:tcPr>
-            <w:tcW w:type="dxa" w:w="4608"/>
-          </w:tcPr>
-          <w:p>
-            <w:pPr>
-              <w:spacing w:after="20"/>
-            </w:pPr>
-            <w:r>
-              <w:rPr>
-                <w:b w:val="0"/>
-                <w:i w:val="0"/>
-                <w:sz w:val="18"/>
-              </w:rPr>
-              <w:t>Minimal 4 titik di lokasi PC (PC, monitor, router, Gateway)</w:t>
-            </w:r>
-          </w:p>
-        </w:tc>
-        <w:tc>
-          <w:tcPr>
-            <w:tcW w:type="dxa" w:w="1800"/>
-          </w:tcPr>
-          <w:p>
-            <w:pPr>
-              <w:spacing w:after="20"/>
-            </w:pPr>
-            <w:r>
-              <w:rPr>
-                <w:b w:val="0"/>
-                <w:i w:val="0"/>
-                <w:sz w:val="18"/>
-              </w:rPr>
-              <w:t>Pertamina</w:t>
-            </w:r>
-          </w:p>
-        </w:tc>
-        <w:tc>
-          <w:tcPr>
-            <w:tcW w:type="dxa" w:w="1440"/>
-            <w:shd w:val="clear" w:color="auto" w:fill="FFF3DC"/>
-          </w:tcPr>
-          <w:p>
-            <w:pPr>
-              <w:spacing w:after="20"/>
-            </w:pPr>
-            <w:r>
-              <w:rPr>
-                <w:b/>
-                <w:color w:val="8A6D1E"/>
-                <w:sz w:val="17"/>
-              </w:rPr>
-              <w:t>USULAN</w:t>
-            </w:r>
-          </w:p>
-        </w:tc>
-      </w:tr>
-      <w:tr>
-        <w:tc>
-          <w:tcPr>
-            <w:tcW w:type="dxa" w:w="2088"/>
-            <w:shd w:val="clear" w:color="auto" w:fill="FAFAF8"/>
-          </w:tcPr>
-          <w:p>
-            <w:pPr>
-              <w:spacing w:after="20"/>
-            </w:pPr>
-            <w:r>
-              <w:rPr>
-                <w:b w:val="0"/>
-                <w:i w:val="0"/>
-                <w:sz w:val="18"/>
-              </w:rPr>
-              <w:t>UPS</w:t>
-            </w:r>
-          </w:p>
-        </w:tc>
-        <w:tc>
-          <w:tcPr>
-            <w:tcW w:type="dxa" w:w="4608"/>
-            <w:shd w:val="clear" w:color="auto" w:fill="FAFAF8"/>
-          </w:tcPr>
-          <w:p>
-            <w:pPr>
-              <w:spacing w:after="20"/>
-            </w:pPr>
-            <w:r>
-              <w:rPr>
-                <w:b w:val="0"/>
-                <w:i w:val="0"/>
-                <w:sz w:val="18"/>
-              </w:rPr>
-              <w:t>Disarankan ≥ 1 kVA untuk PC + router agar alarm tetap tercatat saat listrik padam</w:t>
+              <w:t>Disarankan ≥ 1 kVA untuk PC + router + Gateway agar alarm tetap tercatat saat listrik padam</w:t>
             </w:r>
           </w:p>
         </w:tc>
@@ -5562,6 +6261,934 @@
       <w:pPr>
         <w:spacing w:after="40"/>
       </w:pPr>
+    </w:p>
+    <w:p>
+      <w:pPr>
+        <w:pStyle w:val="Heading2"/>
+      </w:pPr>
+      <w:r>
+        <w:rPr>
+          <w:color w:val="1B2A4A"/>
+        </w:rPr>
+        <w:t>5.2 Kabel koaksial antena Gateway</w:t>
+      </w:r>
+    </w:p>
+    <w:tbl>
+      <w:tblPr>
+        <w:tblStyle w:val="TableGrid"/>
+        <w:tblW w:type="auto" w:w="0"/>
+        <w:tblLook w:firstColumn="1" w:firstRow="1" w:lastColumn="0" w:lastRow="0" w:noHBand="0" w:noVBand="1" w:val="04A0"/>
+        <w:tblLayout w:type="fixed"/>
+      </w:tblPr>
+      <w:tblGrid>
+        <w:gridCol w:w="2304"/>
+        <w:gridCol w:w="6192"/>
+        <w:gridCol w:w="1440"/>
+      </w:tblGrid>
+      <w:tr>
+        <w:tc>
+          <w:tcPr>
+            <w:tcW w:type="dxa" w:w="2304"/>
+            <w:shd w:val="clear" w:color="auto" w:fill="1B2A4A"/>
+          </w:tcPr>
+          <w:p>
+            <w:pPr>
+              <w:spacing w:after="20"/>
+            </w:pPr>
+            <w:r>
+              <w:rPr>
+                <w:b/>
+                <w:color w:val="FFFFFF"/>
+                <w:sz w:val="18"/>
+              </w:rPr>
+              <w:t>Parameter</w:t>
+            </w:r>
+          </w:p>
+        </w:tc>
+        <w:tc>
+          <w:tcPr>
+            <w:tcW w:type="dxa" w:w="6192"/>
+            <w:shd w:val="clear" w:color="auto" w:fill="1B2A4A"/>
+          </w:tcPr>
+          <w:p>
+            <w:pPr>
+              <w:spacing w:after="20"/>
+            </w:pPr>
+            <w:r>
+              <w:rPr>
+                <w:b/>
+                <w:color w:val="FFFFFF"/>
+                <w:sz w:val="18"/>
+              </w:rPr>
+              <w:t>Spesifikasi</w:t>
+            </w:r>
+          </w:p>
+        </w:tc>
+        <w:tc>
+          <w:tcPr>
+            <w:tcW w:type="dxa" w:w="1440"/>
+            <w:shd w:val="clear" w:color="auto" w:fill="1B2A4A"/>
+          </w:tcPr>
+          <w:p>
+            <w:pPr>
+              <w:spacing w:after="20"/>
+            </w:pPr>
+            <w:r>
+              <w:rPr>
+                <w:b/>
+                <w:color w:val="FFFFFF"/>
+                <w:sz w:val="18"/>
+              </w:rPr>
+              <w:t>Status</w:t>
+            </w:r>
+          </w:p>
+        </w:tc>
+      </w:tr>
+      <w:tr>
+        <w:tc>
+          <w:tcPr>
+            <w:tcW w:type="dxa" w:w="2304"/>
+          </w:tcPr>
+          <w:p>
+            <w:pPr>
+              <w:spacing w:after="20"/>
+            </w:pPr>
+            <w:r>
+              <w:rPr>
+                <w:b w:val="0"/>
+                <w:i w:val="0"/>
+                <w:sz w:val="18"/>
+              </w:rPr>
+              <w:t>Jenis kabel</w:t>
+            </w:r>
+          </w:p>
+        </w:tc>
+        <w:tc>
+          <w:tcPr>
+            <w:tcW w:type="dxa" w:w="6192"/>
+          </w:tcPr>
+          <w:p>
+            <w:pPr>
+              <w:spacing w:after="20"/>
+            </w:pPr>
+            <w:r>
+              <w:rPr>
+                <w:b w:val="0"/>
+                <w:i w:val="0"/>
+                <w:sz w:val="18"/>
+              </w:rPr>
+              <w:t>Koaksial 50 Ω low-loss, LMR-400 atau setara (tahan UV untuk bagian luar)</w:t>
+            </w:r>
+          </w:p>
+        </w:tc>
+        <w:tc>
+          <w:tcPr>
+            <w:tcW w:type="dxa" w:w="1440"/>
+            <w:shd w:val="clear" w:color="auto" w:fill="FFF3DC"/>
+          </w:tcPr>
+          <w:p>
+            <w:pPr>
+              <w:spacing w:after="20"/>
+            </w:pPr>
+            <w:r>
+              <w:rPr>
+                <w:b/>
+                <w:color w:val="8A6D1E"/>
+                <w:sz w:val="17"/>
+              </w:rPr>
+              <w:t>USULAN</w:t>
+            </w:r>
+          </w:p>
+        </w:tc>
+      </w:tr>
+      <w:tr>
+        <w:tc>
+          <w:tcPr>
+            <w:tcW w:type="dxa" w:w="2304"/>
+            <w:shd w:val="clear" w:color="auto" w:fill="FAFAF8"/>
+          </w:tcPr>
+          <w:p>
+            <w:pPr>
+              <w:spacing w:after="20"/>
+            </w:pPr>
+            <w:r>
+              <w:rPr>
+                <w:b w:val="0"/>
+                <w:i w:val="0"/>
+                <w:sz w:val="18"/>
+              </w:rPr>
+              <w:t>Panjang</w:t>
+            </w:r>
+          </w:p>
+        </w:tc>
+        <w:tc>
+          <w:tcPr>
+            <w:tcW w:type="dxa" w:w="6192"/>
+            <w:shd w:val="clear" w:color="auto" w:fill="FAFAF8"/>
+          </w:tcPr>
+          <w:p>
+            <w:pPr>
+              <w:spacing w:after="20"/>
+            </w:pPr>
+            <w:r>
+              <w:rPr>
+                <w:b w:val="0"/>
+                <w:i w:val="0"/>
+                <w:sz w:val="18"/>
+              </w:rPr>
+              <w:t>Sependek mungkin; target ≤ 15 m dari antena ke Gateway. Rumus: rute aktual × 1,10 + 1 m</w:t>
+            </w:r>
+          </w:p>
+        </w:tc>
+        <w:tc>
+          <w:tcPr>
+            <w:tcW w:type="dxa" w:w="1440"/>
+            <w:shd w:val="clear" w:color="auto" w:fill="FFF3DC"/>
+          </w:tcPr>
+          <w:p>
+            <w:pPr>
+              <w:spacing w:after="20"/>
+            </w:pPr>
+            <w:r>
+              <w:rPr>
+                <w:b/>
+                <w:color w:val="8A6D1E"/>
+                <w:sz w:val="17"/>
+              </w:rPr>
+              <w:t>USULAN</w:t>
+            </w:r>
+          </w:p>
+        </w:tc>
+      </w:tr>
+      <w:tr>
+        <w:tc>
+          <w:tcPr>
+            <w:tcW w:type="dxa" w:w="2304"/>
+          </w:tcPr>
+          <w:p>
+            <w:pPr>
+              <w:spacing w:after="20"/>
+            </w:pPr>
+            <w:r>
+              <w:rPr>
+                <w:b w:val="0"/>
+                <w:i w:val="0"/>
+                <w:sz w:val="18"/>
+              </w:rPr>
+              <w:t>Konektor</w:t>
+            </w:r>
+          </w:p>
+        </w:tc>
+        <w:tc>
+          <w:tcPr>
+            <w:tcW w:type="dxa" w:w="6192"/>
+          </w:tcPr>
+          <w:p>
+            <w:pPr>
+              <w:spacing w:after="20"/>
+            </w:pPr>
+            <w:r>
+              <w:rPr>
+                <w:b w:val="0"/>
+                <w:i w:val="0"/>
+                <w:sz w:val="18"/>
+              </w:rPr>
+              <w:t>Tipe N di sisi antena &amp; penangkal petir; adaptor/pigtail ke konektor antena Gateway (tipe konektor Gateway dikonfirmasi tim LGU)</w:t>
+            </w:r>
+          </w:p>
+        </w:tc>
+        <w:tc>
+          <w:tcPr>
+            <w:tcW w:type="dxa" w:w="1440"/>
+            <w:shd w:val="clear" w:color="auto" w:fill="FBE6E4"/>
+          </w:tcPr>
+          <w:p>
+            <w:pPr>
+              <w:spacing w:after="20"/>
+            </w:pPr>
+            <w:r>
+              <w:rPr>
+                <w:b/>
+                <w:color w:val="B23A3A"/>
+                <w:sz w:val="17"/>
+              </w:rPr>
+              <w:t>KONFIRMASI</w:t>
+            </w:r>
+          </w:p>
+        </w:tc>
+      </w:tr>
+      <w:tr>
+        <w:tc>
+          <w:tcPr>
+            <w:tcW w:type="dxa" w:w="2304"/>
+            <w:shd w:val="clear" w:color="auto" w:fill="FAFAF8"/>
+          </w:tcPr>
+          <w:p>
+            <w:pPr>
+              <w:spacing w:after="20"/>
+            </w:pPr>
+            <w:r>
+              <w:rPr>
+                <w:b w:val="0"/>
+                <w:i w:val="0"/>
+                <w:sz w:val="18"/>
+              </w:rPr>
+              <w:t>Penangkal petir</w:t>
+            </w:r>
+          </w:p>
+        </w:tc>
+        <w:tc>
+          <w:tcPr>
+            <w:tcW w:type="dxa" w:w="6192"/>
+            <w:shd w:val="clear" w:color="auto" w:fill="FAFAF8"/>
+          </w:tcPr>
+          <w:p>
+            <w:pPr>
+              <w:spacing w:after="20"/>
+            </w:pPr>
+            <w:r>
+              <w:rPr>
+                <w:b w:val="0"/>
+                <w:i w:val="0"/>
+                <w:sz w:val="18"/>
+              </w:rPr>
+              <w:t>Coaxial lightning arrester 50 Ω untuk 900 MHz (tipe gas discharge), konektor N, dipasang di titik kabel masuk gedung dan di-grounding</w:t>
+            </w:r>
+          </w:p>
+        </w:tc>
+        <w:tc>
+          <w:tcPr>
+            <w:tcW w:type="dxa" w:w="1440"/>
+            <w:shd w:val="clear" w:color="auto" w:fill="FFF3DC"/>
+          </w:tcPr>
+          <w:p>
+            <w:pPr>
+              <w:spacing w:after="20"/>
+            </w:pPr>
+            <w:r>
+              <w:rPr>
+                <w:b/>
+                <w:color w:val="8A6D1E"/>
+                <w:sz w:val="17"/>
+              </w:rPr>
+              <w:t>USULAN</w:t>
+            </w:r>
+          </w:p>
+        </w:tc>
+      </w:tr>
+      <w:tr>
+        <w:tc>
+          <w:tcPr>
+            <w:tcW w:type="dxa" w:w="2304"/>
+          </w:tcPr>
+          <w:p>
+            <w:pPr>
+              <w:spacing w:after="20"/>
+            </w:pPr>
+            <w:r>
+              <w:rPr>
+                <w:b w:val="0"/>
+                <w:i w:val="0"/>
+                <w:sz w:val="18"/>
+              </w:rPr>
+              <w:t>Kabel masuk gedung</w:t>
+            </w:r>
+          </w:p>
+        </w:tc>
+        <w:tc>
+          <w:tcPr>
+            <w:tcW w:type="dxa" w:w="6192"/>
+          </w:tcPr>
+          <w:p>
+            <w:pPr>
+              <w:spacing w:after="20"/>
+            </w:pPr>
+            <w:r>
+              <w:rPr>
+                <w:b w:val="0"/>
+                <w:i w:val="0"/>
+                <w:sz w:val="18"/>
+              </w:rPr>
+              <w:t>Lewat lubang/sleeve dinding yang disegel, dengan drip loop (lengkungan turun) sebelum masuk</w:t>
+            </w:r>
+          </w:p>
+        </w:tc>
+        <w:tc>
+          <w:tcPr>
+            <w:tcW w:type="dxa" w:w="1440"/>
+            <w:shd w:val="clear" w:color="auto" w:fill="FFF3DC"/>
+          </w:tcPr>
+          <w:p>
+            <w:pPr>
+              <w:spacing w:after="20"/>
+            </w:pPr>
+            <w:r>
+              <w:rPr>
+                <w:b/>
+                <w:color w:val="8A6D1E"/>
+                <w:sz w:val="17"/>
+              </w:rPr>
+              <w:t>USULAN</w:t>
+            </w:r>
+          </w:p>
+        </w:tc>
+      </w:tr>
+      <w:tr>
+        <w:tc>
+          <w:tcPr>
+            <w:tcW w:type="dxa" w:w="2304"/>
+            <w:shd w:val="clear" w:color="auto" w:fill="FAFAF8"/>
+          </w:tcPr>
+          <w:p>
+            <w:pPr>
+              <w:spacing w:after="20"/>
+            </w:pPr>
+            <w:r>
+              <w:rPr>
+                <w:b w:val="0"/>
+                <w:i w:val="0"/>
+                <w:sz w:val="18"/>
+              </w:rPr>
+              <w:t>Kedap air</w:t>
+            </w:r>
+          </w:p>
+        </w:tc>
+        <w:tc>
+          <w:tcPr>
+            <w:tcW w:type="dxa" w:w="6192"/>
+            <w:shd w:val="clear" w:color="auto" w:fill="FAFAF8"/>
+          </w:tcPr>
+          <w:p>
+            <w:pPr>
+              <w:spacing w:after="20"/>
+            </w:pPr>
+            <w:r>
+              <w:rPr>
+                <w:b w:val="0"/>
+                <w:i w:val="0"/>
+                <w:sz w:val="18"/>
+              </w:rPr>
+              <w:t>Semua sambungan konektor di luar ruangan dibalut self-amalgamating tape</w:t>
+            </w:r>
+          </w:p>
+        </w:tc>
+        <w:tc>
+          <w:tcPr>
+            <w:tcW w:type="dxa" w:w="1440"/>
+            <w:shd w:val="clear" w:color="auto" w:fill="FFF3DC"/>
+          </w:tcPr>
+          <w:p>
+            <w:pPr>
+              <w:spacing w:after="20"/>
+            </w:pPr>
+            <w:r>
+              <w:rPr>
+                <w:b/>
+                <w:color w:val="8A6D1E"/>
+                <w:sz w:val="17"/>
+              </w:rPr>
+              <w:t>USULAN</w:t>
+            </w:r>
+          </w:p>
+        </w:tc>
+      </w:tr>
+      <w:tr>
+        <w:tc>
+          <w:tcPr>
+            <w:tcW w:type="dxa" w:w="2304"/>
+          </w:tcPr>
+          <w:p>
+            <w:pPr>
+              <w:spacing w:after="20"/>
+            </w:pPr>
+            <w:r>
+              <w:rPr>
+                <w:b w:val="0"/>
+                <w:i w:val="0"/>
+                <w:sz w:val="18"/>
+              </w:rPr>
+              <w:t>Radius tekuk</w:t>
+            </w:r>
+          </w:p>
+        </w:tc>
+        <w:tc>
+          <w:tcPr>
+            <w:tcW w:type="dxa" w:w="6192"/>
+          </w:tcPr>
+          <w:p>
+            <w:pPr>
+              <w:spacing w:after="20"/>
+            </w:pPr>
+            <w:r>
+              <w:rPr>
+                <w:b w:val="0"/>
+                <w:i w:val="0"/>
+                <w:sz w:val="18"/>
+              </w:rPr>
+              <w:t>Tidak ditekuk tajam (LMR-400: radius minimum ± 2,5 cm sekali tekuk, ± 10 cm untuk tekukan berulang)</w:t>
+            </w:r>
+          </w:p>
+        </w:tc>
+        <w:tc>
+          <w:tcPr>
+            <w:tcW w:type="dxa" w:w="1440"/>
+            <w:shd w:val="clear" w:color="auto" w:fill="FFF3DC"/>
+          </w:tcPr>
+          <w:p>
+            <w:pPr>
+              <w:spacing w:after="20"/>
+            </w:pPr>
+            <w:r>
+              <w:rPr>
+                <w:b/>
+                <w:color w:val="8A6D1E"/>
+                <w:sz w:val="17"/>
+              </w:rPr>
+              <w:t>USULAN</w:t>
+            </w:r>
+          </w:p>
+        </w:tc>
+      </w:tr>
+    </w:tbl>
+    <w:p>
+      <w:pPr>
+        <w:spacing w:after="40"/>
+      </w:pPr>
+    </w:p>
+    <w:p>
+      <w:pPr>
+        <w:spacing w:after="120"/>
+      </w:pPr>
+      <w:r>
+        <w:rPr>
+          <w:b w:val="0"/>
+          <w:i w:val="0"/>
+          <w:sz w:val="19"/>
+        </w:rPr>
+        <w:t>Redaman kabel pada 921 MHz (nilai katalog umum, belum termasuk ± 0,5 dB rugi konektor). Setiap 3 dB redaman memangkas setengah daya sinyal dari dan ke seluruh CH, jadi kabel harus pendek dan berkualitas:</w:t>
+      </w:r>
+    </w:p>
+    <w:tbl>
+      <w:tblPr>
+        <w:tblStyle w:val="TableGrid"/>
+        <w:tblW w:type="auto" w:w="0"/>
+        <w:tblLook w:firstColumn="1" w:firstRow="1" w:lastColumn="0" w:lastRow="0" w:noHBand="0" w:noVBand="1" w:val="04A0"/>
+        <w:tblLayout w:type="fixed"/>
+      </w:tblPr>
+      <w:tblGrid>
+        <w:gridCol w:w="2304"/>
+        <w:gridCol w:w="2520"/>
+        <w:gridCol w:w="2520"/>
+        <w:gridCol w:w="2592"/>
+      </w:tblGrid>
+      <w:tr>
+        <w:tc>
+          <w:tcPr>
+            <w:tcW w:type="dxa" w:w="2304"/>
+            <w:shd w:val="clear" w:color="auto" w:fill="1B2A4A"/>
+          </w:tcPr>
+          <w:p>
+            <w:pPr>
+              <w:spacing w:after="20"/>
+            </w:pPr>
+            <w:r>
+              <w:rPr>
+                <w:b/>
+                <w:color w:val="FFFFFF"/>
+                <w:sz w:val="18"/>
+              </w:rPr>
+              <w:t>Panjang kabel</w:t>
+            </w:r>
+          </w:p>
+        </w:tc>
+        <w:tc>
+          <w:tcPr>
+            <w:tcW w:type="dxa" w:w="2520"/>
+            <w:shd w:val="clear" w:color="auto" w:fill="1B2A4A"/>
+          </w:tcPr>
+          <w:p>
+            <w:pPr>
+              <w:spacing w:after="20"/>
+            </w:pPr>
+            <w:r>
+              <w:rPr>
+                <w:b/>
+                <w:color w:val="FFFFFF"/>
+                <w:sz w:val="18"/>
+              </w:rPr>
+              <w:t>LMR-240 (≈ 0,25 dB/m)</w:t>
+            </w:r>
+          </w:p>
+        </w:tc>
+        <w:tc>
+          <w:tcPr>
+            <w:tcW w:type="dxa" w:w="2520"/>
+            <w:shd w:val="clear" w:color="auto" w:fill="1B2A4A"/>
+          </w:tcPr>
+          <w:p>
+            <w:pPr>
+              <w:spacing w:after="20"/>
+            </w:pPr>
+            <w:r>
+              <w:rPr>
+                <w:b/>
+                <w:color w:val="FFFFFF"/>
+                <w:sz w:val="18"/>
+              </w:rPr>
+              <w:t>LMR-400 (≈ 0,13 dB/m)</w:t>
+            </w:r>
+          </w:p>
+        </w:tc>
+        <w:tc>
+          <w:tcPr>
+            <w:tcW w:type="dxa" w:w="2592"/>
+            <w:shd w:val="clear" w:color="auto" w:fill="1B2A4A"/>
+          </w:tcPr>
+          <w:p>
+            <w:pPr>
+              <w:spacing w:after="20"/>
+            </w:pPr>
+            <w:r>
+              <w:rPr>
+                <w:b/>
+                <w:color w:val="FFFFFF"/>
+                <w:sz w:val="18"/>
+              </w:rPr>
+              <w:t>LMR-600 (≈ 0,08 dB/m)</w:t>
+            </w:r>
+          </w:p>
+        </w:tc>
+      </w:tr>
+      <w:tr>
+        <w:tc>
+          <w:tcPr>
+            <w:tcW w:type="dxa" w:w="2304"/>
+          </w:tcPr>
+          <w:p>
+            <w:pPr>
+              <w:spacing w:after="20"/>
+            </w:pPr>
+            <w:r>
+              <w:rPr>
+                <w:b w:val="0"/>
+                <w:i w:val="0"/>
+                <w:sz w:val="18"/>
+              </w:rPr>
+              <w:t>5 m</w:t>
+            </w:r>
+          </w:p>
+        </w:tc>
+        <w:tc>
+          <w:tcPr>
+            <w:tcW w:type="dxa" w:w="2520"/>
+          </w:tcPr>
+          <w:p>
+            <w:pPr>
+              <w:spacing w:after="20"/>
+            </w:pPr>
+            <w:r>
+              <w:rPr>
+                <w:b w:val="0"/>
+                <w:i w:val="0"/>
+                <w:sz w:val="18"/>
+              </w:rPr>
+              <w:t>1,2 dB</w:t>
+            </w:r>
+          </w:p>
+        </w:tc>
+        <w:tc>
+          <w:tcPr>
+            <w:tcW w:type="dxa" w:w="2520"/>
+          </w:tcPr>
+          <w:p>
+            <w:pPr>
+              <w:spacing w:after="20"/>
+            </w:pPr>
+            <w:r>
+              <w:rPr>
+                <w:b w:val="0"/>
+                <w:i w:val="0"/>
+                <w:sz w:val="18"/>
+              </w:rPr>
+              <w:t>0,6 dB</w:t>
+            </w:r>
+          </w:p>
+        </w:tc>
+        <w:tc>
+          <w:tcPr>
+            <w:tcW w:type="dxa" w:w="2592"/>
+          </w:tcPr>
+          <w:p>
+            <w:pPr>
+              <w:spacing w:after="20"/>
+            </w:pPr>
+            <w:r>
+              <w:rPr>
+                <w:b w:val="0"/>
+                <w:i w:val="0"/>
+                <w:sz w:val="18"/>
+              </w:rPr>
+              <w:t>0,4 dB</w:t>
+            </w:r>
+          </w:p>
+        </w:tc>
+      </w:tr>
+      <w:tr>
+        <w:tc>
+          <w:tcPr>
+            <w:tcW w:type="dxa" w:w="2304"/>
+            <w:shd w:val="clear" w:color="auto" w:fill="FAFAF8"/>
+          </w:tcPr>
+          <w:p>
+            <w:pPr>
+              <w:spacing w:after="20"/>
+            </w:pPr>
+            <w:r>
+              <w:rPr>
+                <w:b w:val="0"/>
+                <w:i w:val="0"/>
+                <w:sz w:val="18"/>
+              </w:rPr>
+              <w:t>10 m</w:t>
+            </w:r>
+          </w:p>
+        </w:tc>
+        <w:tc>
+          <w:tcPr>
+            <w:tcW w:type="dxa" w:w="2520"/>
+            <w:shd w:val="clear" w:color="auto" w:fill="FAFAF8"/>
+          </w:tcPr>
+          <w:p>
+            <w:pPr>
+              <w:spacing w:after="20"/>
+            </w:pPr>
+            <w:r>
+              <w:rPr>
+                <w:b w:val="0"/>
+                <w:i w:val="0"/>
+                <w:sz w:val="18"/>
+              </w:rPr>
+              <w:t>2,5 dB</w:t>
+            </w:r>
+          </w:p>
+        </w:tc>
+        <w:tc>
+          <w:tcPr>
+            <w:tcW w:type="dxa" w:w="2520"/>
+            <w:shd w:val="clear" w:color="auto" w:fill="FAFAF8"/>
+          </w:tcPr>
+          <w:p>
+            <w:pPr>
+              <w:spacing w:after="20"/>
+            </w:pPr>
+            <w:r>
+              <w:rPr>
+                <w:b w:val="0"/>
+                <w:i w:val="0"/>
+                <w:sz w:val="18"/>
+              </w:rPr>
+              <w:t>1,3 dB</w:t>
+            </w:r>
+          </w:p>
+        </w:tc>
+        <w:tc>
+          <w:tcPr>
+            <w:tcW w:type="dxa" w:w="2592"/>
+            <w:shd w:val="clear" w:color="auto" w:fill="FAFAF8"/>
+          </w:tcPr>
+          <w:p>
+            <w:pPr>
+              <w:spacing w:after="20"/>
+            </w:pPr>
+            <w:r>
+              <w:rPr>
+                <w:b w:val="0"/>
+                <w:i w:val="0"/>
+                <w:sz w:val="18"/>
+              </w:rPr>
+              <w:t>0,8 dB</w:t>
+            </w:r>
+          </w:p>
+        </w:tc>
+      </w:tr>
+      <w:tr>
+        <w:tc>
+          <w:tcPr>
+            <w:tcW w:type="dxa" w:w="2304"/>
+          </w:tcPr>
+          <w:p>
+            <w:pPr>
+              <w:spacing w:after="20"/>
+            </w:pPr>
+            <w:r>
+              <w:rPr>
+                <w:b w:val="0"/>
+                <w:i w:val="0"/>
+                <w:sz w:val="18"/>
+              </w:rPr>
+              <w:t>15 m</w:t>
+            </w:r>
+          </w:p>
+        </w:tc>
+        <w:tc>
+          <w:tcPr>
+            <w:tcW w:type="dxa" w:w="2520"/>
+          </w:tcPr>
+          <w:p>
+            <w:pPr>
+              <w:spacing w:after="20"/>
+            </w:pPr>
+            <w:r>
+              <w:rPr>
+                <w:b w:val="0"/>
+                <w:i w:val="0"/>
+                <w:sz w:val="18"/>
+              </w:rPr>
+              <w:t>3,7 dB</w:t>
+            </w:r>
+          </w:p>
+        </w:tc>
+        <w:tc>
+          <w:tcPr>
+            <w:tcW w:type="dxa" w:w="2520"/>
+          </w:tcPr>
+          <w:p>
+            <w:pPr>
+              <w:spacing w:after="20"/>
+            </w:pPr>
+            <w:r>
+              <w:rPr>
+                <w:b w:val="0"/>
+                <w:i w:val="0"/>
+                <w:sz w:val="18"/>
+              </w:rPr>
+              <w:t>1,9 dB</w:t>
+            </w:r>
+          </w:p>
+        </w:tc>
+        <w:tc>
+          <w:tcPr>
+            <w:tcW w:type="dxa" w:w="2592"/>
+          </w:tcPr>
+          <w:p>
+            <w:pPr>
+              <w:spacing w:after="20"/>
+            </w:pPr>
+            <w:r>
+              <w:rPr>
+                <w:b w:val="0"/>
+                <w:i w:val="0"/>
+                <w:sz w:val="18"/>
+              </w:rPr>
+              <w:t>1,2 dB</w:t>
+            </w:r>
+          </w:p>
+        </w:tc>
+      </w:tr>
+      <w:tr>
+        <w:tc>
+          <w:tcPr>
+            <w:tcW w:type="dxa" w:w="2304"/>
+            <w:shd w:val="clear" w:color="auto" w:fill="FAFAF8"/>
+          </w:tcPr>
+          <w:p>
+            <w:pPr>
+              <w:spacing w:after="20"/>
+            </w:pPr>
+            <w:r>
+              <w:rPr>
+                <w:b w:val="0"/>
+                <w:i w:val="0"/>
+                <w:sz w:val="18"/>
+              </w:rPr>
+              <w:t>25 m</w:t>
+            </w:r>
+          </w:p>
+        </w:tc>
+        <w:tc>
+          <w:tcPr>
+            <w:tcW w:type="dxa" w:w="2520"/>
+            <w:shd w:val="clear" w:color="auto" w:fill="FAFAF8"/>
+          </w:tcPr>
+          <w:p>
+            <w:pPr>
+              <w:spacing w:after="20"/>
+            </w:pPr>
+            <w:r>
+              <w:rPr>
+                <w:b w:val="0"/>
+                <w:i w:val="0"/>
+                <w:sz w:val="18"/>
+              </w:rPr>
+              <w:t>6,2 dB</w:t>
+            </w:r>
+          </w:p>
+        </w:tc>
+        <w:tc>
+          <w:tcPr>
+            <w:tcW w:type="dxa" w:w="2520"/>
+            <w:shd w:val="clear" w:color="auto" w:fill="FAFAF8"/>
+          </w:tcPr>
+          <w:p>
+            <w:pPr>
+              <w:spacing w:after="20"/>
+            </w:pPr>
+            <w:r>
+              <w:rPr>
+                <w:b w:val="0"/>
+                <w:i w:val="0"/>
+                <w:sz w:val="18"/>
+              </w:rPr>
+              <w:t>3,2 dB</w:t>
+            </w:r>
+          </w:p>
+        </w:tc>
+        <w:tc>
+          <w:tcPr>
+            <w:tcW w:type="dxa" w:w="2592"/>
+            <w:shd w:val="clear" w:color="auto" w:fill="FAFAF8"/>
+          </w:tcPr>
+          <w:p>
+            <w:pPr>
+              <w:spacing w:after="20"/>
+            </w:pPr>
+            <w:r>
+              <w:rPr>
+                <w:b w:val="0"/>
+                <w:i w:val="0"/>
+                <w:sz w:val="18"/>
+              </w:rPr>
+              <w:t>2,1 dB</w:t>
+            </w:r>
+          </w:p>
+        </w:tc>
+      </w:tr>
+    </w:tbl>
+    <w:p>
+      <w:pPr>
+        <w:spacing w:after="40"/>
+      </w:pPr>
+    </w:p>
+    <w:p>
+      <w:pPr>
+        <w:spacing w:after="120"/>
+      </w:pPr>
+      <w:r>
+        <w:rPr>
+          <w:b/>
+          <w:i w:val="0"/>
+          <w:sz w:val="19"/>
+        </w:rPr>
+        <w:t>Rekomendasi:</w:t>
+      </w:r>
+      <w:r>
+        <w:rPr>
+          <w:b w:val="0"/>
+          <w:i w:val="0"/>
+          <w:sz w:val="19"/>
+        </w:rPr>
+        <w:t xml:space="preserve"> LMR-400 sampai 15 m. Bila rute lebih dari 20 m, pakai LMR-600 atau pindahkan Gateway ke ruangan yang lebih dekat dengan mast. Hindari kabel RG-58 (redaman ± 0,5 dB/m).</w:t>
+      </w:r>
     </w:p>
     <w:p>
       <w:pPr>
@@ -5851,7 +7478,7 @@
                 <w:i w:val="0"/>
                 <w:sz w:val="18"/>
               </w:rPr>
-              <w:t>250 × 250 mm, dibuat vendor sesuai gambar desain LGU</w:t>
+              <w:t>250 × 250 mm, dibuat pelaksana RU IV sesuai gambar desain LGU</w:t>
             </w:r>
           </w:p>
         </w:tc>
@@ -6168,7 +7795,7 @@
                 <w:i w:val="0"/>
                 <w:sz w:val="18"/>
               </w:rPr>
-              <w:t>Desain pelat U-bolt saat ini secara visual paling sesuai untuk pipa horizontal (handrail). Karena seluruh titik memakai tiang baru yang berdiri vertikal, kecocokan orientasi pelat pada tiang vertikal perlu dicek tim desain LGU bersama vendor sebelum pelat difabrikasi.</w:t>
+              <w:t>Desain pelat U-bolt saat ini secara visual paling sesuai untuk pipa horizontal (handrail). Karena seluruh titik memakai tiang baru yang berdiri vertikal, kecocokan orientasi pelat pada tiang vertikal perlu dicek tim desain LGU bersama pelaksana RU IV sebelum pelat difabrikasi.</w:t>
             </w:r>
           </w:p>
         </w:tc>
@@ -6212,8 +7839,8 @@
       </w:tblPr>
       <w:tblGrid>
         <w:gridCol w:w="576"/>
-        <w:gridCol w:w="2520"/>
-        <w:gridCol w:w="3744"/>
+        <w:gridCol w:w="2664"/>
+        <w:gridCol w:w="3600"/>
         <w:gridCol w:w="1655"/>
         <w:gridCol w:w="1440"/>
       </w:tblGrid>
@@ -6239,7 +7866,7 @@
         </w:tc>
         <w:tc>
           <w:tcPr>
-            <w:tcW w:type="dxa" w:w="2520"/>
+            <w:tcW w:type="dxa" w:w="2664"/>
             <w:shd w:val="clear" w:color="auto" w:fill="1B2A4A"/>
           </w:tcPr>
           <w:p>
@@ -6258,7 +7885,7 @@
         </w:tc>
         <w:tc>
           <w:tcPr>
-            <w:tcW w:type="dxa" w:w="3744"/>
+            <w:tcW w:type="dxa" w:w="3600"/>
             <w:shd w:val="clear" w:color="auto" w:fill="1B2A4A"/>
           </w:tcPr>
           <w:p>
@@ -6335,7 +7962,7 @@
         </w:tc>
         <w:tc>
           <w:tcPr>
-            <w:tcW w:type="dxa" w:w="2520"/>
+            <w:tcW w:type="dxa" w:w="2664"/>
           </w:tcPr>
           <w:p>
             <w:pPr>
@@ -6353,7 +7980,7 @@
         </w:tc>
         <w:tc>
           <w:tcPr>
-            <w:tcW w:type="dxa" w:w="3744"/>
+            <w:tcW w:type="dxa" w:w="3600"/>
           </w:tcPr>
           <w:p>
             <w:pPr>
@@ -6401,7 +8028,7 @@
                 <w:i w:val="0"/>
                 <w:sz w:val="18"/>
               </w:rPr>
-              <w:t>Vendor</w:t>
+              <w:t>RU IV</w:t>
             </w:r>
           </w:p>
         </w:tc>
@@ -6428,7 +8055,7 @@
         </w:tc>
         <w:tc>
           <w:tcPr>
-            <w:tcW w:type="dxa" w:w="2520"/>
+            <w:tcW w:type="dxa" w:w="2664"/>
             <w:shd w:val="clear" w:color="auto" w:fill="FAFAF8"/>
           </w:tcPr>
           <w:p>
@@ -6447,7 +8074,7 @@
         </w:tc>
         <w:tc>
           <w:tcPr>
-            <w:tcW w:type="dxa" w:w="3744"/>
+            <w:tcW w:type="dxa" w:w="3600"/>
             <w:shd w:val="clear" w:color="auto" w:fill="FAFAF8"/>
           </w:tcPr>
           <w:p>
@@ -6498,7 +8125,7 @@
                 <w:i w:val="0"/>
                 <w:sz w:val="18"/>
               </w:rPr>
-              <w:t>Vendor</w:t>
+              <w:t>RU IV</w:t>
             </w:r>
           </w:p>
         </w:tc>
@@ -6524,37 +8151,37 @@
         </w:tc>
         <w:tc>
           <w:tcPr>
-            <w:tcW w:type="dxa" w:w="2520"/>
-          </w:tcPr>
-          <w:p>
-            <w:pPr>
-              <w:spacing w:after="20"/>
-            </w:pPr>
-            <w:r>
-              <w:rPr>
-                <w:b w:val="0"/>
-                <w:i w:val="0"/>
-                <w:sz w:val="18"/>
-              </w:rPr>
-              <w:t>Pipe cap 2"</w:t>
-            </w:r>
-          </w:p>
-        </w:tc>
-        <w:tc>
-          <w:tcPr>
-            <w:tcW w:type="dxa" w:w="3744"/>
-          </w:tcPr>
-          <w:p>
-            <w:pPr>
-              <w:spacing w:after="20"/>
-            </w:pPr>
-            <w:r>
-              <w:rPr>
-                <w:b w:val="0"/>
-                <w:i w:val="0"/>
-                <w:sz w:val="18"/>
-              </w:rPr>
-              <w:t>Penutup ujung atas tiang</w:t>
+            <w:tcW w:type="dxa" w:w="2664"/>
+          </w:tcPr>
+          <w:p>
+            <w:pPr>
+              <w:spacing w:after="20"/>
+            </w:pPr>
+            <w:r>
+              <w:rPr>
+                <w:b w:val="0"/>
+                <w:i w:val="0"/>
+                <w:sz w:val="18"/>
+              </w:rPr>
+              <w:t>Pipa mast antena Gateway</w:t>
+            </w:r>
+          </w:p>
+        </w:tc>
+        <w:tc>
+          <w:tcPr>
+            <w:tcW w:type="dxa" w:w="3600"/>
+          </w:tcPr>
+          <w:p>
+            <w:pPr>
+              <w:spacing w:after="20"/>
+            </w:pPr>
+            <w:r>
+              <w:rPr>
+                <w:b w:val="0"/>
+                <w:i w:val="0"/>
+                <w:sz w:val="18"/>
+              </w:rPr>
+              <w:t>Galvanis 2" Sch40, 6,0 m (+ guy wire bila perlu)</w:t>
             </w:r>
           </w:p>
         </w:tc>
@@ -6572,7 +8199,7 @@
                 <w:i w:val="0"/>
                 <w:sz w:val="18"/>
               </w:rPr>
-              <w:t>9 buah</w:t>
+              <w:t>1 batang</w:t>
             </w:r>
           </w:p>
         </w:tc>
@@ -6590,7 +8217,7 @@
                 <w:i w:val="0"/>
                 <w:sz w:val="18"/>
               </w:rPr>
-              <w:t>Vendor</w:t>
+              <w:t>RU IV</w:t>
             </w:r>
           </w:p>
         </w:tc>
@@ -6617,7 +8244,7 @@
         </w:tc>
         <w:tc>
           <w:tcPr>
-            <w:tcW w:type="dxa" w:w="2520"/>
+            <w:tcW w:type="dxa" w:w="2664"/>
             <w:shd w:val="clear" w:color="auto" w:fill="FAFAF8"/>
           </w:tcPr>
           <w:p>
@@ -6630,13 +8257,13 @@
                 <w:i w:val="0"/>
                 <w:sz w:val="18"/>
               </w:rPr>
-              <w:t>Beton cor</w:t>
-            </w:r>
-          </w:p>
-        </w:tc>
-        <w:tc>
-          <w:tcPr>
-            <w:tcW w:type="dxa" w:w="3744"/>
+              <w:t>Pipe cap 2"</w:t>
+            </w:r>
+          </w:p>
+        </w:tc>
+        <w:tc>
+          <w:tcPr>
+            <w:tcW w:type="dxa" w:w="3600"/>
             <w:shd w:val="clear" w:color="auto" w:fill="FAFAF8"/>
           </w:tcPr>
           <w:p>
@@ -6649,7 +8276,7 @@
                 <w:i w:val="0"/>
                 <w:sz w:val="18"/>
               </w:rPr>
-              <w:t>GLD 3×0,13 m³ + CH 6×0,25 m³ ≈ 1.9 m³ (belum termasuk susut/sisa)</w:t>
+              <w:t>Penutup ujung atas tiang/mast</w:t>
             </w:r>
           </w:p>
         </w:tc>
@@ -6668,7 +8295,7 @@
                 <w:i w:val="0"/>
                 <w:sz w:val="18"/>
               </w:rPr>
-              <w:t>± 2 m³</w:t>
+              <w:t>10 buah</w:t>
             </w:r>
           </w:p>
         </w:tc>
@@ -6687,7 +8314,7 @@
                 <w:i w:val="0"/>
                 <w:sz w:val="18"/>
               </w:rPr>
-              <w:t>Vendor</w:t>
+              <w:t>RU IV</w:t>
             </w:r>
           </w:p>
         </w:tc>
@@ -6713,37 +8340,37 @@
         </w:tc>
         <w:tc>
           <w:tcPr>
-            <w:tcW w:type="dxa" w:w="2520"/>
-          </w:tcPr>
-          <w:p>
-            <w:pPr>
-              <w:spacing w:after="20"/>
-            </w:pPr>
-            <w:r>
-              <w:rPr>
-                <w:b w:val="0"/>
-                <w:i w:val="0"/>
-                <w:sz w:val="18"/>
-              </w:rPr>
-              <w:t>U-bolt 2" M10 + mur/ring</w:t>
-            </w:r>
-          </w:p>
-        </w:tc>
-        <w:tc>
-          <w:tcPr>
-            <w:tcW w:type="dxa" w:w="3744"/>
-          </w:tcPr>
-          <w:p>
-            <w:pPr>
-              <w:spacing w:after="20"/>
-            </w:pPr>
-            <w:r>
-              <w:rPr>
-                <w:b w:val="0"/>
-                <w:i w:val="0"/>
-                <w:sz w:val="18"/>
-              </w:rPr>
-              <w:t>Lihat §6</w:t>
+            <w:tcW w:type="dxa" w:w="2664"/>
+          </w:tcPr>
+          <w:p>
+            <w:pPr>
+              <w:spacing w:after="20"/>
+            </w:pPr>
+            <w:r>
+              <w:rPr>
+                <w:b w:val="0"/>
+                <w:i w:val="0"/>
+                <w:sz w:val="18"/>
+              </w:rPr>
+              <w:t>Beton cor</w:t>
+            </w:r>
+          </w:p>
+        </w:tc>
+        <w:tc>
+          <w:tcPr>
+            <w:tcW w:type="dxa" w:w="3600"/>
+          </w:tcPr>
+          <w:p>
+            <w:pPr>
+              <w:spacing w:after="20"/>
+            </w:pPr>
+            <w:r>
+              <w:rPr>
+                <w:b w:val="0"/>
+                <w:i w:val="0"/>
+                <w:sz w:val="18"/>
+              </w:rPr>
+              <w:t>GLD 3×0,13 + CH 6×0,25 + GW 1×0,30 m³ ≈ 2.2 m³ (belum termasuk susut/sisa)</w:t>
             </w:r>
           </w:p>
         </w:tc>
@@ -6761,7 +8388,7 @@
                 <w:i w:val="0"/>
                 <w:sz w:val="18"/>
               </w:rPr>
-              <w:t>18 U-bolt, 36 set mur</w:t>
+              <w:t>± 2,5 m³</w:t>
             </w:r>
           </w:p>
         </w:tc>
@@ -6779,7 +8406,7 @@
                 <w:i w:val="0"/>
                 <w:sz w:val="18"/>
               </w:rPr>
-              <w:t>Vendor</w:t>
+              <w:t>RU IV</w:t>
             </w:r>
           </w:p>
         </w:tc>
@@ -6806,7 +8433,7 @@
         </w:tc>
         <w:tc>
           <w:tcPr>
-            <w:tcW w:type="dxa" w:w="2520"/>
+            <w:tcW w:type="dxa" w:w="2664"/>
             <w:shd w:val="clear" w:color="auto" w:fill="FAFAF8"/>
           </w:tcPr>
           <w:p>
@@ -6819,13 +8446,13 @@
                 <w:i w:val="0"/>
                 <w:sz w:val="18"/>
               </w:rPr>
-              <w:t>Pelat mounting 250×250 mm</w:t>
-            </w:r>
-          </w:p>
-        </w:tc>
-        <w:tc>
-          <w:tcPr>
-            <w:tcW w:type="dxa" w:w="3744"/>
+              <w:t>U-bolt 2" M10 + mur/ring</w:t>
+            </w:r>
+          </w:p>
+        </w:tc>
+        <w:tc>
+          <w:tcPr>
+            <w:tcW w:type="dxa" w:w="3600"/>
             <w:shd w:val="clear" w:color="auto" w:fill="FAFAF8"/>
           </w:tcPr>
           <w:p>
@@ -6838,7 +8465,7 @@
                 <w:i w:val="0"/>
                 <w:sz w:val="18"/>
               </w:rPr>
-              <w:t>Sesuai gambar LGU</w:t>
+              <w:t>Lihat §6 (GLD &amp; CH)</w:t>
             </w:r>
           </w:p>
         </w:tc>
@@ -6857,7 +8484,7 @@
                 <w:i w:val="0"/>
                 <w:sz w:val="18"/>
               </w:rPr>
-              <w:t>9 buah</w:t>
+              <w:t>18 U-bolt, 36 set mur</w:t>
             </w:r>
           </w:p>
         </w:tc>
@@ -6876,7 +8503,7 @@
                 <w:i w:val="0"/>
                 <w:sz w:val="18"/>
               </w:rPr>
-              <w:t>Vendor</w:t>
+              <w:t>RU IV</w:t>
             </w:r>
           </w:p>
         </w:tc>
@@ -6902,37 +8529,37 @@
         </w:tc>
         <w:tc>
           <w:tcPr>
-            <w:tcW w:type="dxa" w:w="2520"/>
-          </w:tcPr>
-          <w:p>
-            <w:pPr>
-              <w:spacing w:after="20"/>
-            </w:pPr>
-            <w:r>
-              <w:rPr>
-                <w:b w:val="0"/>
-                <w:i w:val="0"/>
-                <w:sz w:val="18"/>
-              </w:rPr>
-              <w:t>Dudukan panel surya CH</w:t>
-            </w:r>
-          </w:p>
-        </w:tc>
-        <w:tc>
-          <w:tcPr>
-            <w:tcW w:type="dxa" w:w="3744"/>
-          </w:tcPr>
-          <w:p>
-            <w:pPr>
-              <w:spacing w:after="20"/>
-            </w:pPr>
-            <w:r>
-              <w:rPr>
-                <w:b w:val="0"/>
-                <w:i w:val="0"/>
-                <w:sz w:val="18"/>
-              </w:rPr>
-              <w:t>2 panel per CH</w:t>
+            <w:tcW w:type="dxa" w:w="2664"/>
+          </w:tcPr>
+          <w:p>
+            <w:pPr>
+              <w:spacing w:after="20"/>
+            </w:pPr>
+            <w:r>
+              <w:rPr>
+                <w:b w:val="0"/>
+                <w:i w:val="0"/>
+                <w:sz w:val="18"/>
+              </w:rPr>
+              <w:t>Pelat mounting 250×250 mm</w:t>
+            </w:r>
+          </w:p>
+        </w:tc>
+        <w:tc>
+          <w:tcPr>
+            <w:tcW w:type="dxa" w:w="3600"/>
+          </w:tcPr>
+          <w:p>
+            <w:pPr>
+              <w:spacing w:after="20"/>
+            </w:pPr>
+            <w:r>
+              <w:rPr>
+                <w:b w:val="0"/>
+                <w:i w:val="0"/>
+                <w:sz w:val="18"/>
+              </w:rPr>
+              <w:t>Sesuai gambar LGU</w:t>
             </w:r>
           </w:p>
         </w:tc>
@@ -6950,7 +8577,7 @@
                 <w:i w:val="0"/>
                 <w:sz w:val="18"/>
               </w:rPr>
-              <w:t>6 set</w:t>
+              <w:t>9 buah</w:t>
             </w:r>
           </w:p>
         </w:tc>
@@ -6968,7 +8595,7 @@
                 <w:i w:val="0"/>
                 <w:sz w:val="18"/>
               </w:rPr>
-              <w:t>Vendor (dimensi dari LGU)</w:t>
+              <w:t>RU IV</w:t>
             </w:r>
           </w:p>
         </w:tc>
@@ -6995,7 +8622,7 @@
         </w:tc>
         <w:tc>
           <w:tcPr>
-            <w:tcW w:type="dxa" w:w="2520"/>
+            <w:tcW w:type="dxa" w:w="2664"/>
             <w:shd w:val="clear" w:color="auto" w:fill="FAFAF8"/>
           </w:tcPr>
           <w:p>
@@ -7008,13 +8635,13 @@
                 <w:i w:val="0"/>
                 <w:sz w:val="18"/>
               </w:rPr>
-              <w:t>PSU 24 VDC</w:t>
-            </w:r>
-          </w:p>
-        </w:tc>
-        <w:tc>
-          <w:tcPr>
-            <w:tcW w:type="dxa" w:w="3744"/>
+              <w:t>Dudukan panel surya CH</w:t>
+            </w:r>
+          </w:p>
+        </w:tc>
+        <w:tc>
+          <w:tcPr>
+            <w:tcW w:type="dxa" w:w="3600"/>
             <w:shd w:val="clear" w:color="auto" w:fill="FAFAF8"/>
           </w:tcPr>
           <w:p>
@@ -7027,7 +8654,7 @@
                 <w:i w:val="0"/>
                 <w:sz w:val="18"/>
               </w:rPr>
-              <w:t>Opsi A: 3 × (≥1 A) · Opsi B: 1 × (≥5 A)</w:t>
+              <w:t>2 panel per CH</w:t>
             </w:r>
           </w:p>
         </w:tc>
@@ -7046,7 +8673,7 @@
                 <w:i w:val="0"/>
                 <w:sz w:val="18"/>
               </w:rPr>
-              <w:t>3 atau 1 unit</w:t>
+              <w:t>6 set</w:t>
             </w:r>
           </w:p>
         </w:tc>
@@ -7065,7 +8692,7 @@
                 <w:i w:val="0"/>
                 <w:sz w:val="18"/>
               </w:rPr>
-              <w:t>RU IV / vendor</w:t>
+              <w:t>RU IV (dimensi dari LGU)</w:t>
             </w:r>
           </w:p>
         </w:tc>
@@ -7091,37 +8718,37 @@
         </w:tc>
         <w:tc>
           <w:tcPr>
-            <w:tcW w:type="dxa" w:w="2520"/>
-          </w:tcPr>
-          <w:p>
-            <w:pPr>
-              <w:spacing w:after="20"/>
-            </w:pPr>
-            <w:r>
-              <w:rPr>
-                <w:b w:val="0"/>
-                <w:i w:val="0"/>
-                <w:sz w:val="18"/>
-              </w:rPr>
-              <w:t>Box/panel PSU + MCB + terminal</w:t>
-            </w:r>
-          </w:p>
-        </w:tc>
-        <w:tc>
-          <w:tcPr>
-            <w:tcW w:type="dxa" w:w="3744"/>
-          </w:tcPr>
-          <w:p>
-            <w:pPr>
-              <w:spacing w:after="20"/>
-            </w:pPr>
-            <w:r>
-              <w:rPr>
-                <w:b w:val="0"/>
-                <w:i w:val="0"/>
-                <w:sz w:val="18"/>
-              </w:rPr>
-              <w:t>Untuk area aman</w:t>
+            <w:tcW w:type="dxa" w:w="2664"/>
+          </w:tcPr>
+          <w:p>
+            <w:pPr>
+              <w:spacing w:after="20"/>
+            </w:pPr>
+            <w:r>
+              <w:rPr>
+                <w:b w:val="0"/>
+                <w:i w:val="0"/>
+                <w:sz w:val="18"/>
+              </w:rPr>
+              <w:t>PSU 24 VDC</w:t>
+            </w:r>
+          </w:p>
+        </w:tc>
+        <w:tc>
+          <w:tcPr>
+            <w:tcW w:type="dxa" w:w="3600"/>
+          </w:tcPr>
+          <w:p>
+            <w:pPr>
+              <w:spacing w:after="20"/>
+            </w:pPr>
+            <w:r>
+              <w:rPr>
+                <w:b w:val="0"/>
+                <w:i w:val="0"/>
+                <w:sz w:val="18"/>
+              </w:rPr>
+              <w:t>Opsi A: 3 × (≥1 A) · Opsi B: 1 × (≥5 A)</w:t>
             </w:r>
           </w:p>
         </w:tc>
@@ -7139,7 +8766,7 @@
                 <w:i w:val="0"/>
                 <w:sz w:val="18"/>
               </w:rPr>
-              <w:t>3 atau 1 set</w:t>
+              <w:t>3 atau 1 unit</w:t>
             </w:r>
           </w:p>
         </w:tc>
@@ -7157,7 +8784,7 @@
                 <w:i w:val="0"/>
                 <w:sz w:val="18"/>
               </w:rPr>
-              <w:t>RU IV / vendor</w:t>
+              <w:t>RU IV</w:t>
             </w:r>
           </w:p>
         </w:tc>
@@ -7184,7 +8811,7 @@
         </w:tc>
         <w:tc>
           <w:tcPr>
-            <w:tcW w:type="dxa" w:w="2520"/>
+            <w:tcW w:type="dxa" w:w="2664"/>
             <w:shd w:val="clear" w:color="auto" w:fill="FAFAF8"/>
           </w:tcPr>
           <w:p>
@@ -7197,13 +8824,13 @@
                 <w:i w:val="0"/>
                 <w:sz w:val="18"/>
               </w:rPr>
-              <w:t>Kabel daya 2 inti</w:t>
-            </w:r>
-          </w:p>
-        </w:tc>
-        <w:tc>
-          <w:tcPr>
-            <w:tcW w:type="dxa" w:w="3744"/>
+              <w:t>Box/panel PSU + MCB + terminal</w:t>
+            </w:r>
+          </w:p>
+        </w:tc>
+        <w:tc>
+          <w:tcPr>
+            <w:tcW w:type="dxa" w:w="3600"/>
             <w:shd w:val="clear" w:color="auto" w:fill="FAFAF8"/>
           </w:tcPr>
           <w:p>
@@ -7216,7 +8843,7 @@
                 <w:i w:val="0"/>
                 <w:sz w:val="18"/>
               </w:rPr>
-              <w:t>Ukuran &amp; panjang per §4</w:t>
+              <w:t>Untuk area aman</w:t>
             </w:r>
           </w:p>
         </w:tc>
@@ -7235,7 +8862,7 @@
                 <w:i w:val="0"/>
                 <w:sz w:val="18"/>
               </w:rPr>
-              <w:t>Σ per §4.4</w:t>
+              <w:t>3 atau 1 set</w:t>
             </w:r>
           </w:p>
         </w:tc>
@@ -7254,7 +8881,7 @@
                 <w:i w:val="0"/>
                 <w:sz w:val="18"/>
               </w:rPr>
-              <w:t>RU IV / vendor</w:t>
+              <w:t>RU IV</w:t>
             </w:r>
           </w:p>
         </w:tc>
@@ -7280,37 +8907,37 @@
         </w:tc>
         <w:tc>
           <w:tcPr>
-            <w:tcW w:type="dxa" w:w="2520"/>
-          </w:tcPr>
-          <w:p>
-            <w:pPr>
-              <w:spacing w:after="20"/>
-            </w:pPr>
-            <w:r>
-              <w:rPr>
-                <w:b w:val="0"/>
-                <w:i w:val="0"/>
-                <w:sz w:val="18"/>
-              </w:rPr>
-              <w:t>Kabel grounding + klem</w:t>
-            </w:r>
-          </w:p>
-        </w:tc>
-        <w:tc>
-          <w:tcPr>
-            <w:tcW w:type="dxa" w:w="3744"/>
-          </w:tcPr>
-          <w:p>
-            <w:pPr>
-              <w:spacing w:after="20"/>
-            </w:pPr>
-            <w:r>
-              <w:rPr>
-                <w:b w:val="0"/>
-                <w:i w:val="0"/>
-                <w:sz w:val="18"/>
-              </w:rPr>
-              <w:t>Mengikuti standar RU IV</w:t>
+            <w:tcW w:type="dxa" w:w="2664"/>
+          </w:tcPr>
+          <w:p>
+            <w:pPr>
+              <w:spacing w:after="20"/>
+            </w:pPr>
+            <w:r>
+              <w:rPr>
+                <w:b w:val="0"/>
+                <w:i w:val="0"/>
+                <w:sz w:val="18"/>
+              </w:rPr>
+              <w:t>Kabel daya 2 inti</w:t>
+            </w:r>
+          </w:p>
+        </w:tc>
+        <w:tc>
+          <w:tcPr>
+            <w:tcW w:type="dxa" w:w="3600"/>
+          </w:tcPr>
+          <w:p>
+            <w:pPr>
+              <w:spacing w:after="20"/>
+            </w:pPr>
+            <w:r>
+              <w:rPr>
+                <w:b w:val="0"/>
+                <w:i w:val="0"/>
+                <w:sz w:val="18"/>
+              </w:rPr>
+              <w:t>Ukuran &amp; panjang per §4</w:t>
             </w:r>
           </w:p>
         </w:tc>
@@ -7328,7 +8955,7 @@
                 <w:i w:val="0"/>
                 <w:sz w:val="18"/>
               </w:rPr>
-              <w:t>10 titik</w:t>
+              <w:t>Σ per §4.4</w:t>
             </w:r>
           </w:p>
         </w:tc>
@@ -7346,7 +8973,7 @@
                 <w:i w:val="0"/>
                 <w:sz w:val="18"/>
               </w:rPr>
-              <w:t>Vendor</w:t>
+              <w:t>RU IV</w:t>
             </w:r>
           </w:p>
         </w:tc>
@@ -7373,7 +9000,7 @@
         </w:tc>
         <w:tc>
           <w:tcPr>
-            <w:tcW w:type="dxa" w:w="2520"/>
+            <w:tcW w:type="dxa" w:w="2664"/>
             <w:shd w:val="clear" w:color="auto" w:fill="FAFAF8"/>
           </w:tcPr>
           <w:p>
@@ -7386,13 +9013,13 @@
                 <w:i w:val="0"/>
                 <w:sz w:val="18"/>
               </w:rPr>
-              <w:t>PC server + UPS + stop kontak</w:t>
-            </w:r>
-          </w:p>
-        </w:tc>
-        <w:tc>
-          <w:tcPr>
-            <w:tcW w:type="dxa" w:w="3744"/>
+              <w:t>Kabel koaksial LMR-400 + konektor N</w:t>
+            </w:r>
+          </w:p>
+        </w:tc>
+        <w:tc>
+          <w:tcPr>
+            <w:tcW w:type="dxa" w:w="3600"/>
             <w:shd w:val="clear" w:color="auto" w:fill="FAFAF8"/>
           </w:tcPr>
           <w:p>
@@ -7405,7 +9032,7 @@
                 <w:i w:val="0"/>
                 <w:sz w:val="18"/>
               </w:rPr>
-              <w:t>Lihat §5</w:t>
+              <w:t>Antena GW → Gateway, ≤ 15 m (§5.2)</w:t>
             </w:r>
           </w:p>
         </w:tc>
@@ -7424,7 +9051,7 @@
                 <w:i w:val="0"/>
                 <w:sz w:val="18"/>
               </w:rPr>
-              <w:t>1 set</w:t>
+              <w:t>1 jalur</w:t>
             </w:r>
           </w:p>
         </w:tc>
@@ -7443,7 +9070,7 @@
                 <w:i w:val="0"/>
                 <w:sz w:val="18"/>
               </w:rPr>
-              <w:t>Pertamina</w:t>
+              <w:t>RU IV</w:t>
             </w:r>
           </w:p>
         </w:tc>
@@ -7469,37 +9096,37 @@
         </w:tc>
         <w:tc>
           <w:tcPr>
-            <w:tcW w:type="dxa" w:w="2520"/>
-          </w:tcPr>
-          <w:p>
-            <w:pPr>
-              <w:spacing w:after="20"/>
-            </w:pPr>
-            <w:r>
-              <w:rPr>
-                <w:b w:val="0"/>
-                <w:i w:val="0"/>
-                <w:sz w:val="18"/>
-              </w:rPr>
-              <w:t>Kabel Cat6</w:t>
-            </w:r>
-          </w:p>
-        </w:tc>
-        <w:tc>
-          <w:tcPr>
-            <w:tcW w:type="dxa" w:w="3744"/>
-          </w:tcPr>
-          <w:p>
-            <w:pPr>
-              <w:spacing w:after="20"/>
-            </w:pPr>
-            <w:r>
-              <w:rPr>
-                <w:b w:val="0"/>
-                <w:i w:val="0"/>
-                <w:sz w:val="18"/>
-              </w:rPr>
-              <w:t>Patch + jalur ke intranet kantor</w:t>
+            <w:tcW w:type="dxa" w:w="2664"/>
+          </w:tcPr>
+          <w:p>
+            <w:pPr>
+              <w:spacing w:after="20"/>
+            </w:pPr>
+            <w:r>
+              <w:rPr>
+                <w:b w:val="0"/>
+                <w:i w:val="0"/>
+                <w:sz w:val="18"/>
+              </w:rPr>
+              <w:t>Penangkal petir koaksial</w:t>
+            </w:r>
+          </w:p>
+        </w:tc>
+        <w:tc>
+          <w:tcPr>
+            <w:tcW w:type="dxa" w:w="3600"/>
+          </w:tcPr>
+          <w:p>
+            <w:pPr>
+              <w:spacing w:after="20"/>
+            </w:pPr>
+            <w:r>
+              <w:rPr>
+                <w:b w:val="0"/>
+                <w:i w:val="0"/>
+                <w:sz w:val="18"/>
+              </w:rPr>
+              <w:t>50 Ω, 900 MHz, konektor N (§5.2)</w:t>
             </w:r>
           </w:p>
         </w:tc>
@@ -7517,7 +9144,7 @@
                 <w:i w:val="0"/>
                 <w:sz w:val="18"/>
               </w:rPr>
-              <w:t>2 jalur</w:t>
+              <w:t>1 buah</w:t>
             </w:r>
           </w:p>
         </w:tc>
@@ -7535,7 +9162,7 @@
                 <w:i w:val="0"/>
                 <w:sz w:val="18"/>
               </w:rPr>
-              <w:t>LGU / IT RU IV</w:t>
+              <w:t>RU IV</w:t>
             </w:r>
           </w:p>
         </w:tc>
@@ -7562,7 +9189,7 @@
         </w:tc>
         <w:tc>
           <w:tcPr>
-            <w:tcW w:type="dxa" w:w="2520"/>
+            <w:tcW w:type="dxa" w:w="2664"/>
             <w:shd w:val="clear" w:color="auto" w:fill="FAFAF8"/>
           </w:tcPr>
           <w:p>
@@ -7575,13 +9202,13 @@
                 <w:i w:val="0"/>
                 <w:sz w:val="18"/>
               </w:rPr>
-              <w:t>Router lapangan</w:t>
-            </w:r>
-          </w:p>
-        </w:tc>
-        <w:tc>
-          <w:tcPr>
-            <w:tcW w:type="dxa" w:w="3744"/>
+              <w:t>Kabel grounding + klem</w:t>
+            </w:r>
+          </w:p>
+        </w:tc>
+        <w:tc>
+          <w:tcPr>
+            <w:tcW w:type="dxa" w:w="3600"/>
             <w:shd w:val="clear" w:color="auto" w:fill="FAFAF8"/>
           </w:tcPr>
           <w:p>
@@ -7594,7 +9221,7 @@
                 <w:i w:val="0"/>
                 <w:sz w:val="18"/>
               </w:rPr>
-              <w:t>Lihat §5</w:t>
+              <w:t>Mengikuti standar RU IV (tiang, mast, penangkal petir)</w:t>
             </w:r>
           </w:p>
         </w:tc>
@@ -7613,7 +9240,7 @@
                 <w:i w:val="0"/>
                 <w:sz w:val="18"/>
               </w:rPr>
-              <w:t>1 unit</w:t>
+              <w:t>10 titik + 1</w:t>
             </w:r>
           </w:p>
         </w:tc>
@@ -7632,7 +9259,7 @@
                 <w:i w:val="0"/>
                 <w:sz w:val="18"/>
               </w:rPr>
-              <w:t>LGU</w:t>
+              <w:t>RU IV</w:t>
             </w:r>
           </w:p>
         </w:tc>
@@ -7658,25 +9285,309 @@
         </w:tc>
         <w:tc>
           <w:tcPr>
-            <w:tcW w:type="dxa" w:w="2520"/>
-          </w:tcPr>
-          <w:p>
-            <w:pPr>
-              <w:spacing w:after="20"/>
-            </w:pPr>
-            <w:r>
-              <w:rPr>
-                <w:b w:val="0"/>
-                <w:i w:val="0"/>
-                <w:sz w:val="18"/>
-              </w:rPr>
-              <w:t>Unit GLD, CH, Gateway, panel surya CH</w:t>
-            </w:r>
-          </w:p>
-        </w:tc>
-        <w:tc>
-          <w:tcPr>
-            <w:tcW w:type="dxa" w:w="3744"/>
+            <w:tcW w:type="dxa" w:w="2664"/>
+          </w:tcPr>
+          <w:p>
+            <w:pPr>
+              <w:spacing w:after="20"/>
+            </w:pPr>
+            <w:r>
+              <w:rPr>
+                <w:b w:val="0"/>
+                <w:i w:val="0"/>
+                <w:sz w:val="18"/>
+              </w:rPr>
+              <w:t>PC server + UPS</w:t>
+            </w:r>
+          </w:p>
+        </w:tc>
+        <w:tc>
+          <w:tcPr>
+            <w:tcW w:type="dxa" w:w="3600"/>
+          </w:tcPr>
+          <w:p>
+            <w:pPr>
+              <w:spacing w:after="20"/>
+            </w:pPr>
+            <w:r>
+              <w:rPr>
+                <w:b w:val="0"/>
+                <w:i w:val="0"/>
+                <w:sz w:val="18"/>
+              </w:rPr>
+              <w:t>Lihat §5.1</w:t>
+            </w:r>
+          </w:p>
+        </w:tc>
+        <w:tc>
+          <w:tcPr>
+            <w:tcW w:type="dxa" w:w="1656"/>
+          </w:tcPr>
+          <w:p>
+            <w:pPr>
+              <w:spacing w:after="20"/>
+            </w:pPr>
+            <w:r>
+              <w:rPr>
+                <w:b w:val="0"/>
+                <w:i w:val="0"/>
+                <w:sz w:val="18"/>
+              </w:rPr>
+              <w:t>1 set</w:t>
+            </w:r>
+          </w:p>
+        </w:tc>
+        <w:tc>
+          <w:tcPr>
+            <w:tcW w:type="dxa" w:w="1440"/>
+          </w:tcPr>
+          <w:p>
+            <w:pPr>
+              <w:spacing w:after="20"/>
+            </w:pPr>
+            <w:r>
+              <w:rPr>
+                <w:b w:val="0"/>
+                <w:i w:val="0"/>
+                <w:sz w:val="18"/>
+              </w:rPr>
+              <w:t>Pertamina</w:t>
+            </w:r>
+          </w:p>
+        </w:tc>
+      </w:tr>
+      <w:tr>
+        <w:tc>
+          <w:tcPr>
+            <w:tcW w:type="dxa" w:w="576"/>
+            <w:shd w:val="clear" w:color="auto" w:fill="FAFAF8"/>
+          </w:tcPr>
+          <w:p>
+            <w:pPr>
+              <w:spacing w:after="20"/>
+            </w:pPr>
+            <w:r>
+              <w:rPr>
+                <w:b w:val="0"/>
+                <w:i w:val="0"/>
+                <w:sz w:val="18"/>
+              </w:rPr>
+              <w:t>16</w:t>
+            </w:r>
+          </w:p>
+        </w:tc>
+        <w:tc>
+          <w:tcPr>
+            <w:tcW w:type="dxa" w:w="2664"/>
+            <w:shd w:val="clear" w:color="auto" w:fill="FAFAF8"/>
+          </w:tcPr>
+          <w:p>
+            <w:pPr>
+              <w:spacing w:after="20"/>
+            </w:pPr>
+            <w:r>
+              <w:rPr>
+                <w:b w:val="0"/>
+                <w:i w:val="0"/>
+                <w:sz w:val="18"/>
+              </w:rPr>
+              <w:t>Kabel Cat6</w:t>
+            </w:r>
+          </w:p>
+        </w:tc>
+        <w:tc>
+          <w:tcPr>
+            <w:tcW w:type="dxa" w:w="3600"/>
+            <w:shd w:val="clear" w:color="auto" w:fill="FAFAF8"/>
+          </w:tcPr>
+          <w:p>
+            <w:pPr>
+              <w:spacing w:after="20"/>
+            </w:pPr>
+            <w:r>
+              <w:rPr>
+                <w:b w:val="0"/>
+                <w:i w:val="0"/>
+                <w:sz w:val="18"/>
+              </w:rPr>
+              <w:t>Router ↔ PC server, PC ↔ intranet kantor</w:t>
+            </w:r>
+          </w:p>
+        </w:tc>
+        <w:tc>
+          <w:tcPr>
+            <w:tcW w:type="dxa" w:w="1656"/>
+            <w:shd w:val="clear" w:color="auto" w:fill="FAFAF8"/>
+          </w:tcPr>
+          <w:p>
+            <w:pPr>
+              <w:spacing w:after="20"/>
+            </w:pPr>
+            <w:r>
+              <w:rPr>
+                <w:b w:val="0"/>
+                <w:i w:val="0"/>
+                <w:sz w:val="18"/>
+              </w:rPr>
+              <w:t>2 jalur</w:t>
+            </w:r>
+          </w:p>
+        </w:tc>
+        <w:tc>
+          <w:tcPr>
+            <w:tcW w:type="dxa" w:w="1440"/>
+            <w:shd w:val="clear" w:color="auto" w:fill="FAFAF8"/>
+          </w:tcPr>
+          <w:p>
+            <w:pPr>
+              <w:spacing w:after="20"/>
+            </w:pPr>
+            <w:r>
+              <w:rPr>
+                <w:b w:val="0"/>
+                <w:i w:val="0"/>
+                <w:sz w:val="18"/>
+              </w:rPr>
+              <w:t>RU IV / IT RU IV</w:t>
+            </w:r>
+          </w:p>
+        </w:tc>
+      </w:tr>
+      <w:tr>
+        <w:tc>
+          <w:tcPr>
+            <w:tcW w:type="dxa" w:w="576"/>
+          </w:tcPr>
+          <w:p>
+            <w:pPr>
+              <w:spacing w:after="20"/>
+            </w:pPr>
+            <w:r>
+              <w:rPr>
+                <w:b w:val="0"/>
+                <w:i w:val="0"/>
+                <w:sz w:val="18"/>
+              </w:rPr>
+              <w:t>17</w:t>
+            </w:r>
+          </w:p>
+        </w:tc>
+        <w:tc>
+          <w:tcPr>
+            <w:tcW w:type="dxa" w:w="2664"/>
+          </w:tcPr>
+          <w:p>
+            <w:pPr>
+              <w:spacing w:after="20"/>
+            </w:pPr>
+            <w:r>
+              <w:rPr>
+                <w:b w:val="0"/>
+                <w:i w:val="0"/>
+                <w:sz w:val="18"/>
+              </w:rPr>
+              <w:t>Router lapangan</w:t>
+            </w:r>
+          </w:p>
+        </w:tc>
+        <w:tc>
+          <w:tcPr>
+            <w:tcW w:type="dxa" w:w="3600"/>
+          </w:tcPr>
+          <w:p>
+            <w:pPr>
+              <w:spacing w:after="20"/>
+            </w:pPr>
+            <w:r>
+              <w:rPr>
+                <w:b w:val="0"/>
+                <w:i w:val="0"/>
+                <w:sz w:val="18"/>
+              </w:rPr>
+              <w:t>Lihat §5.1</w:t>
+            </w:r>
+          </w:p>
+        </w:tc>
+        <w:tc>
+          <w:tcPr>
+            <w:tcW w:type="dxa" w:w="1656"/>
+          </w:tcPr>
+          <w:p>
+            <w:pPr>
+              <w:spacing w:after="20"/>
+            </w:pPr>
+            <w:r>
+              <w:rPr>
+                <w:b w:val="0"/>
+                <w:i w:val="0"/>
+                <w:sz w:val="18"/>
+              </w:rPr>
+              <w:t>1 unit</w:t>
+            </w:r>
+          </w:p>
+        </w:tc>
+        <w:tc>
+          <w:tcPr>
+            <w:tcW w:type="dxa" w:w="1440"/>
+          </w:tcPr>
+          <w:p>
+            <w:pPr>
+              <w:spacing w:after="20"/>
+            </w:pPr>
+            <w:r>
+              <w:rPr>
+                <w:b w:val="0"/>
+                <w:i w:val="0"/>
+                <w:sz w:val="18"/>
+              </w:rPr>
+              <w:t>LGU</w:t>
+            </w:r>
+          </w:p>
+        </w:tc>
+      </w:tr>
+      <w:tr>
+        <w:tc>
+          <w:tcPr>
+            <w:tcW w:type="dxa" w:w="576"/>
+            <w:shd w:val="clear" w:color="auto" w:fill="FAFAF8"/>
+          </w:tcPr>
+          <w:p>
+            <w:pPr>
+              <w:spacing w:after="20"/>
+            </w:pPr>
+            <w:r>
+              <w:rPr>
+                <w:b w:val="0"/>
+                <w:i w:val="0"/>
+                <w:sz w:val="18"/>
+              </w:rPr>
+              <w:t>18</w:t>
+            </w:r>
+          </w:p>
+        </w:tc>
+        <w:tc>
+          <w:tcPr>
+            <w:tcW w:type="dxa" w:w="2664"/>
+            <w:shd w:val="clear" w:color="auto" w:fill="FAFAF8"/>
+          </w:tcPr>
+          <w:p>
+            <w:pPr>
+              <w:spacing w:after="20"/>
+            </w:pPr>
+            <w:r>
+              <w:rPr>
+                <w:b w:val="0"/>
+                <w:i w:val="0"/>
+                <w:sz w:val="18"/>
+              </w:rPr>
+              <w:t>Unit GLD, CH, Gateway + antena, panel surya CH</w:t>
+            </w:r>
+          </w:p>
+        </w:tc>
+        <w:tc>
+          <w:tcPr>
+            <w:tcW w:type="dxa" w:w="3600"/>
+            <w:shd w:val="clear" w:color="auto" w:fill="FAFAF8"/>
           </w:tcPr>
           <w:p>
             <w:pPr>
@@ -7695,6 +9606,7 @@
         <w:tc>
           <w:tcPr>
             <w:tcW w:type="dxa" w:w="1656"/>
+            <w:shd w:val="clear" w:color="auto" w:fill="FAFAF8"/>
           </w:tcPr>
           <w:p>
             <w:pPr>
@@ -7713,6 +9625,7 @@
         <w:tc>
           <w:tcPr>
             <w:tcW w:type="dxa" w:w="1440"/>
+            <w:shd w:val="clear" w:color="auto" w:fill="FAFAF8"/>
           </w:tcPr>
           <w:p>
             <w:pPr>
@@ -7793,7 +9706,7 @@
                 <w:color w:val="FFFFFF"/>
                 <w:sz w:val="18"/>
               </w:rPr>
-              <w:t>Pertanyaan untuk RU IV / vendor</w:t>
+              <w:t>Pertanyaan untuk RU IV</w:t>
             </w:r>
           </w:p>
         </w:tc>
@@ -8023,7 +9936,7 @@
                 <w:i w:val="0"/>
                 <w:sz w:val="18"/>
               </w:rPr>
-              <w:t>Standar &amp; titik grounding, serta perlu tidaknya proteksi petir untuk tiang CH</w:t>
+              <w:t>Standar &amp; titik grounding, serta perlu tidaknya proteksi petir untuk tiang CH dan mast Gateway</w:t>
             </w:r>
           </w:p>
         </w:tc>
@@ -8098,7 +10011,7 @@
                 <w:i w:val="0"/>
                 <w:sz w:val="18"/>
               </w:rPr>
-              <w:t>Jadwal mobilisasi vendor</w:t>
+              <w:t>Jadwal mulai pekerjaan sipil</w:t>
             </w:r>
           </w:p>
         </w:tc>
@@ -8138,7 +10051,7 @@
                 <w:i w:val="0"/>
                 <w:sz w:val="18"/>
               </w:rPr>
-              <w:t>Lokasi ruangan PC server/Gateway, ketersediaan 220 VAC, UPS, dan titik jaringan intranet kantor</w:t>
+              <w:t>Ruang Gateway &amp; ruang server lokal: lokasi, jarak antar-ruang, 220 VAC, UPS, titik intranet kantor</w:t>
             </w:r>
           </w:p>
         </w:tc>
@@ -8157,7 +10070,7 @@
                 <w:i w:val="0"/>
                 <w:sz w:val="18"/>
               </w:rPr>
-              <w:t>Penempatan Gateway &amp; kabel LAN</w:t>
+              <w:t>Panjang Cat6 &amp; penempatan router</w:t>
             </w:r>
           </w:p>
         </w:tc>
@@ -8195,13 +10108,72 @@
                 <w:i w:val="0"/>
                 <w:sz w:val="18"/>
               </w:rPr>
-              <w:t>Vendor yang ditunjuk &amp; jadwal fabrikasi/pemasangan</w:t>
+              <w:t>Lokasi mast antena Gateway (berdiri sendiri vs di dinding/atap) &amp; jarak rute koaksial ke ruang Gateway</w:t>
             </w:r>
           </w:p>
         </w:tc>
         <w:tc>
           <w:tcPr>
             <w:tcW w:type="dxa" w:w="3600"/>
+          </w:tcPr>
+          <w:p>
+            <w:pPr>
+              <w:spacing w:after="20"/>
+            </w:pPr>
+            <w:r>
+              <w:rPr>
+                <w:b w:val="0"/>
+                <w:i w:val="0"/>
+                <w:sz w:val="18"/>
+              </w:rPr>
+              <w:t>Panjang &amp; tipe kabel koaksial</w:t>
+            </w:r>
+          </w:p>
+        </w:tc>
+      </w:tr>
+      <w:tr>
+        <w:tc>
+          <w:tcPr>
+            <w:tcW w:type="dxa" w:w="576"/>
+            <w:shd w:val="clear" w:color="auto" w:fill="FAFAF8"/>
+          </w:tcPr>
+          <w:p>
+            <w:pPr>
+              <w:spacing w:after="20"/>
+            </w:pPr>
+            <w:r>
+              <w:rPr>
+                <w:b w:val="0"/>
+                <w:i w:val="0"/>
+                <w:sz w:val="18"/>
+              </w:rPr>
+              <w:t>8</w:t>
+            </w:r>
+          </w:p>
+        </w:tc>
+        <w:tc>
+          <w:tcPr>
+            <w:tcW w:type="dxa" w:w="5760"/>
+            <w:shd w:val="clear" w:color="auto" w:fill="FAFAF8"/>
+          </w:tcPr>
+          <w:p>
+            <w:pPr>
+              <w:spacing w:after="20"/>
+            </w:pPr>
+            <w:r>
+              <w:rPr>
+                <w:b w:val="0"/>
+                <w:i w:val="0"/>
+                <w:sz w:val="18"/>
+              </w:rPr>
+              <w:t>Tim/kontraktor pelaksana RU IV &amp; jadwal fabrikasi/pemasangan</w:t>
+            </w:r>
+          </w:p>
+        </w:tc>
+        <w:tc>
+          <w:tcPr>
+            <w:tcW w:type="dxa" w:w="3600"/>
+            <w:shd w:val="clear" w:color="auto" w:fill="FAFAF8"/>
           </w:tcPr>
           <w:p>
             <w:pPr>
@@ -8246,7 +10218,7 @@
           <w:i w:val="0"/>
           <w:sz w:val="19"/>
         </w:rPr>
-        <w:t>Angka berstatus USULAN berasal dari praktik umum industri, bukan dari kajian struktur/elektrikal formal. Vendor dan RU IV dapat menyesuaikan dengan standar yang berlaku di kilang.</w:t>
+        <w:t>Angka berstatus USULAN berasal dari praktik umum industri, bukan dari kajian struktur/elektrikal formal. RU IV dapat menyesuaikan dengan standar yang berlaku di kilang.</w:t>
       </w:r>
     </w:p>
     <w:p>
@@ -8260,7 +10232,7 @@
           <w:i w:val="0"/>
           <w:sz w:val="19"/>
         </w:rPr>
-        <w:t>Pembagian kerja tetap: vendor yang ditunjuk Pertamina mengerjakan fabrikasi &amp; pemasangan fisik (termasuk pekerjaan ketinggian dan K3); LGU menyediakan basis desain, supervisi teknis/QA, serta terminasi elektrikal, energize, dan commissioning GLD.</w:t>
+        <w:t>Pembagian kerja: RU IV mendukung penuh instalasi, yaitu penyediaan material, pekerjaan sipil, kelistrikan, dan pemasangan fisik (termasuk pekerjaan ketinggian &amp; K3) oleh tim/kontraktor RU IV. LGU menyediakan perangkat sistem, basis desain, supervisi teknis/QA, serta terminasi elektrikal, energize, dan commissioning.</w:t>
       </w:r>
     </w:p>
     <w:p>
@@ -8303,7 +10275,7 @@
         <w:color w:val="5B5B5B"/>
         <w:sz w:val="16"/>
       </w:rPr>
-      <w:t>LGU/GLD/INSTALASI-SPEK/2026-001  ·  Rev. 1.0</w:t>
+      <w:t>LGU/GLD/INSTALASI-SPEK/2026-001  ·  Rev. 1.1</w:t>
     </w:r>
     <w:r>
       <w:rPr>

</xml_diff>

<commit_message>
Spesifikasi material instalasi rev 1.2: tiang GLD 1 m di atas tanah
Co-Authored-By: Claude Opus 5.5 <noreply@anthropic.com>
Claude-Session: https://claude.ai/code/session_01QPUbK2zC1BgtHo8HLyyaSC
</commit_message>
<xml_diff>
--- a/Deliverables/Spesifikasi_Material_Instalasi_GLD_RU-IV_Cilacap.docx
+++ b/Deliverables/Spesifikasi_Material_Instalasi_GLD_RU-IV_Cilacap.docx
@@ -167,7 +167,7 @@
               <w:rPr>
                 <w:sz w:val="19"/>
               </w:rPr>
-              <w:t>1.1</w:t>
+              <w:t>1.2</w:t>
             </w:r>
           </w:p>
         </w:tc>
@@ -655,7 +655,7 @@
                 <w:i w:val="0"/>
                 <w:sz w:val="18"/>
               </w:rPr>
-              <w:t>Pipa baja galvanis 2" Sch40 (OD 60,3 mm), panjang 2,5 m, ditanam &amp; dicor</w:t>
+              <w:t>Pipa baja galvanis 2" Sch40 (OD 60,3 mm), panjang 1,6 m (1,0 m di atas tanah), ditanam &amp; dicor</w:t>
             </w:r>
           </w:p>
         </w:tc>
@@ -885,7 +885,7 @@
                 <w:i w:val="0"/>
                 <w:sz w:val="18"/>
               </w:rPr>
-              <w:t>GLD 40×40×80 cm · CH 50×50×100 cm · mast GW 50×50×120 cm, beton fc' ≥ 20 MPa</w:t>
+              <w:t>GLD 40×40×60 cm · CH 50×50×100 cm · mast GW 50×50×120 cm, beton fc' ≥ 20 MPa</w:t>
             </w:r>
           </w:p>
         </w:tc>
@@ -2272,7 +2272,7 @@
                 <w:i w:val="0"/>
                 <w:sz w:val="18"/>
               </w:rPr>
-              <w:t>2,5 m = 1,8 m di atas tanah + 0,7 m tertanam di cor</w:t>
+              <w:t>1,6 m = 1,0 m di atas tanah + 0,6 m tertanam di cor. Satu batang pipa standar 6 m cukup untuk ketiga tiang GLD (3 × 1,6 m = 4,8 m)</w:t>
             </w:r>
           </w:p>
         </w:tc>
@@ -2331,7 +2331,7 @@
                 <w:i w:val="0"/>
                 <w:sz w:val="18"/>
               </w:rPr>
-              <w:t>± 1,5 m dari tanah (setinggi orang, sesuai arahan rapat 6 Agustus). Posisi dapat digeser sepanjang tiang</w:t>
+              <w:t>Unit (tinggi 290 mm) dijepit di bagian atas tiang → titik tengah sensor ± 0,8 m dari tanah. Posisi dapat digeser turun sepanjang tiang</w:t>
             </w:r>
           </w:p>
         </w:tc>
@@ -2504,7 +2504,7 @@
                 <w:i w:val="0"/>
                 <w:sz w:val="18"/>
               </w:rPr>
-              <w:t>Lubang 40 × 40 × 80 cm, beton fc' ≥ 20 MPa (± K-250), permukaan atas dibuat miring menjauhi tiang</w:t>
+              <w:t>Lubang 40 × 40 × 60 cm, beton fc' ≥ 20 MPa (± K-250), permukaan atas dibuat miring menjauhi tiang</w:t>
             </w:r>
           </w:p>
         </w:tc>
@@ -2688,7 +2688,7 @@
                 <w:i w:val="0"/>
                 <w:sz w:val="18"/>
               </w:rPr>
-              <w:t>Tinggi 1,5 m mengikuti arahan rapat 6 Agustus (instalasi baru dicoba setinggi orang). Dalam praktik umum, sensor untuk gas yang lebih berat dari udara (LPG, H₂S) dipasang lebih rendah, sedangkan untuk gas ringan (H₂, metana) lebih tinggi. Karena posisi unit bisa digeser di sepanjang tiang, tinggi final per titik dapat disepakati bersama HSE RU IV tanpa mengubah tiang.</w:t>
+              <w:t>Tiang 1 m di atas tanah menempatkan sensor ± 0,8 m dari tanah — di bawah batas "setinggi orang" dari rapat 6 Agustus, sehingga pemasangan &amp; perawatan tidak memerlukan pekerjaan ketinggian. Posisi rendah ini sesuai untuk gas yang lebih berat dari udara (LPG, H₂S). Untuk gas ringan (H₂, metana) sensor idealnya lebih tinggi; bila suatu titik terutama menyasar gas ringan, tiang titik tersebut dapat dibuat lebih panjang. Tinggi final per titik disepakati bersama HSE RU IV.</w:t>
             </w:r>
           </w:p>
         </w:tc>
@@ -7992,7 +7992,7 @@
                 <w:i w:val="0"/>
                 <w:sz w:val="18"/>
               </w:rPr>
-              <w:t>Galvanis 2" Sch40, 2,5 m</w:t>
+              <w:t>Galvanis 2" Sch40, 1,6 m (dipotong dari 1 batang 6 m)</w:t>
             </w:r>
           </w:p>
         </w:tc>
@@ -8370,7 +8370,7 @@
                 <w:i w:val="0"/>
                 <w:sz w:val="18"/>
               </w:rPr>
-              <w:t>GLD 3×0,13 + CH 6×0,25 + GW 1×0,30 m³ ≈ 2.2 m³ (belum termasuk susut/sisa)</w:t>
+              <w:t>GLD 3×0,10 + CH 6×0,25 + GW 1×0,30 m³ ≈ 2.1 m³ (belum termasuk susut/sisa)</w:t>
             </w:r>
           </w:p>
         </w:tc>
@@ -10275,7 +10275,7 @@
         <w:color w:val="5B5B5B"/>
         <w:sz w:val="16"/>
       </w:rPr>
-      <w:t>LGU/GLD/INSTALASI-SPEK/2026-001  ·  Rev. 1.1</w:t>
+      <w:t>LGU/GLD/INSTALASI-SPEK/2026-001  ·  Rev. 1.2</w:t>
     </w:r>
     <w:r>
       <w:rPr>

</xml_diff>

<commit_message>
Spesifikasi material instalasi rev 1.3: rekomendasi tinggi sensor per jenis gas (±0,5 m)
Co-Authored-By: Claude Opus 5.5 <noreply@anthropic.com>
Claude-Session: https://claude.ai/code/session_01QPUbK2zC1BgtHo8HLyyaSC
</commit_message>
<xml_diff>
--- a/Deliverables/Spesifikasi_Material_Instalasi_GLD_RU-IV_Cilacap.docx
+++ b/Deliverables/Spesifikasi_Material_Instalasi_GLD_RU-IV_Cilacap.docx
@@ -167,7 +167,7 @@
               <w:rPr>
                 <w:sz w:val="19"/>
               </w:rPr>
-              <w:t>1.2</w:t>
+              <w:t>1.3</w:t>
             </w:r>
           </w:p>
         </w:tc>
@@ -2331,64 +2331,7 @@
                 <w:i w:val="0"/>
                 <w:sz w:val="18"/>
               </w:rPr>
-              <w:t>Unit (tinggi 290 mm) dijepit di bagian atas tiang → titik tengah sensor ± 0,8 m dari tanah. Posisi dapat digeser turun sepanjang tiang</w:t>
-            </w:r>
-          </w:p>
-        </w:tc>
-        <w:tc>
-          <w:tcPr>
-            <w:tcW w:type="dxa" w:w="1440"/>
-            <w:shd w:val="clear" w:color="auto" w:fill="FBE6E4"/>
-          </w:tcPr>
-          <w:p>
-            <w:pPr>
-              <w:spacing w:after="20"/>
-            </w:pPr>
-            <w:r>
-              <w:rPr>
-                <w:b/>
-                <w:color w:val="B23A3A"/>
-                <w:sz w:val="17"/>
-              </w:rPr>
-              <w:t>KONFIRMASI</w:t>
-            </w:r>
-          </w:p>
-        </w:tc>
-      </w:tr>
-      <w:tr>
-        <w:tc>
-          <w:tcPr>
-            <w:tcW w:type="dxa" w:w="2304"/>
-          </w:tcPr>
-          <w:p>
-            <w:pPr>
-              <w:spacing w:after="20"/>
-            </w:pPr>
-            <w:r>
-              <w:rPr>
-                <w:b w:val="0"/>
-                <w:i w:val="0"/>
-                <w:sz w:val="18"/>
-              </w:rPr>
-              <w:t>Ujung atas</w:t>
-            </w:r>
-          </w:p>
-        </w:tc>
-        <w:tc>
-          <w:tcPr>
-            <w:tcW w:type="dxa" w:w="6192"/>
-          </w:tcPr>
-          <w:p>
-            <w:pPr>
-              <w:spacing w:after="20"/>
-            </w:pPr>
-            <w:r>
-              <w:rPr>
-                <w:b w:val="0"/>
-                <w:i w:val="0"/>
-                <w:sz w:val="18"/>
-              </w:rPr>
-              <w:t>Ditutup pipe cap (las di bengkel atau ulir) agar air hujan tidak masuk</w:t>
+              <w:t>Rekomendasi: titik tengah sensor ± 0,5 m dari tanah (unit 290 mm berada ± 0,35–0,65 m). Sisa tiang di atas unit memberi ruang geser bila HSE RU IV menetapkan tinggi lain</w:t>
             </w:r>
           </w:p>
         </w:tc>
@@ -2416,38 +2359,36 @@
         <w:tc>
           <w:tcPr>
             <w:tcW w:type="dxa" w:w="2304"/>
-            <w:shd w:val="clear" w:color="auto" w:fill="FAFAF8"/>
-          </w:tcPr>
-          <w:p>
-            <w:pPr>
-              <w:spacing w:after="20"/>
-            </w:pPr>
-            <w:r>
-              <w:rPr>
-                <w:b w:val="0"/>
-                <w:i w:val="0"/>
-                <w:sz w:val="18"/>
-              </w:rPr>
-              <w:t>Ujung bawah (dalam cor)</w:t>
+          </w:tcPr>
+          <w:p>
+            <w:pPr>
+              <w:spacing w:after="20"/>
+            </w:pPr>
+            <w:r>
+              <w:rPr>
+                <w:b w:val="0"/>
+                <w:i w:val="0"/>
+                <w:sz w:val="18"/>
+              </w:rPr>
+              <w:t>Ujung atas</w:t>
             </w:r>
           </w:p>
         </w:tc>
         <w:tc>
           <w:tcPr>
             <w:tcW w:type="dxa" w:w="6192"/>
-            <w:shd w:val="clear" w:color="auto" w:fill="FAFAF8"/>
-          </w:tcPr>
-          <w:p>
-            <w:pPr>
-              <w:spacing w:after="20"/>
-            </w:pPr>
-            <w:r>
-              <w:rPr>
-                <w:b w:val="0"/>
-                <w:i w:val="0"/>
-                <w:sz w:val="18"/>
-              </w:rPr>
-              <w:t>Diberi besi silang/angkur (mis. 2× besi Ø12 mm tembus pipa) agar tiang tidak berputar</w:t>
+          </w:tcPr>
+          <w:p>
+            <w:pPr>
+              <w:spacing w:after="20"/>
+            </w:pPr>
+            <w:r>
+              <w:rPr>
+                <w:b w:val="0"/>
+                <w:i w:val="0"/>
+                <w:sz w:val="18"/>
+              </w:rPr>
+              <w:t>Ditutup pipe cap (las di bengkel atau ulir) agar air hujan tidak masuk</w:t>
             </w:r>
           </w:p>
         </w:tc>
@@ -2475,36 +2416,38 @@
         <w:tc>
           <w:tcPr>
             <w:tcW w:type="dxa" w:w="2304"/>
-          </w:tcPr>
-          <w:p>
-            <w:pPr>
-              <w:spacing w:after="20"/>
-            </w:pPr>
-            <w:r>
-              <w:rPr>
-                <w:b w:val="0"/>
-                <w:i w:val="0"/>
-                <w:sz w:val="18"/>
-              </w:rPr>
-              <w:t>Pondasi</w:t>
+            <w:shd w:val="clear" w:color="auto" w:fill="FAFAF8"/>
+          </w:tcPr>
+          <w:p>
+            <w:pPr>
+              <w:spacing w:after="20"/>
+            </w:pPr>
+            <w:r>
+              <w:rPr>
+                <w:b w:val="0"/>
+                <w:i w:val="0"/>
+                <w:sz w:val="18"/>
+              </w:rPr>
+              <w:t>Ujung bawah (dalam cor)</w:t>
             </w:r>
           </w:p>
         </w:tc>
         <w:tc>
           <w:tcPr>
             <w:tcW w:type="dxa" w:w="6192"/>
-          </w:tcPr>
-          <w:p>
-            <w:pPr>
-              <w:spacing w:after="20"/>
-            </w:pPr>
-            <w:r>
-              <w:rPr>
-                <w:b w:val="0"/>
-                <w:i w:val="0"/>
-                <w:sz w:val="18"/>
-              </w:rPr>
-              <w:t>Lubang 40 × 40 × 60 cm, beton fc' ≥ 20 MPa (± K-250), permukaan atas dibuat miring menjauhi tiang</w:t>
+            <w:shd w:val="clear" w:color="auto" w:fill="FAFAF8"/>
+          </w:tcPr>
+          <w:p>
+            <w:pPr>
+              <w:spacing w:after="20"/>
+            </w:pPr>
+            <w:r>
+              <w:rPr>
+                <w:b w:val="0"/>
+                <w:i w:val="0"/>
+                <w:sz w:val="18"/>
+              </w:rPr>
+              <w:t>Diberi besi silang/angkur (mis. 2× besi Ø12 mm tembus pipa) agar tiang tidak berputar</w:t>
             </w:r>
           </w:p>
         </w:tc>
@@ -2532,38 +2475,36 @@
         <w:tc>
           <w:tcPr>
             <w:tcW w:type="dxa" w:w="2304"/>
-            <w:shd w:val="clear" w:color="auto" w:fill="FAFAF8"/>
-          </w:tcPr>
-          <w:p>
-            <w:pPr>
-              <w:spacing w:after="20"/>
-            </w:pPr>
-            <w:r>
-              <w:rPr>
-                <w:b w:val="0"/>
-                <w:i w:val="0"/>
-                <w:sz w:val="18"/>
-              </w:rPr>
-              <w:t>Masa tunggu</w:t>
+          </w:tcPr>
+          <w:p>
+            <w:pPr>
+              <w:spacing w:after="20"/>
+            </w:pPr>
+            <w:r>
+              <w:rPr>
+                <w:b w:val="0"/>
+                <w:i w:val="0"/>
+                <w:sz w:val="18"/>
+              </w:rPr>
+              <w:t>Pondasi</w:t>
             </w:r>
           </w:p>
         </w:tc>
         <w:tc>
           <w:tcPr>
             <w:tcW w:type="dxa" w:w="6192"/>
-            <w:shd w:val="clear" w:color="auto" w:fill="FAFAF8"/>
-          </w:tcPr>
-          <w:p>
-            <w:pPr>
-              <w:spacing w:after="20"/>
-            </w:pPr>
-            <w:r>
-              <w:rPr>
-                <w:b w:val="0"/>
-                <w:i w:val="0"/>
-                <w:sz w:val="18"/>
-              </w:rPr>
-              <w:t>Unit GLD dipasang setelah beton cukup kuat (umumnya ≥ 3 hari; ikuti praktik pelaksana RU IV)</w:t>
+          </w:tcPr>
+          <w:p>
+            <w:pPr>
+              <w:spacing w:after="20"/>
+            </w:pPr>
+            <w:r>
+              <w:rPr>
+                <w:b w:val="0"/>
+                <w:i w:val="0"/>
+                <w:sz w:val="18"/>
+              </w:rPr>
+              <w:t>Lubang 40 × 40 × 60 cm, beton fc' ≥ 20 MPa (± K-250), permukaan atas dibuat miring menjauhi tiang</w:t>
             </w:r>
           </w:p>
         </w:tc>
@@ -2591,36 +2532,38 @@
         <w:tc>
           <w:tcPr>
             <w:tcW w:type="dxa" w:w="2304"/>
-          </w:tcPr>
-          <w:p>
-            <w:pPr>
-              <w:spacing w:after="20"/>
-            </w:pPr>
-            <w:r>
-              <w:rPr>
-                <w:b w:val="0"/>
-                <w:i w:val="0"/>
-                <w:sz w:val="18"/>
-              </w:rPr>
-              <w:t>Tegak lurus</w:t>
+            <w:shd w:val="clear" w:color="auto" w:fill="FAFAF8"/>
+          </w:tcPr>
+          <w:p>
+            <w:pPr>
+              <w:spacing w:after="20"/>
+            </w:pPr>
+            <w:r>
+              <w:rPr>
+                <w:b w:val="0"/>
+                <w:i w:val="0"/>
+                <w:sz w:val="18"/>
+              </w:rPr>
+              <w:t>Masa tunggu</w:t>
             </w:r>
           </w:p>
         </w:tc>
         <w:tc>
           <w:tcPr>
             <w:tcW w:type="dxa" w:w="6192"/>
-          </w:tcPr>
-          <w:p>
-            <w:pPr>
-              <w:spacing w:after="20"/>
-            </w:pPr>
-            <w:r>
-              <w:rPr>
-                <w:b w:val="0"/>
-                <w:i w:val="0"/>
-                <w:sz w:val="18"/>
-              </w:rPr>
-              <w:t>Toleransi vertikal ≤ 1° (cek waterpass saat pengecoran)</w:t>
+            <w:shd w:val="clear" w:color="auto" w:fill="FAFAF8"/>
+          </w:tcPr>
+          <w:p>
+            <w:pPr>
+              <w:spacing w:after="20"/>
+            </w:pPr>
+            <w:r>
+              <w:rPr>
+                <w:b w:val="0"/>
+                <w:i w:val="0"/>
+                <w:sz w:val="18"/>
+              </w:rPr>
+              <w:t>Unit GLD dipasang setelah beton cukup kuat (umumnya ≥ 3 hari; ikuti praktik pelaksana RU IV)</w:t>
             </w:r>
           </w:p>
         </w:tc>
@@ -2640,6 +2583,453 @@
                 <w:sz w:val="17"/>
               </w:rPr>
               <w:t>USULAN</w:t>
+            </w:r>
+          </w:p>
+        </w:tc>
+      </w:tr>
+      <w:tr>
+        <w:tc>
+          <w:tcPr>
+            <w:tcW w:type="dxa" w:w="2304"/>
+          </w:tcPr>
+          <w:p>
+            <w:pPr>
+              <w:spacing w:after="20"/>
+            </w:pPr>
+            <w:r>
+              <w:rPr>
+                <w:b w:val="0"/>
+                <w:i w:val="0"/>
+                <w:sz w:val="18"/>
+              </w:rPr>
+              <w:t>Tegak lurus</w:t>
+            </w:r>
+          </w:p>
+        </w:tc>
+        <w:tc>
+          <w:tcPr>
+            <w:tcW w:type="dxa" w:w="6192"/>
+          </w:tcPr>
+          <w:p>
+            <w:pPr>
+              <w:spacing w:after="20"/>
+            </w:pPr>
+            <w:r>
+              <w:rPr>
+                <w:b w:val="0"/>
+                <w:i w:val="0"/>
+                <w:sz w:val="18"/>
+              </w:rPr>
+              <w:t>Toleransi vertikal ≤ 1° (cek waterpass saat pengecoran)</w:t>
+            </w:r>
+          </w:p>
+        </w:tc>
+        <w:tc>
+          <w:tcPr>
+            <w:tcW w:type="dxa" w:w="1440"/>
+            <w:shd w:val="clear" w:color="auto" w:fill="FFF3DC"/>
+          </w:tcPr>
+          <w:p>
+            <w:pPr>
+              <w:spacing w:after="20"/>
+            </w:pPr>
+            <w:r>
+              <w:rPr>
+                <w:b/>
+                <w:color w:val="8A6D1E"/>
+                <w:sz w:val="17"/>
+              </w:rPr>
+              <w:t>USULAN</w:t>
+            </w:r>
+          </w:p>
+        </w:tc>
+      </w:tr>
+    </w:tbl>
+    <w:p>
+      <w:pPr>
+        <w:spacing w:after="40"/>
+      </w:pPr>
+    </w:p>
+    <w:p>
+      <w:pPr>
+        <w:spacing w:after="60"/>
+      </w:pPr>
+      <w:r>
+        <w:rPr>
+          <w:b/>
+          <w:i w:val="0"/>
+          <w:color w:val="1B2A4A"/>
+          <w:sz w:val="20"/>
+        </w:rPr>
+        <w:t>Tinggi sensor menurut jenis gas</w:t>
+      </w:r>
+    </w:p>
+    <w:p>
+      <w:pPr>
+        <w:spacing w:after="120"/>
+      </w:pPr>
+      <w:r>
+        <w:rPr>
+          <w:b w:val="0"/>
+          <w:i w:val="0"/>
+          <w:sz w:val="19"/>
+        </w:rPr>
+        <w:t>Tidak ada satu tinggi yang ideal untuk semua gas. Panduan umum industri (IEC 60079-29-2, ISA RP12.13 Part II) menentukan tinggi berdasarkan berat jenis gas dan letak sumber bocor:</w:t>
+      </w:r>
+    </w:p>
+    <w:tbl>
+      <w:tblPr>
+        <w:tblStyle w:val="TableGrid"/>
+        <w:tblW w:type="auto" w:w="0"/>
+        <w:tblLook w:firstColumn="1" w:firstRow="1" w:lastColumn="0" w:lastRow="0" w:noHBand="0" w:noVBand="1" w:val="04A0"/>
+        <w:tblLayout w:type="fixed"/>
+      </w:tblPr>
+      <w:tblGrid>
+        <w:gridCol w:w="2448"/>
+        <w:gridCol w:w="3456"/>
+        <w:gridCol w:w="4031"/>
+      </w:tblGrid>
+      <w:tr>
+        <w:tc>
+          <w:tcPr>
+            <w:tcW w:type="dxa" w:w="2448"/>
+            <w:shd w:val="clear" w:color="auto" w:fill="1B2A4A"/>
+          </w:tcPr>
+          <w:p>
+            <w:pPr>
+              <w:spacing w:after="20"/>
+            </w:pPr>
+            <w:r>
+              <w:rPr>
+                <w:b/>
+                <w:color w:val="FFFFFF"/>
+                <w:sz w:val="18"/>
+              </w:rPr>
+              <w:t>Jenis gas</w:t>
+            </w:r>
+          </w:p>
+        </w:tc>
+        <w:tc>
+          <w:tcPr>
+            <w:tcW w:type="dxa" w:w="3456"/>
+            <w:shd w:val="clear" w:color="auto" w:fill="1B2A4A"/>
+          </w:tcPr>
+          <w:p>
+            <w:pPr>
+              <w:spacing w:after="20"/>
+            </w:pPr>
+            <w:r>
+              <w:rPr>
+                <w:b/>
+                <w:color w:val="FFFFFF"/>
+                <w:sz w:val="18"/>
+              </w:rPr>
+              <w:t>Sifat</w:t>
+            </w:r>
+          </w:p>
+        </w:tc>
+        <w:tc>
+          <w:tcPr>
+            <w:tcW w:type="dxa" w:w="4032"/>
+            <w:shd w:val="clear" w:color="auto" w:fill="1B2A4A"/>
+          </w:tcPr>
+          <w:p>
+            <w:pPr>
+              <w:spacing w:after="20"/>
+            </w:pPr>
+            <w:r>
+              <w:rPr>
+                <w:b/>
+                <w:color w:val="FFFFFF"/>
+                <w:sz w:val="18"/>
+              </w:rPr>
+              <w:t>Tinggi sensor ideal</w:t>
+            </w:r>
+          </w:p>
+        </w:tc>
+      </w:tr>
+      <w:tr>
+        <w:tc>
+          <w:tcPr>
+            <w:tcW w:type="dxa" w:w="2448"/>
+          </w:tcPr>
+          <w:p>
+            <w:pPr>
+              <w:spacing w:after="20"/>
+            </w:pPr>
+            <w:r>
+              <w:rPr>
+                <w:b w:val="0"/>
+                <w:i w:val="0"/>
+                <w:sz w:val="18"/>
+              </w:rPr>
+              <w:t>LPG (propana/butana), CO₂</w:t>
+            </w:r>
+          </w:p>
+        </w:tc>
+        <w:tc>
+          <w:tcPr>
+            <w:tcW w:type="dxa" w:w="3456"/>
+          </w:tcPr>
+          <w:p>
+            <w:pPr>
+              <w:spacing w:after="20"/>
+            </w:pPr>
+            <w:r>
+              <w:rPr>
+                <w:b w:val="0"/>
+                <w:i w:val="0"/>
+                <w:sz w:val="18"/>
+              </w:rPr>
+              <w:t>Jauh lebih berat dari udara, mengendap di tanah/parit</w:t>
+            </w:r>
+          </w:p>
+        </w:tc>
+        <w:tc>
+          <w:tcPr>
+            <w:tcW w:type="dxa" w:w="4032"/>
+          </w:tcPr>
+          <w:p>
+            <w:pPr>
+              <w:spacing w:after="20"/>
+            </w:pPr>
+            <w:r>
+              <w:rPr>
+                <w:b w:val="0"/>
+                <w:i w:val="0"/>
+                <w:sz w:val="18"/>
+              </w:rPr>
+              <w:t>0,3–0,5 m dari tanah</w:t>
+            </w:r>
+          </w:p>
+        </w:tc>
+      </w:tr>
+      <w:tr>
+        <w:tc>
+          <w:tcPr>
+            <w:tcW w:type="dxa" w:w="2448"/>
+            <w:shd w:val="clear" w:color="auto" w:fill="FAFAF8"/>
+          </w:tcPr>
+          <w:p>
+            <w:pPr>
+              <w:spacing w:after="20"/>
+            </w:pPr>
+            <w:r>
+              <w:rPr>
+                <w:b w:val="0"/>
+                <w:i w:val="0"/>
+                <w:sz w:val="18"/>
+              </w:rPr>
+              <w:t>H₂S</w:t>
+            </w:r>
+          </w:p>
+        </w:tc>
+        <w:tc>
+          <w:tcPr>
+            <w:tcW w:type="dxa" w:w="3456"/>
+            <w:shd w:val="clear" w:color="auto" w:fill="FAFAF8"/>
+          </w:tcPr>
+          <w:p>
+            <w:pPr>
+              <w:spacing w:after="20"/>
+            </w:pPr>
+            <w:r>
+              <w:rPr>
+                <w:b w:val="0"/>
+                <w:i w:val="0"/>
+                <w:sz w:val="18"/>
+              </w:rPr>
+              <w:t>Sedikit lebih berat dari udara, toksik</w:t>
+            </w:r>
+          </w:p>
+        </w:tc>
+        <w:tc>
+          <w:tcPr>
+            <w:tcW w:type="dxa" w:w="4032"/>
+            <w:shd w:val="clear" w:color="auto" w:fill="FAFAF8"/>
+          </w:tcPr>
+          <w:p>
+            <w:pPr>
+              <w:spacing w:after="20"/>
+            </w:pPr>
+            <w:r>
+              <w:rPr>
+                <w:b w:val="0"/>
+                <w:i w:val="0"/>
+                <w:sz w:val="18"/>
+              </w:rPr>
+              <w:t>0,3–0,6 m untuk deteksi kebocoran; zona napas 1,2–1,8 m untuk proteksi pekerja</w:t>
+            </w:r>
+          </w:p>
+        </w:tc>
+      </w:tr>
+      <w:tr>
+        <w:tc>
+          <w:tcPr>
+            <w:tcW w:type="dxa" w:w="2448"/>
+          </w:tcPr>
+          <w:p>
+            <w:pPr>
+              <w:spacing w:after="20"/>
+            </w:pPr>
+            <w:r>
+              <w:rPr>
+                <w:b w:val="0"/>
+                <w:i w:val="0"/>
+                <w:sz w:val="18"/>
+              </w:rPr>
+              <w:t>CO</w:t>
+            </w:r>
+          </w:p>
+        </w:tc>
+        <w:tc>
+          <w:tcPr>
+            <w:tcW w:type="dxa" w:w="3456"/>
+          </w:tcPr>
+          <w:p>
+            <w:pPr>
+              <w:spacing w:after="20"/>
+            </w:pPr>
+            <w:r>
+              <w:rPr>
+                <w:b w:val="0"/>
+                <w:i w:val="0"/>
+                <w:sz w:val="18"/>
+              </w:rPr>
+              <w:t>Hampir sama dengan udara</w:t>
+            </w:r>
+          </w:p>
+        </w:tc>
+        <w:tc>
+          <w:tcPr>
+            <w:tcW w:type="dxa" w:w="4032"/>
+          </w:tcPr>
+          <w:p>
+            <w:pPr>
+              <w:spacing w:after="20"/>
+            </w:pPr>
+            <w:r>
+              <w:rPr>
+                <w:b w:val="0"/>
+                <w:i w:val="0"/>
+                <w:sz w:val="18"/>
+              </w:rPr>
+              <w:t>Zona napas 1,5–1,8 m</w:t>
+            </w:r>
+          </w:p>
+        </w:tc>
+      </w:tr>
+      <w:tr>
+        <w:tc>
+          <w:tcPr>
+            <w:tcW w:type="dxa" w:w="2448"/>
+            <w:shd w:val="clear" w:color="auto" w:fill="FAFAF8"/>
+          </w:tcPr>
+          <w:p>
+            <w:pPr>
+              <w:spacing w:after="20"/>
+            </w:pPr>
+            <w:r>
+              <w:rPr>
+                <w:b w:val="0"/>
+                <w:i w:val="0"/>
+                <w:sz w:val="18"/>
+              </w:rPr>
+              <w:t>Metana</w:t>
+            </w:r>
+          </w:p>
+        </w:tc>
+        <w:tc>
+          <w:tcPr>
+            <w:tcW w:type="dxa" w:w="3456"/>
+            <w:shd w:val="clear" w:color="auto" w:fill="FAFAF8"/>
+          </w:tcPr>
+          <w:p>
+            <w:pPr>
+              <w:spacing w:after="20"/>
+            </w:pPr>
+            <w:r>
+              <w:rPr>
+                <w:b w:val="0"/>
+                <w:i w:val="0"/>
+                <w:sz w:val="18"/>
+              </w:rPr>
+              <w:t>Lebih ringan, naik</w:t>
+            </w:r>
+          </w:p>
+        </w:tc>
+        <w:tc>
+          <w:tcPr>
+            <w:tcW w:type="dxa" w:w="4032"/>
+            <w:shd w:val="clear" w:color="auto" w:fill="FAFAF8"/>
+          </w:tcPr>
+          <w:p>
+            <w:pPr>
+              <w:spacing w:after="20"/>
+            </w:pPr>
+            <w:r>
+              <w:rPr>
+                <w:b w:val="0"/>
+                <w:i w:val="0"/>
+                <w:sz w:val="18"/>
+              </w:rPr>
+              <w:t>± 0,5–1 m di atas sumber bocor</w:t>
+            </w:r>
+          </w:p>
+        </w:tc>
+      </w:tr>
+      <w:tr>
+        <w:tc>
+          <w:tcPr>
+            <w:tcW w:type="dxa" w:w="2448"/>
+          </w:tcPr>
+          <w:p>
+            <w:pPr>
+              <w:spacing w:after="20"/>
+            </w:pPr>
+            <w:r>
+              <w:rPr>
+                <w:b w:val="0"/>
+                <w:i w:val="0"/>
+                <w:sz w:val="18"/>
+              </w:rPr>
+              <w:t>H₂</w:t>
+            </w:r>
+          </w:p>
+        </w:tc>
+        <w:tc>
+          <w:tcPr>
+            <w:tcW w:type="dxa" w:w="3456"/>
+          </w:tcPr>
+          <w:p>
+            <w:pPr>
+              <w:spacing w:after="20"/>
+            </w:pPr>
+            <w:r>
+              <w:rPr>
+                <w:b w:val="0"/>
+                <w:i w:val="0"/>
+                <w:sz w:val="18"/>
+              </w:rPr>
+              <w:t>Sangat ringan, naik cepat</w:t>
+            </w:r>
+          </w:p>
+        </w:tc>
+        <w:tc>
+          <w:tcPr>
+            <w:tcW w:type="dxa" w:w="4032"/>
+          </w:tcPr>
+          <w:p>
+            <w:pPr>
+              <w:spacing w:after="20"/>
+            </w:pPr>
+            <w:r>
+              <w:rPr>
+                <w:b w:val="0"/>
+                <w:i w:val="0"/>
+                <w:sz w:val="18"/>
+              </w:rPr>
+              <w:t>Di atas sumber bocor / titik tertinggi tempat gas bisa terperangkap</w:t>
             </w:r>
           </w:p>
         </w:tc>
@@ -2675,7 +3065,7 @@
                 <w:b/>
                 <w:sz w:val="19"/>
               </w:rPr>
-              <w:t>Catatan tinggi sensor</w:t>
+              <w:t>Rekomendasi untuk perimeter SRU: titik tengah sensor ± 0,5 m dari tanah</w:t>
             </w:r>
           </w:p>
           <w:p>
@@ -2688,7 +3078,7 @@
                 <w:i w:val="0"/>
                 <w:sz w:val="18"/>
               </w:rPr>
-              <w:t>Tiang 1 m di atas tanah menempatkan sensor ± 0,8 m dari tanah — di bawah batas "setinggi orang" dari rapat 6 Agustus, sehingga pemasangan &amp; perawatan tidak memerlukan pekerjaan ketinggian. Posisi rendah ini sesuai untuk gas yang lebih berat dari udara (LPG, H₂S). Untuk gas ringan (H₂, metana) sensor idealnya lebih tinggi; bila suatu titik terutama menyasar gas ringan, tiang titik tersebut dapat dibuat lebih panjang. Tinggi final per titik disepakati bersama HSE RU IV.</w:t>
+              <w:t>Satu unit GLD membaca beberapa gas sekaligus, sehingga tingginya selalu kompromi. Di perimeter SRU, gas yang paling relevan (H₂S, LPG) cenderung turun, sehingga posisi rendah paling efektif — sekaligus tanpa pekerjaan ketinggian. Jangan di bawah ± 0,3 m karena sensor bermesh terbuka bisa terkena cipratan air, lumpur, dan genangan. Untuk titik yang terutama menyasar H₂/metana, tinggi ditentukan dari posisi sumber bocor (flange/valve), bukan dari tanah; tiang titik tersebut dibuat lebih panjang. Tinggi final per titik disepakati bersama HSE RU IV saat penentuan titik (letak sumber bocor &amp; arah angin).</w:t>
             </w:r>
           </w:p>
         </w:tc>
@@ -10275,7 +10665,7 @@
         <w:color w:val="5B5B5B"/>
         <w:sz w:val="16"/>
       </w:rPr>
-      <w:t>LGU/GLD/INSTALASI-SPEK/2026-001  ·  Rev. 1.2</w:t>
+      <w:t>LGU/GLD/INSTALASI-SPEK/2026-001  ·  Rev. 1.3</w:t>
     </w:r>
     <w:r>
       <w:rPr>

</xml_diff>

<commit_message>
Spesifikasi material instalasi rev 1.4: skema jaringan lokal Gateway-router-PC
Co-Authored-By: Claude Opus 5.5 <noreply@anthropic.com>
Claude-Session: https://claude.ai/code/session_01QPUbK2zC1BgtHo8HLyyaSC
</commit_message>
<xml_diff>
--- a/Deliverables/Spesifikasi_Material_Instalasi_GLD_RU-IV_Cilacap.docx
+++ b/Deliverables/Spesifikasi_Material_Instalasi_GLD_RU-IV_Cilacap.docx
@@ -167,7 +167,7 @@
               <w:rPr>
                 <w:sz w:val="19"/>
               </w:rPr>
-              <w:t>1.3</w:t>
+              <w:t>1.4</w:t>
             </w:r>
           </w:p>
         </w:tc>
@@ -6144,7 +6144,7 @@
                 <w:i w:val="0"/>
                 <w:sz w:val="18"/>
               </w:rPr>
-              <w:t>Router Wi-Fi untuk Gateway ↔ PC server (jaringan GLD terpisah dari jaringan kilang)</w:t>
+              <w:t>Router Wi-Fi milik LGU, satu ruangan dengan Gateway; dikonfigurasi LGU sebelum mobilisasi (lihat §5.2)</w:t>
             </w:r>
           </w:p>
         </w:tc>
@@ -6220,7 +6220,7 @@
                 <w:i w:val="0"/>
                 <w:sz w:val="18"/>
               </w:rPr>
-              <w:t>Satu ruangan, jarak ± 1–5 m, tanpa sekat logam (Gateway memakai Wi-Fi)</w:t>
+              <w:t>Wi-Fi 2,4 GHz, satu ruangan, jarak ± 1–5 m, tanpa sekat logam</w:t>
             </w:r>
           </w:p>
         </w:tc>
@@ -6245,7 +6245,7 @@
         <w:tc>
           <w:tcPr>
             <w:tcW w:type="dxa" w:w="1440"/>
-            <w:shd w:val="clear" w:color="auto" w:fill="FFF3DC"/>
+            <w:shd w:val="clear" w:color="auto" w:fill="EAF4EC"/>
           </w:tcPr>
           <w:p>
             <w:pPr>
@@ -6254,10 +6254,10 @@
             <w:r>
               <w:rPr>
                 <w:b/>
-                <w:color w:val="8A6D1E"/>
+                <w:color w:val="2C6B33"/>
                 <w:sz w:val="17"/>
               </w:rPr>
-              <w:t>USULAN</w:t>
+              <w:t>FINAL</w:t>
             </w:r>
           </w:p>
         </w:tc>
@@ -6660,7 +6660,443 @@
         <w:rPr>
           <w:color w:val="1B2A4A"/>
         </w:rPr>
-        <w:t>5.2 Kabel koaksial antena Gateway</w:t>
+        <w:t>5.2 Skema jaringan lokal</w:t>
+      </w:r>
+    </w:p>
+    <w:tbl>
+      <w:tblPr>
+        <w:tblStyle w:val="TableGrid"/>
+        <w:tblW w:type="auto" w:w="0"/>
+        <w:tblLook w:firstColumn="1" w:firstRow="1" w:lastColumn="0" w:lastRow="0" w:noHBand="0" w:noVBand="1" w:val="04A0"/>
+        <w:tblLayout w:type="fixed"/>
+      </w:tblPr>
+      <w:tblGrid>
+        <w:gridCol w:w="2664"/>
+        <w:gridCol w:w="5832"/>
+        <w:gridCol w:w="1440"/>
+      </w:tblGrid>
+      <w:tr>
+        <w:tc>
+          <w:tcPr>
+            <w:tcW w:type="dxa" w:w="2664"/>
+            <w:shd w:val="clear" w:color="auto" w:fill="1B2A4A"/>
+          </w:tcPr>
+          <w:p>
+            <w:pPr>
+              <w:spacing w:after="20"/>
+            </w:pPr>
+            <w:r>
+              <w:rPr>
+                <w:b/>
+                <w:color w:val="FFFFFF"/>
+                <w:sz w:val="18"/>
+              </w:rPr>
+              <w:t>Segmen</w:t>
+            </w:r>
+          </w:p>
+        </w:tc>
+        <w:tc>
+          <w:tcPr>
+            <w:tcW w:type="dxa" w:w="5832"/>
+            <w:shd w:val="clear" w:color="auto" w:fill="1B2A4A"/>
+          </w:tcPr>
+          <w:p>
+            <w:pPr>
+              <w:spacing w:after="20"/>
+            </w:pPr>
+            <w:r>
+              <w:rPr>
+                <w:b/>
+                <w:color w:val="FFFFFF"/>
+                <w:sz w:val="18"/>
+              </w:rPr>
+              <w:t>Media &amp; ketentuan</w:t>
+            </w:r>
+          </w:p>
+        </w:tc>
+        <w:tc>
+          <w:tcPr>
+            <w:tcW w:type="dxa" w:w="1440"/>
+            <w:shd w:val="clear" w:color="auto" w:fill="1B2A4A"/>
+          </w:tcPr>
+          <w:p>
+            <w:pPr>
+              <w:spacing w:after="20"/>
+            </w:pPr>
+            <w:r>
+              <w:rPr>
+                <w:b/>
+                <w:color w:val="FFFFFF"/>
+                <w:sz w:val="18"/>
+              </w:rPr>
+              <w:t>Status</w:t>
+            </w:r>
+          </w:p>
+        </w:tc>
+      </w:tr>
+      <w:tr>
+        <w:tc>
+          <w:tcPr>
+            <w:tcW w:type="dxa" w:w="2664"/>
+          </w:tcPr>
+          <w:p>
+            <w:pPr>
+              <w:spacing w:after="20"/>
+            </w:pPr>
+            <w:r>
+              <w:rPr>
+                <w:b w:val="0"/>
+                <w:i w:val="0"/>
+                <w:sz w:val="18"/>
+              </w:rPr>
+              <w:t>Gateway → router</w:t>
+            </w:r>
+          </w:p>
+        </w:tc>
+        <w:tc>
+          <w:tcPr>
+            <w:tcW w:type="dxa" w:w="5832"/>
+          </w:tcPr>
+          <w:p>
+            <w:pPr>
+              <w:spacing w:after="20"/>
+            </w:pPr>
+            <w:r>
+              <w:rPr>
+                <w:b w:val="0"/>
+                <w:i w:val="0"/>
+                <w:sz w:val="18"/>
+              </w:rPr>
+              <w:t>Wi-Fi 2,4 GHz (Gateway berbasis ESP32-S3 hanya mendukung 2,4 GHz), WPA2, SSID khusus jaringan GLD</w:t>
+            </w:r>
+          </w:p>
+        </w:tc>
+        <w:tc>
+          <w:tcPr>
+            <w:tcW w:type="dxa" w:w="1440"/>
+            <w:shd w:val="clear" w:color="auto" w:fill="EAF4EC"/>
+          </w:tcPr>
+          <w:p>
+            <w:pPr>
+              <w:spacing w:after="20"/>
+            </w:pPr>
+            <w:r>
+              <w:rPr>
+                <w:b/>
+                <w:color w:val="2C6B33"/>
+                <w:sz w:val="17"/>
+              </w:rPr>
+              <w:t>FINAL</w:t>
+            </w:r>
+          </w:p>
+        </w:tc>
+      </w:tr>
+      <w:tr>
+        <w:tc>
+          <w:tcPr>
+            <w:tcW w:type="dxa" w:w="2664"/>
+            <w:shd w:val="clear" w:color="auto" w:fill="FAFAF8"/>
+          </w:tcPr>
+          <w:p>
+            <w:pPr>
+              <w:spacing w:after="20"/>
+            </w:pPr>
+            <w:r>
+              <w:rPr>
+                <w:b w:val="0"/>
+                <w:i w:val="0"/>
+                <w:sz w:val="18"/>
+              </w:rPr>
+              <w:t>Router → PC server (LAN 1)</w:t>
+            </w:r>
+          </w:p>
+        </w:tc>
+        <w:tc>
+          <w:tcPr>
+            <w:tcW w:type="dxa" w:w="5832"/>
+            <w:shd w:val="clear" w:color="auto" w:fill="FAFAF8"/>
+          </w:tcPr>
+          <w:p>
+            <w:pPr>
+              <w:spacing w:after="20"/>
+            </w:pPr>
+            <w:r>
+              <w:rPr>
+                <w:b w:val="0"/>
+                <w:i w:val="0"/>
+                <w:sz w:val="18"/>
+              </w:rPr>
+              <w:t>Kabel Cat6 dari ruang Gateway ke ruang server lokal; IP tetap untuk PC server (MQTT broker)</w:t>
+            </w:r>
+          </w:p>
+        </w:tc>
+        <w:tc>
+          <w:tcPr>
+            <w:tcW w:type="dxa" w:w="1440"/>
+            <w:shd w:val="clear" w:color="auto" w:fill="EAF4EC"/>
+          </w:tcPr>
+          <w:p>
+            <w:pPr>
+              <w:spacing w:after="20"/>
+            </w:pPr>
+            <w:r>
+              <w:rPr>
+                <w:b/>
+                <w:color w:val="2C6B33"/>
+                <w:sz w:val="17"/>
+              </w:rPr>
+              <w:t>FINAL</w:t>
+            </w:r>
+          </w:p>
+        </w:tc>
+      </w:tr>
+      <w:tr>
+        <w:tc>
+          <w:tcPr>
+            <w:tcW w:type="dxa" w:w="2664"/>
+          </w:tcPr>
+          <w:p>
+            <w:pPr>
+              <w:spacing w:after="20"/>
+            </w:pPr>
+            <w:r>
+              <w:rPr>
+                <w:b w:val="0"/>
+                <w:i w:val="0"/>
+                <w:sz w:val="18"/>
+              </w:rPr>
+              <w:t>PC server → intranet kantor (LAN 2)</w:t>
+            </w:r>
+          </w:p>
+        </w:tc>
+        <w:tc>
+          <w:tcPr>
+            <w:tcW w:type="dxa" w:w="5832"/>
+          </w:tcPr>
+          <w:p>
+            <w:pPr>
+              <w:spacing w:after="20"/>
+            </w:pPr>
+            <w:r>
+              <w:rPr>
+                <w:b w:val="0"/>
+                <w:i w:val="0"/>
+                <w:sz w:val="18"/>
+              </w:rPr>
+              <w:t>Port LAN kedua ke titik jaringan kantor; hanya untuk akses dashboard/API dari kantor. PC tidak meneruskan (routing) lalu lintas antara jaringan GLD dan intranet</w:t>
+            </w:r>
+          </w:p>
+        </w:tc>
+        <w:tc>
+          <w:tcPr>
+            <w:tcW w:type="dxa" w:w="1440"/>
+            <w:shd w:val="clear" w:color="auto" w:fill="EAF4EC"/>
+          </w:tcPr>
+          <w:p>
+            <w:pPr>
+              <w:spacing w:after="20"/>
+            </w:pPr>
+            <w:r>
+              <w:rPr>
+                <w:b/>
+                <w:color w:val="2C6B33"/>
+                <w:sz w:val="17"/>
+              </w:rPr>
+              <w:t>FINAL</w:t>
+            </w:r>
+          </w:p>
+        </w:tc>
+      </w:tr>
+      <w:tr>
+        <w:tc>
+          <w:tcPr>
+            <w:tcW w:type="dxa" w:w="2664"/>
+            <w:shd w:val="clear" w:color="auto" w:fill="FAFAF8"/>
+          </w:tcPr>
+          <w:p>
+            <w:pPr>
+              <w:spacing w:after="20"/>
+            </w:pPr>
+            <w:r>
+              <w:rPr>
+                <w:b w:val="0"/>
+                <w:i w:val="0"/>
+                <w:sz w:val="18"/>
+              </w:rPr>
+              <w:t>Internet</w:t>
+            </w:r>
+          </w:p>
+        </w:tc>
+        <w:tc>
+          <w:tcPr>
+            <w:tcW w:type="dxa" w:w="5832"/>
+            <w:shd w:val="clear" w:color="auto" w:fill="FAFAF8"/>
+          </w:tcPr>
+          <w:p>
+            <w:pPr>
+              <w:spacing w:after="20"/>
+            </w:pPr>
+            <w:r>
+              <w:rPr>
+                <w:b w:val="0"/>
+                <w:i w:val="0"/>
+                <w:sz w:val="18"/>
+              </w:rPr>
+              <w:t>Tidak ada. Router tanpa WAN/SIM; seluruh sistem berjalan lokal</w:t>
+            </w:r>
+          </w:p>
+        </w:tc>
+        <w:tc>
+          <w:tcPr>
+            <w:tcW w:type="dxa" w:w="1440"/>
+            <w:shd w:val="clear" w:color="auto" w:fill="EAF4EC"/>
+          </w:tcPr>
+          <w:p>
+            <w:pPr>
+              <w:spacing w:after="20"/>
+            </w:pPr>
+            <w:r>
+              <w:rPr>
+                <w:b/>
+                <w:color w:val="2C6B33"/>
+                <w:sz w:val="17"/>
+              </w:rPr>
+              <w:t>FINAL</w:t>
+            </w:r>
+          </w:p>
+        </w:tc>
+      </w:tr>
+      <w:tr>
+        <w:tc>
+          <w:tcPr>
+            <w:tcW w:type="dxa" w:w="2664"/>
+          </w:tcPr>
+          <w:p>
+            <w:pPr>
+              <w:spacing w:after="20"/>
+            </w:pPr>
+            <w:r>
+              <w:rPr>
+                <w:b w:val="0"/>
+                <w:i w:val="0"/>
+                <w:sz w:val="18"/>
+              </w:rPr>
+              <w:t>Spesifikasi minimum router</w:t>
+            </w:r>
+          </w:p>
+        </w:tc>
+        <w:tc>
+          <w:tcPr>
+            <w:tcW w:type="dxa" w:w="5832"/>
+          </w:tcPr>
+          <w:p>
+            <w:pPr>
+              <w:spacing w:after="20"/>
+            </w:pPr>
+            <w:r>
+              <w:rPr>
+                <w:b w:val="0"/>
+                <w:i w:val="0"/>
+                <w:sz w:val="18"/>
+              </w:rPr>
+              <w:t>Wi-Fi 2,4 GHz 802.11n, ≥ 1 port LAN gigabit, catu 220 VAC; disediakan &amp; dikonfigurasi LGU</w:t>
+            </w:r>
+          </w:p>
+        </w:tc>
+        <w:tc>
+          <w:tcPr>
+            <w:tcW w:type="dxa" w:w="1440"/>
+            <w:shd w:val="clear" w:color="auto" w:fill="EAF4EC"/>
+          </w:tcPr>
+          <w:p>
+            <w:pPr>
+              <w:spacing w:after="20"/>
+            </w:pPr>
+            <w:r>
+              <w:rPr>
+                <w:b/>
+                <w:color w:val="2C6B33"/>
+                <w:sz w:val="17"/>
+              </w:rPr>
+              <w:t>FINAL</w:t>
+            </w:r>
+          </w:p>
+        </w:tc>
+      </w:tr>
+      <w:tr>
+        <w:tc>
+          <w:tcPr>
+            <w:tcW w:type="dxa" w:w="2664"/>
+            <w:shd w:val="clear" w:color="auto" w:fill="FAFAF8"/>
+          </w:tcPr>
+          <w:p>
+            <w:pPr>
+              <w:spacing w:after="20"/>
+            </w:pPr>
+            <w:r>
+              <w:rPr>
+                <w:b w:val="0"/>
+                <w:i w:val="0"/>
+                <w:sz w:val="18"/>
+              </w:rPr>
+              <w:t>Panjang Cat6 router ↔ PC</w:t>
+            </w:r>
+          </w:p>
+        </w:tc>
+        <w:tc>
+          <w:tcPr>
+            <w:tcW w:type="dxa" w:w="5832"/>
+            <w:shd w:val="clear" w:color="auto" w:fill="FAFAF8"/>
+          </w:tcPr>
+          <w:p>
+            <w:pPr>
+              <w:spacing w:after="20"/>
+            </w:pPr>
+            <w:r>
+              <w:rPr>
+                <w:b w:val="0"/>
+                <w:i w:val="0"/>
+                <w:sz w:val="18"/>
+              </w:rPr>
+              <w:t>Mengikuti jarak rute antar-ruang (≤ 90 m per segmen); diukur saat survey ruangan</w:t>
+            </w:r>
+          </w:p>
+        </w:tc>
+        <w:tc>
+          <w:tcPr>
+            <w:tcW w:type="dxa" w:w="1440"/>
+            <w:shd w:val="clear" w:color="auto" w:fill="FBE6E4"/>
+          </w:tcPr>
+          <w:p>
+            <w:pPr>
+              <w:spacing w:after="20"/>
+            </w:pPr>
+            <w:r>
+              <w:rPr>
+                <w:b/>
+                <w:color w:val="B23A3A"/>
+                <w:sz w:val="17"/>
+              </w:rPr>
+              <w:t>KONFIRMASI</w:t>
+            </w:r>
+          </w:p>
+        </w:tc>
+      </w:tr>
+    </w:tbl>
+    <w:p>
+      <w:pPr>
+        <w:spacing w:after="40"/>
+      </w:pPr>
+    </w:p>
+    <w:p>
+      <w:pPr>
+        <w:pStyle w:val="Heading2"/>
+      </w:pPr>
+      <w:r>
+        <w:rPr>
+          <w:color w:val="1B2A4A"/>
+        </w:rPr>
+        <w:t>5.3 Kabel koaksial antena Gateway</w:t>
       </w:r>
     </w:p>
     <w:tbl>
@@ -9422,7 +9858,7 @@
                 <w:i w:val="0"/>
                 <w:sz w:val="18"/>
               </w:rPr>
-              <w:t>Antena GW → Gateway, ≤ 15 m (§5.2)</w:t>
+              <w:t>Antena GW → Gateway, ≤ 15 m (§5.3)</w:t>
             </w:r>
           </w:p>
         </w:tc>
@@ -9516,7 +9952,7 @@
                 <w:i w:val="0"/>
                 <w:sz w:val="18"/>
               </w:rPr>
-              <w:t>50 Ω, 900 MHz, konektor N (§5.2)</w:t>
+              <w:t>50 Ω, 900 MHz, konektor N (§5.3)</w:t>
             </w:r>
           </w:p>
         </w:tc>
@@ -9894,7 +10330,7 @@
                 <w:i w:val="0"/>
                 <w:sz w:val="18"/>
               </w:rPr>
-              <w:t>Lihat §5.1</w:t>
+              <w:t>Lihat §5.2</w:t>
             </w:r>
           </w:p>
         </w:tc>
@@ -10665,7 +11101,7 @@
         <w:color w:val="5B5B5B"/>
         <w:sz w:val="16"/>
       </w:rPr>
-      <w:t>LGU/GLD/INSTALASI-SPEK/2026-001  ·  Rev. 1.3</w:t>
+      <w:t>LGU/GLD/INSTALASI-SPEK/2026-001  ·  Rev. 1.4</w:t>
     </w:r>
     <w:r>
       <w:rPr>

</xml_diff>

<commit_message>
Spesifikasi material rev 1.5: tiang CH sesuai konfigurasi foto (bracket surya & CH di atas tiang dari LGU)
Co-Authored-By: Claude Opus 5.5 <noreply@anthropic.com>
</commit_message>
<xml_diff>
--- a/Deliverables/Spesifikasi_Material_Instalasi_GLD_RU-IV_Cilacap.docx
+++ b/Deliverables/Spesifikasi_Material_Instalasi_GLD_RU-IV_Cilacap.docx
@@ -167,7 +167,7 @@
               <w:rPr>
                 <w:sz w:val="19"/>
               </w:rPr>
-              <w:t>1.4</w:t>
+              <w:t>1.5</w:t>
             </w:r>
           </w:p>
         </w:tc>
@@ -204,7 +204,7 @@
               <w:rPr>
                 <w:sz w:val="19"/>
               </w:rPr>
-              <w:t>1 Oktober 2026</w:t>
+              <w:t>2 Oktober 2026</w:t>
             </w:r>
           </w:p>
         </w:tc>
@@ -1344,7 +1344,7 @@
                 <w:i w:val="0"/>
                 <w:sz w:val="18"/>
               </w:rPr>
-              <w:t>U-bolt 2"/DN50 thread M10, pelat 250×250 mm (desain LGU), untuk GLD &amp; CH</w:t>
+              <w:t>U-bolt 2"/DN50 thread M10, pelat 250×250 mm (desain LGU), untuk GLD</w:t>
             </w:r>
           </w:p>
         </w:tc>
@@ -1363,7 +1363,7 @@
                 <w:i w:val="0"/>
                 <w:sz w:val="18"/>
               </w:rPr>
-              <w:t>2 U-bolt per titik</w:t>
+              <w:t>2 U-bolt per titik GLD</w:t>
             </w:r>
           </w:p>
         </w:tc>
@@ -1402,6 +1402,82 @@
                 <w:i w:val="0"/>
                 <w:sz w:val="18"/>
               </w:rPr>
+              <w:t>Bracket panel surya CH</w:t>
+            </w:r>
+          </w:p>
+        </w:tc>
+        <w:tc>
+          <w:tcPr>
+            <w:tcW w:type="dxa" w:w="4824"/>
+          </w:tcPr>
+          <w:p>
+            <w:pPr>
+              <w:spacing w:after="20"/>
+            </w:pPr>
+            <w:r>
+              <w:rPr>
+                <w:b w:val="0"/>
+                <w:i w:val="0"/>
+                <w:sz w:val="18"/>
+              </w:rPr>
+              <w:t>Bracket baja 2 panel (milik LGU), diklem ke tiang 2", tanpa las/bor — dibawa LGU</w:t>
+            </w:r>
+          </w:p>
+        </w:tc>
+        <w:tc>
+          <w:tcPr>
+            <w:tcW w:type="dxa" w:w="1800"/>
+          </w:tcPr>
+          <w:p>
+            <w:pPr>
+              <w:spacing w:after="20"/>
+            </w:pPr>
+            <w:r>
+              <w:rPr>
+                <w:b w:val="0"/>
+                <w:i w:val="0"/>
+                <w:sz w:val="18"/>
+              </w:rPr>
+              <w:t>1 set per CH</w:t>
+            </w:r>
+          </w:p>
+        </w:tc>
+        <w:tc>
+          <w:tcPr>
+            <w:tcW w:type="dxa" w:w="1368"/>
+            <w:shd w:val="clear" w:color="auto" w:fill="EAF4EC"/>
+          </w:tcPr>
+          <w:p>
+            <w:pPr>
+              <w:spacing w:after="20"/>
+            </w:pPr>
+            <w:r>
+              <w:rPr>
+                <w:b/>
+                <w:color w:val="2C6B33"/>
+                <w:sz w:val="17"/>
+              </w:rPr>
+              <w:t>FINAL</w:t>
+            </w:r>
+          </w:p>
+        </w:tc>
+      </w:tr>
+      <w:tr>
+        <w:tc>
+          <w:tcPr>
+            <w:tcW w:type="dxa" w:w="1944"/>
+            <w:shd w:val="clear" w:color="auto" w:fill="FAFAF8"/>
+          </w:tcPr>
+          <w:p>
+            <w:pPr>
+              <w:spacing w:after="20"/>
+            </w:pPr>
+            <w:r>
+              <w:rPr>
+                <w:b w:val="0"/>
+                <w:i w:val="0"/>
+                <w:sz w:val="18"/>
+              </w:rPr>
               <w:t>Grounding tiang</w:t>
             </w:r>
           </w:p>
@@ -1409,6 +1485,7 @@
         <w:tc>
           <w:tcPr>
             <w:tcW w:type="dxa" w:w="4824"/>
+            <w:shd w:val="clear" w:color="auto" w:fill="FAFAF8"/>
           </w:tcPr>
           <w:p>
             <w:pPr>
@@ -1427,6 +1504,7 @@
         <w:tc>
           <w:tcPr>
             <w:tcW w:type="dxa" w:w="1800"/>
+            <w:shd w:val="clear" w:color="auto" w:fill="FAFAF8"/>
           </w:tcPr>
           <w:p>
             <w:pPr>
@@ -3418,7 +3496,7 @@
                 <w:i w:val="0"/>
                 <w:sz w:val="18"/>
               </w:rPr>
-              <w:t>Dudukan panel surya</w:t>
+              <w:t>Bracket panel surya</w:t>
             </w:r>
           </w:p>
         </w:tc>
@@ -3436,66 +3514,23 @@
                 <w:i w:val="0"/>
                 <w:sz w:val="18"/>
               </w:rPr>
-              <w:t>2 panel per CH, menghadap utara, kemiringan ± 10–15°. Dimensi panel diserahkan tim LGU</w:t>
-            </w:r>
-          </w:p>
-        </w:tc>
-        <w:tc>
-          <w:tcPr>
-            <w:tcW w:type="dxa" w:w="1440"/>
-            <w:shd w:val="clear" w:color="auto" w:fill="FBE6E4"/>
-          </w:tcPr>
-          <w:p>
-            <w:pPr>
-              <w:spacing w:after="20"/>
-            </w:pPr>
+              <w:t xml:space="preserve">Bracket baja 2 panel </w:t>
+            </w:r>
             <w:r>
               <w:rPr>
                 <w:b/>
-                <w:color w:val="B23A3A"/>
-                <w:sz w:val="17"/>
-              </w:rPr>
-              <w:t>KONFIRMASI</w:t>
-            </w:r>
-          </w:p>
-        </w:tc>
-      </w:tr>
-      <w:tr>
-        <w:tc>
-          <w:tcPr>
-            <w:tcW w:type="dxa" w:w="2304"/>
-            <w:shd w:val="clear" w:color="auto" w:fill="FAFAF8"/>
-          </w:tcPr>
-          <w:p>
-            <w:pPr>
-              <w:spacing w:after="20"/>
-            </w:pPr>
-            <w:r>
-              <w:rPr>
-                <w:b w:val="0"/>
-                <w:i w:val="0"/>
-                <w:sz w:val="18"/>
-              </w:rPr>
-              <w:t>Mounting CH</w:t>
-            </w:r>
-          </w:p>
-        </w:tc>
-        <w:tc>
-          <w:tcPr>
-            <w:tcW w:type="dxa" w:w="6192"/>
-            <w:shd w:val="clear" w:color="auto" w:fill="FAFAF8"/>
-          </w:tcPr>
-          <w:p>
-            <w:pPr>
-              <w:spacing w:after="20"/>
-            </w:pPr>
-            <w:r>
-              <w:rPr>
-                <w:b w:val="0"/>
-                <w:i w:val="0"/>
-                <w:sz w:val="18"/>
-              </w:rPr>
-              <w:t>Pelat U-bolt yang sama dengan GLD (2"/DN50, M10)</w:t>
+                <w:i w:val="0"/>
+                <w:sz w:val="18"/>
+              </w:rPr>
+              <w:t>disediakan dan dibawa LGU</w:t>
+            </w:r>
+            <w:r>
+              <w:rPr>
+                <w:b w:val="0"/>
+                <w:i w:val="0"/>
+                <w:sz w:val="18"/>
+              </w:rPr>
+              <w:t>, diklem ke tiang 2" (OD 60,3 mm) tanpa las/bor; dua panel dipasang berlawanan arah seperti Gambar 3.1</w:t>
             </w:r>
           </w:p>
         </w:tc>
@@ -3523,6 +3558,123 @@
         <w:tc>
           <w:tcPr>
             <w:tcW w:type="dxa" w:w="2304"/>
+            <w:shd w:val="clear" w:color="auto" w:fill="FAFAF8"/>
+          </w:tcPr>
+          <w:p>
+            <w:pPr>
+              <w:spacing w:after="20"/>
+            </w:pPr>
+            <w:r>
+              <w:rPr>
+                <w:b w:val="0"/>
+                <w:i w:val="0"/>
+                <w:sz w:val="18"/>
+              </w:rPr>
+              <w:t>Mounting CH &amp; antena</w:t>
+            </w:r>
+          </w:p>
+        </w:tc>
+        <w:tc>
+          <w:tcPr>
+            <w:tcW w:type="dxa" w:w="6192"/>
+            <w:shd w:val="clear" w:color="auto" w:fill="FAFAF8"/>
+          </w:tcPr>
+          <w:p>
+            <w:pPr>
+              <w:spacing w:after="20"/>
+            </w:pPr>
+            <w:r>
+              <w:rPr>
+                <w:b w:val="0"/>
+                <w:i w:val="0"/>
+                <w:sz w:val="18"/>
+              </w:rPr>
+              <w:t>Unit CH dan antena dipasang di bagian atas tiang (perangkat &amp; klem dari LGU); tiang CH tidak memakai pelat U-bolt 250×250 mm</w:t>
+            </w:r>
+          </w:p>
+        </w:tc>
+        <w:tc>
+          <w:tcPr>
+            <w:tcW w:type="dxa" w:w="1440"/>
+            <w:shd w:val="clear" w:color="auto" w:fill="EAF4EC"/>
+          </w:tcPr>
+          <w:p>
+            <w:pPr>
+              <w:spacing w:after="20"/>
+            </w:pPr>
+            <w:r>
+              <w:rPr>
+                <w:b/>
+                <w:color w:val="2C6B33"/>
+                <w:sz w:val="17"/>
+              </w:rPr>
+              <w:t>FINAL</w:t>
+            </w:r>
+          </w:p>
+        </w:tc>
+      </w:tr>
+      <w:tr>
+        <w:tc>
+          <w:tcPr>
+            <w:tcW w:type="dxa" w:w="2304"/>
+          </w:tcPr>
+          <w:p>
+            <w:pPr>
+              <w:spacing w:after="20"/>
+            </w:pPr>
+            <w:r>
+              <w:rPr>
+                <w:b w:val="0"/>
+                <w:i w:val="0"/>
+                <w:sz w:val="18"/>
+              </w:rPr>
+              <w:t>Ujung atas tiang</w:t>
+            </w:r>
+          </w:p>
+        </w:tc>
+        <w:tc>
+          <w:tcPr>
+            <w:tcW w:type="dxa" w:w="6192"/>
+          </w:tcPr>
+          <w:p>
+            <w:pPr>
+              <w:spacing w:after="20"/>
+            </w:pPr>
+            <w:r>
+              <w:rPr>
+                <w:b w:val="0"/>
+                <w:i w:val="0"/>
+                <w:sz w:val="18"/>
+              </w:rPr>
+              <w:t>Tertutup oleh dudukan CH/antena (bukan pipe cap); sambungan dibuat rapat agar air hujan tidak masuk</w:t>
+            </w:r>
+          </w:p>
+        </w:tc>
+        <w:tc>
+          <w:tcPr>
+            <w:tcW w:type="dxa" w:w="1440"/>
+            <w:shd w:val="clear" w:color="auto" w:fill="EAF4EC"/>
+          </w:tcPr>
+          <w:p>
+            <w:pPr>
+              <w:spacing w:after="20"/>
+            </w:pPr>
+            <w:r>
+              <w:rPr>
+                <w:b/>
+                <w:color w:val="2C6B33"/>
+                <w:sz w:val="17"/>
+              </w:rPr>
+              <w:t>FINAL</w:t>
+            </w:r>
+          </w:p>
+        </w:tc>
+      </w:tr>
+      <w:tr>
+        <w:tc>
+          <w:tcPr>
+            <w:tcW w:type="dxa" w:w="2304"/>
+            <w:shd w:val="clear" w:color="auto" w:fill="FAFAF8"/>
           </w:tcPr>
           <w:p>
             <w:pPr>
@@ -3541,6 +3693,7 @@
         <w:tc>
           <w:tcPr>
             <w:tcW w:type="dxa" w:w="6192"/>
+            <w:shd w:val="clear" w:color="auto" w:fill="FAFAF8"/>
           </w:tcPr>
           <w:p>
             <w:pPr>
@@ -3581,6 +3734,100 @@
       <w:pPr>
         <w:spacing w:after="40"/>
       </w:pPr>
+    </w:p>
+    <w:p>
+      <w:pPr>
+        <w:keepNext/>
+        <w:jc w:val="center"/>
+      </w:pPr>
+      <w:r>
+        <w:drawing>
+          <wp:inline xmlns:a="http://schemas.openxmlformats.org/drawingml/2006/main" xmlns:pic="http://schemas.openxmlformats.org/drawingml/2006/picture">
+            <wp:extent cx="1988820" cy="2651760"/>
+            <wp:docPr id="1" name="Picture 1"/>
+            <wp:cNvGraphicFramePr>
+              <a:graphicFrameLocks noChangeAspect="1"/>
+            </wp:cNvGraphicFramePr>
+            <a:graphic>
+              <a:graphicData uri="http://schemas.openxmlformats.org/drawingml/2006/picture">
+                <pic:pic>
+                  <pic:nvPicPr>
+                    <pic:cNvPr id="0" name="ch_bracket_solar_detail.jpg"/>
+                    <pic:cNvPicPr/>
+                  </pic:nvPicPr>
+                  <pic:blipFill>
+                    <a:blip r:embed="rId11"/>
+                    <a:stretch>
+                      <a:fillRect/>
+                    </a:stretch>
+                  </pic:blipFill>
+                  <pic:spPr>
+                    <a:xfrm>
+                      <a:off x="0" y="0"/>
+                      <a:ext cx="1988820" cy="2651760"/>
+                    </a:xfrm>
+                    <a:prstGeom prst="rect"/>
+                  </pic:spPr>
+                </pic:pic>
+              </a:graphicData>
+            </a:graphic>
+          </wp:inline>
+        </w:drawing>
+      </w:r>
+      <w:r>
+        <w:t xml:space="preserve">    </w:t>
+      </w:r>
+      <w:r>
+        <w:drawing>
+          <wp:inline xmlns:a="http://schemas.openxmlformats.org/drawingml/2006/main" xmlns:pic="http://schemas.openxmlformats.org/drawingml/2006/picture">
+            <wp:extent cx="1988820" cy="2651760"/>
+            <wp:docPr id="2" name="Picture 2"/>
+            <wp:cNvGraphicFramePr>
+              <a:graphicFrameLocks noChangeAspect="1"/>
+            </wp:cNvGraphicFramePr>
+            <a:graphic>
+              <a:graphicData uri="http://schemas.openxmlformats.org/drawingml/2006/picture">
+                <pic:pic>
+                  <pic:nvPicPr>
+                    <pic:cNvPr id="0" name="ch_mast_antena_atap.jpg"/>
+                    <pic:cNvPicPr/>
+                  </pic:nvPicPr>
+                  <pic:blipFill>
+                    <a:blip r:embed="rId12"/>
+                    <a:stretch>
+                      <a:fillRect/>
+                    </a:stretch>
+                  </pic:blipFill>
+                  <pic:spPr>
+                    <a:xfrm>
+                      <a:off x="0" y="0"/>
+                      <a:ext cx="1988820" cy="2651760"/>
+                    </a:xfrm>
+                    <a:prstGeom prst="rect"/>
+                  </pic:spPr>
+                </pic:pic>
+              </a:graphicData>
+            </a:graphic>
+          </wp:inline>
+        </w:drawing>
+      </w:r>
+      <w:r>
+        <w:t xml:space="preserve">    </w:t>
+      </w:r>
+    </w:p>
+    <w:p>
+      <w:pPr>
+        <w:spacing w:after="120"/>
+      </w:pPr>
+      <w:r>
+        <w:rPr>
+          <w:b w:val="0"/>
+          <w:i/>
+          <w:color w:val="5B5B5B"/>
+          <w:sz w:val="17"/>
+        </w:rPr>
+        <w:t>Gambar 3.1 Konfigurasi Cluster Head: bracket 2 panel surya diklem ke tiang (kiri), unit CH &amp; antena di bagian atas tiang (kanan). Foto uji LGU &amp; ITB; drum hanya dudukan sementara — di RU IV tiang ditanam &amp; dicor.</w:t>
+      </w:r>
     </w:p>
     <w:p>
       <w:pPr>
@@ -8621,7 +8868,7 @@
                 <w:i w:val="0"/>
                 <w:sz w:val="18"/>
               </w:rPr>
-              <w:t>Desain pelat U-bolt saat ini secara visual paling sesuai untuk pipa horizontal (handrail). Karena seluruh titik memakai tiang baru yang berdiri vertikal, kecocokan orientasi pelat pada tiang vertikal perlu dicek tim desain LGU bersama pelaksana RU IV sebelum pelat difabrikasi.</w:t>
+              <w:t>Desain pelat U-bolt saat ini secara visual paling sesuai untuk pipa horizontal (handrail). Karena seluruh titik GLD memakai tiang baru yang berdiri vertikal, kecocokan orientasi pelat pada tiang vertikal perlu dicek tim desain LGU bersama pelaksana RU IV sebelum pelat difabrikasi.</w:t>
             </w:r>
           </w:p>
         </w:tc>
@@ -9102,7 +9349,7 @@
                 <w:i w:val="0"/>
                 <w:sz w:val="18"/>
               </w:rPr>
-              <w:t>Penutup ujung atas tiang/mast</w:t>
+              <w:t>Penutup ujung atas tiang GLD &amp; mast GW (tiang CH tidak)</w:t>
             </w:r>
           </w:p>
         </w:tc>
@@ -9121,7 +9368,7 @@
                 <w:i w:val="0"/>
                 <w:sz w:val="18"/>
               </w:rPr>
-              <w:t>10 buah</w:t>
+              <w:t>4 buah</w:t>
             </w:r>
           </w:p>
         </w:tc>
@@ -9291,7 +9538,7 @@
                 <w:i w:val="0"/>
                 <w:sz w:val="18"/>
               </w:rPr>
-              <w:t>Lihat §6 (GLD &amp; CH)</w:t>
+              <w:t>Lihat §6 (GLD saja)</w:t>
             </w:r>
           </w:p>
         </w:tc>
@@ -9310,7 +9557,7 @@
                 <w:i w:val="0"/>
                 <w:sz w:val="18"/>
               </w:rPr>
-              <w:t>18 U-bolt, 36 set mur</w:t>
+              <w:t>6 U-bolt, 12 set mur</w:t>
             </w:r>
           </w:p>
         </w:tc>
@@ -9403,7 +9650,7 @@
                 <w:i w:val="0"/>
                 <w:sz w:val="18"/>
               </w:rPr>
-              <w:t>9 buah</w:t>
+              <w:t>3 buah</w:t>
             </w:r>
           </w:p>
         </w:tc>
@@ -9461,7 +9708,7 @@
                 <w:i w:val="0"/>
                 <w:sz w:val="18"/>
               </w:rPr>
-              <w:t>Dudukan panel surya CH</w:t>
+              <w:t>Bracket panel surya CH</w:t>
             </w:r>
           </w:p>
         </w:tc>
@@ -9480,7 +9727,7 @@
                 <w:i w:val="0"/>
                 <w:sz w:val="18"/>
               </w:rPr>
-              <w:t>2 panel per CH</w:t>
+              <w:t>Bracket baja 2 panel, klem ke tiang 2" (Gambar 3.1)</w:t>
             </w:r>
           </w:p>
         </w:tc>
@@ -9518,7 +9765,7 @@
                 <w:i w:val="0"/>
                 <w:sz w:val="18"/>
               </w:rPr>
-              <w:t>RU IV (dimensi dari LGU)</w:t>
+              <w:t>LGU</w:t>
             </w:r>
           </w:p>
         </w:tc>
@@ -11101,7 +11348,7 @@
         <w:color w:val="5B5B5B"/>
         <w:sz w:val="16"/>
       </w:rPr>
-      <w:t>LGU/GLD/INSTALASI-SPEK/2026-001  ·  Rev. 1.4</w:t>
+      <w:t>LGU/GLD/INSTALASI-SPEK/2026-001  ·  Rev. 1.5</w:t>
     </w:r>
     <w:r>
       <w:rPr>

</xml_diff>